<commit_message>
Also-by: Lolly Wren Books 1-2 to canonical list
</commit_message>
<xml_diff>
--- a/Lolly Wren's Curious Science Adventures - SERIES/Book 2 - The Permitted Options/The_Permitted_Options_BOOK_2_REVISION_20261005.docx
+++ b/Lolly Wren's Curious Science Adventures - SERIES/Book 2 - The Permitted Options/The_Permitted_Options_BOOK_2_REVISION_20261005.docx
@@ -24881,7 +24881,7 @@
           <w:b/>
           <w:color w:val="444444"/>
         </w:rPr>
-        <w:t>Physics, Actually</w:t>
+        <w:t xml:space="preserve">Physics, Actually</w:t>
       </w:r>
     </w:p>
     <w:p>
@@ -24893,7 +24893,7 @@
         <w:rPr>
           <w:color w:val="444444"/>
         </w:rPr>
-        <w:t>Physics, Actually, Volume 1: Motion, Forces, Time, and Relativity</w:t>
+        <w:t xml:space="preserve">Physics, Actually, Volume 1: Motion, Forces, Time, and Relativity</w:t>
       </w:r>
     </w:p>
     <w:p>
@@ -24905,7 +24905,7 @@
         <w:rPr>
           <w:color w:val="444444"/>
         </w:rPr>
-        <w:t>Physics, Actually, Volume 2: Gravity, Cosmology, and the Limits of Spacetime</w:t>
+        <w:t xml:space="preserve">Physics, Actually, Volume 2: Gravity, Cosmology, and the Limits of Spacetime</w:t>
       </w:r>
     </w:p>
     <w:p>
@@ -24917,7 +24917,7 @@
         <w:rPr>
           <w:color w:val="444444"/>
         </w:rPr>
-        <w:t>Physics, Actually, Volume 3: The Standard Model, Chaos, and the Edge of Knowledge</w:t>
+        <w:t xml:space="preserve">Physics, Actually, Volume 3: The Standard Model, Chaos, and the Edge of Knowledge</w:t>
       </w:r>
     </w:p>
     <w:p>
@@ -24929,7 +24929,7 @@
         <w:rPr>
           <w:color w:val="444444"/>
         </w:rPr>
-        <w:t>Life, Actually: From the First Cell to the Edited Genome and the Search for Life Elsewhere</w:t>
+        <w:t xml:space="preserve">Life, Actually: From the First Cell to the Edited Genome and the Search for Life Elsewhere</w:t>
       </w:r>
     </w:p>
     <w:p>
@@ -24943,7 +24943,7 @@
           <w:b/>
           <w:color w:val="444444"/>
         </w:rPr>
-        <w:t>Math, Actually</w:t>
+        <w:t xml:space="preserve">More Actually Books</w:t>
       </w:r>
     </w:p>
     <w:p>
@@ -24955,7 +24955,7 @@
         <w:rPr>
           <w:color w:val="444444"/>
         </w:rPr>
-        <w:t>Math, Actually, Volume 1: From Arithmetic to Calculus</w:t>
+        <w:t xml:space="preserve">Gravitation, Actually: A Short Book on Gravity</w:t>
       </w:r>
     </w:p>
     <w:p>
@@ -24967,31 +24967,7 @@
         <w:rPr>
           <w:color w:val="444444"/>
         </w:rPr>
-        <w:t>Math, Actually, Volume 2: From Multivariable Calculus to Set Theory &amp; Logic</w:t>
-      </w:r>
-    </w:p>
-    <w:p>
-      <w:pPr>
-        <w:spacing w:after="20" w:line="240" w:lineRule="auto"/>
-        <w:jc w:val="center"/>
-      </w:pPr>
-      <w:r>
-        <w:rPr>
-          <w:color w:val="444444"/>
-        </w:rPr>
-        <w:t>Math, Actually, Volume 3: From Differential Equations to Abstract Algebra</w:t>
-      </w:r>
-    </w:p>
-    <w:p>
-      <w:pPr>
-        <w:spacing w:after="20" w:line="240" w:lineRule="auto"/>
-        <w:jc w:val="center"/>
-      </w:pPr>
-      <w:r>
-        <w:rPr>
-          <w:color w:val="444444"/>
-        </w:rPr>
-        <w:t>Math, Actually, Volume 4: From Category Theory to the Frontier</w:t>
+        <w:t xml:space="preserve">The Universe, Actually: What Humanity Currently Understands About Reality</w:t>
       </w:r>
     </w:p>
     <w:p>
@@ -25005,7 +24981,7 @@
           <w:b/>
           <w:color w:val="444444"/>
         </w:rPr>
-        <w:t>Quantum, Actually</w:t>
+        <w:t xml:space="preserve">Math, Actually</w:t>
       </w:r>
     </w:p>
     <w:p>
@@ -25017,7 +24993,7 @@
         <w:rPr>
           <w:color w:val="444444"/>
         </w:rPr>
-        <w:t>Quantum, Actually, Volume 1: Questions and Answers from the Double Slit to the Superconducting Wire</w:t>
+        <w:t xml:space="preserve">Math, Actually, Volume 1: From Arithmetic to Calculus</w:t>
       </w:r>
     </w:p>
     <w:p>
@@ -25029,7 +25005,31 @@
         <w:rPr>
           <w:color w:val="444444"/>
         </w:rPr>
-        <w:t>Quantum, Actually, Volume 2: A QED Course</w:t>
+        <w:t xml:space="preserve">Math, Actually, Volume 2: From Multivariable Calculus to Set Theory &amp; Logic</w:t>
+      </w:r>
+    </w:p>
+    <w:p>
+      <w:pPr>
+        <w:spacing w:after="20" w:line="240" w:lineRule="auto"/>
+        <w:jc w:val="center"/>
+      </w:pPr>
+      <w:r>
+        <w:rPr>
+          <w:color w:val="444444"/>
+        </w:rPr>
+        <w:t xml:space="preserve">Math, Actually, Volume 3: From Differential Equations to Abstract Algebra</w:t>
+      </w:r>
+    </w:p>
+    <w:p>
+      <w:pPr>
+        <w:spacing w:after="20" w:line="240" w:lineRule="auto"/>
+        <w:jc w:val="center"/>
+      </w:pPr>
+      <w:r>
+        <w:rPr>
+          <w:color w:val="444444"/>
+        </w:rPr>
+        <w:t xml:space="preserve">Math, Actually, Volume 4: From Category Theory to the Frontier</w:t>
       </w:r>
     </w:p>
     <w:p>
@@ -25043,7 +25043,7 @@
           <w:b/>
           <w:color w:val="444444"/>
         </w:rPr>
-        <w:t>Science Sparks</w:t>
+        <w:t xml:space="preserve">Quantum, Actually</w:t>
       </w:r>
     </w:p>
     <w:p>
@@ -25055,7 +25055,19 @@
         <w:rPr>
           <w:color w:val="444444"/>
         </w:rPr>
-        <w:t>Science Sparks: Physics, Life, and Mathematics — The Same Few Rules, Told in Highlights</w:t>
+        <w:t xml:space="preserve">Quantum, Actually, Volume 1: Questions and Answers from the Double Slit to the Superconducting Wire</w:t>
+      </w:r>
+    </w:p>
+    <w:p>
+      <w:pPr>
+        <w:spacing w:after="20" w:line="240" w:lineRule="auto"/>
+        <w:jc w:val="center"/>
+      </w:pPr>
+      <w:r>
+        <w:rPr>
+          <w:color w:val="444444"/>
+        </w:rPr>
+        <w:t xml:space="preserve">Quantum, Actually, Volume 2: A QED Course</w:t>
       </w:r>
     </w:p>
     <w:p>
@@ -25069,7 +25081,7 @@
           <w:b/>
           <w:color w:val="444444"/>
         </w:rPr>
-        <w:t>Look First</w:t>
+        <w:t xml:space="preserve">Science Sparks</w:t>
       </w:r>
     </w:p>
     <w:p>
@@ -25081,19 +25093,7 @@
         <w:rPr>
           <w:color w:val="444444"/>
         </w:rPr>
-        <w:t>Look First, Volume 1: The Universe Has No Now</w:t>
-      </w:r>
-    </w:p>
-    <w:p>
-      <w:pPr>
-        <w:spacing w:after="20" w:line="240" w:lineRule="auto"/>
-        <w:jc w:val="center"/>
-      </w:pPr>
-      <w:r>
-        <w:rPr>
-          <w:color w:val="444444"/>
-        </w:rPr>
-        <w:t>Look First, Volume 2: A Trip Is Not a New Life</w:t>
+        <w:t xml:space="preserve">Science Sparks: Physics, Life, and Mathematics — The Same Few Rules, Told in Highlights</w:t>
       </w:r>
     </w:p>
     <w:p>
@@ -25107,7 +25107,7 @@
           <w:b/>
           <w:color w:val="444444"/>
         </w:rPr>
-        <w:t>Electrical Engineering Series</w:t>
+        <w:t xml:space="preserve">Look First</w:t>
       </w:r>
     </w:p>
     <w:p>
@@ -25119,7 +25119,7 @@
         <w:rPr>
           <w:color w:val="444444"/>
         </w:rPr>
-        <w:t>Foundations of Electronics (Book 1)</w:t>
+        <w:t xml:space="preserve">Look First, Volume 1: The Universe Has No Now</w:t>
       </w:r>
     </w:p>
     <w:p>
@@ -25131,68 +25131,7 @@
         <w:rPr>
           <w:color w:val="444444"/>
         </w:rPr>
-        <w:lastRenderedPageBreak/>
-        <w:t>Circuits, Components, and Control (Book 2)</w:t>
-      </w:r>
-    </w:p>
-    <w:p>
-      <w:pPr>
-        <w:spacing w:after="20" w:line="240" w:lineRule="auto"/>
-        <w:jc w:val="center"/>
-      </w:pPr>
-      <w:r>
-        <w:rPr>
-          <w:color w:val="444444"/>
-        </w:rPr>
-        <w:t>Semiconductor Physics and Devices (Book 3)</w:t>
-      </w:r>
-    </w:p>
-    <w:p>
-      <w:pPr>
-        <w:spacing w:after="20" w:line="240" w:lineRule="auto"/>
-        <w:jc w:val="center"/>
-      </w:pPr>
-      <w:r>
-        <w:rPr>
-          <w:color w:val="444444"/>
-        </w:rPr>
-        <w:t>RF, Microwave, and Transceivers (Book 4)</w:t>
-      </w:r>
-    </w:p>
-    <w:p>
-      <w:pPr>
-        <w:spacing w:after="20" w:line="240" w:lineRule="auto"/>
-        <w:jc w:val="center"/>
-      </w:pPr>
-      <w:r>
-        <w:rPr>
-          <w:color w:val="444444"/>
-        </w:rPr>
-        <w:t>Communications, Wireless, and SDR (Book 5)</w:t>
-      </w:r>
-    </w:p>
-    <w:p>
-      <w:pPr>
-        <w:spacing w:after="20" w:line="240" w:lineRule="auto"/>
-        <w:jc w:val="center"/>
-      </w:pPr>
-      <w:r>
-        <w:rPr>
-          <w:color w:val="444444"/>
-        </w:rPr>
-        <w:t>Power and Energy (Book 6)</w:t>
-      </w:r>
-    </w:p>
-    <w:p>
-      <w:pPr>
-        <w:spacing w:after="20" w:line="240" w:lineRule="auto"/>
-        <w:jc w:val="center"/>
-      </w:pPr>
-      <w:r>
-        <w:rPr>
-          <w:color w:val="444444"/>
-        </w:rPr>
-        <w:t>Packaging, Layout, EMC, and Test (Book 7)</w:t>
+        <w:t xml:space="preserve">Look First, Volume 2: A Trip Is Not a New Life</w:t>
       </w:r>
     </w:p>
     <w:p>
@@ -25206,7 +25145,7 @@
           <w:b/>
           <w:color w:val="444444"/>
         </w:rPr>
-        <w:t>History</w:t>
+        <w:t xml:space="preserve">Electrical Engineering Series</w:t>
       </w:r>
     </w:p>
     <w:p>
@@ -25218,7 +25157,79 @@
         <w:rPr>
           <w:color w:val="444444"/>
         </w:rPr>
-        <w:t>The Dolphins’ View of History</w:t>
+        <w:t xml:space="preserve">Foundations of Electronics (Book 1)</w:t>
+      </w:r>
+    </w:p>
+    <w:p>
+      <w:pPr>
+        <w:spacing w:after="20" w:line="240" w:lineRule="auto"/>
+        <w:jc w:val="center"/>
+      </w:pPr>
+      <w:r>
+        <w:rPr>
+          <w:color w:val="444444"/>
+        </w:rPr>
+        <w:t xml:space="preserve">Circuits, Components, and Control (Book 2)</w:t>
+      </w:r>
+    </w:p>
+    <w:p>
+      <w:pPr>
+        <w:spacing w:after="20" w:line="240" w:lineRule="auto"/>
+        <w:jc w:val="center"/>
+      </w:pPr>
+      <w:r>
+        <w:rPr>
+          <w:color w:val="444444"/>
+        </w:rPr>
+        <w:t xml:space="preserve">Semiconductor Physics and Devices (Book 3)</w:t>
+      </w:r>
+    </w:p>
+    <w:p>
+      <w:pPr>
+        <w:spacing w:after="20" w:line="240" w:lineRule="auto"/>
+        <w:jc w:val="center"/>
+      </w:pPr>
+      <w:r>
+        <w:rPr>
+          <w:color w:val="444444"/>
+        </w:rPr>
+        <w:t xml:space="preserve">RF, Microwave, and Transceivers (Book 4)</w:t>
+      </w:r>
+    </w:p>
+    <w:p>
+      <w:pPr>
+        <w:spacing w:after="20" w:line="240" w:lineRule="auto"/>
+        <w:jc w:val="center"/>
+      </w:pPr>
+      <w:r>
+        <w:rPr>
+          <w:color w:val="444444"/>
+        </w:rPr>
+        <w:t xml:space="preserve">Communications, Wireless, and SDR (Book 5)</w:t>
+      </w:r>
+    </w:p>
+    <w:p>
+      <w:pPr>
+        <w:spacing w:after="20" w:line="240" w:lineRule="auto"/>
+        <w:jc w:val="center"/>
+      </w:pPr>
+      <w:r>
+        <w:rPr>
+          <w:color w:val="444444"/>
+        </w:rPr>
+        <w:t xml:space="preserve">Power and Energy (Book 6)</w:t>
+      </w:r>
+    </w:p>
+    <w:p>
+      <w:pPr>
+        <w:spacing w:after="20" w:line="240" w:lineRule="auto"/>
+        <w:jc w:val="center"/>
+      </w:pPr>
+      <w:r>
+        <w:rPr>
+          <w:color w:val="444444"/>
+        </w:rPr>
+        <w:t xml:space="preserve">Packaging, Layout, EMC, and Test (Book 7)</w:t>
       </w:r>
     </w:p>
     <w:p>
@@ -25232,7 +25243,7 @@
           <w:b/>
           <w:color w:val="444444"/>
         </w:rPr>
-        <w:t>Fiction</w:t>
+        <w:t xml:space="preserve">History</w:t>
       </w:r>
     </w:p>
     <w:p>
@@ -25244,55 +25255,7 @@
         <w:rPr>
           <w:color w:val="444444"/>
         </w:rPr>
-        <w:t>The Murder That Hadn’t Happened Yet (The Relativistic Investigation Bureau, Book 1)</w:t>
-      </w:r>
-    </w:p>
-    <w:p>
-      <w:pPr>
-        <w:spacing w:after="20" w:line="240" w:lineRule="auto"/>
-        <w:jc w:val="center"/>
-      </w:pPr>
-      <w:r>
-        <w:rPr>
-          <w:color w:val="444444"/>
-        </w:rPr>
-        <w:t>The Warning That Was Sent Too Late (The Relativistic Investigation Bureau, Book 2)</w:t>
-      </w:r>
-    </w:p>
-    <w:p>
-      <w:pPr>
-        <w:spacing w:after="20" w:line="240" w:lineRule="auto"/>
-        <w:jc w:val="center"/>
-      </w:pPr>
-      <w:r>
-        <w:rPr>
-          <w:color w:val="444444"/>
-        </w:rPr>
-        <w:t>Schrödinger’s Paperwork (Lolly Wren’s Curious Science Adventures, Book 1)</w:t>
-      </w:r>
-    </w:p>
-    <w:p>
-      <w:pPr>
-        <w:spacing w:after="20" w:line="240" w:lineRule="auto"/>
-        <w:jc w:val="center"/>
-      </w:pPr>
-      <w:r>
-        <w:rPr>
-          <w:color w:val="444444"/>
-        </w:rPr>
-        <w:t>The Permitted Options (Lolly Wren’s Curious Science Adventures, Book 2)</w:t>
-      </w:r>
-    </w:p>
-    <w:p>
-      <w:pPr>
-        <w:spacing w:after="20" w:line="240" w:lineRule="auto"/>
-        <w:jc w:val="center"/>
-      </w:pPr>
-      <w:r>
-        <w:rPr>
-          <w:color w:val="444444"/>
-        </w:rPr>
-        <w:t>Protocol Flamingo (The Invasion Storybooks, Book 1), as George Herbert Fontaine</w:t>
+        <w:t xml:space="preserve">The Dolphins’ View of History</w:t>
       </w:r>
     </w:p>
     <w:p>
@@ -25306,7 +25269,7 @@
           <w:b/>
           <w:color w:val="444444"/>
         </w:rPr>
-        <w:t>How-To</w:t>
+        <w:t xml:space="preserve">Fiction</w:t>
       </w:r>
     </w:p>
     <w:p>
@@ -25318,7 +25281,7 @@
         <w:rPr>
           <w:color w:val="444444"/>
         </w:rPr>
-        <w:t>Your First Book That Sells</w:t>
+        <w:t xml:space="preserve">The Murder That Hadn’t Happened Yet (The Relativistic Investigation Bureau, Book 1), Lothar J. Musiol writing as Spezala Genara Relavi (S.G.R.)</w:t>
       </w:r>
     </w:p>
     <w:p>
@@ -25330,7 +25293,69 @@
         <w:rPr>
           <w:color w:val="444444"/>
         </w:rPr>
-        <w:t>Your First YouTube Channel That Rocks</w:t>
+        <w:t xml:space="preserve">The Warning That Was Sent Too Late (The Relativistic Investigation Bureau, Book 2), Lothar J. Musiol writing as Spezala Genara Relavi (S.G.R.)</w:t>
+      </w:r>
+    </w:p>
+    <w:p>
+      <w:pPr>
+        <w:spacing w:after="20" w:line="240" w:lineRule="auto"/>
+        <w:jc w:val="center"/>
+      </w:pPr>
+      <w:r>
+        <w:rPr>
+          <w:color w:val="444444"/>
+        </w:rPr>
+        <w:t xml:space="preserve">Schrödinger’s Paperwork (Lolly Wren’s Curious Science Adventures, Book 1), Lothar J. Musiol writing as Quentin Edmund Darling (Q.E.D.)</w:t>
+      </w:r>
+    </w:p>
+    <w:p>
+      <w:pPr>
+        <w:spacing w:after="20" w:line="240" w:lineRule="auto"/>
+        <w:jc w:val="center"/>
+      </w:pPr>
+      <w:r>
+        <w:rPr>
+          <w:color w:val="444444"/>
+        </w:rPr>
+        <w:t xml:space="preserve">Protocol Flamingo (The Invasion Storybooks, Book 1), Lothar J. Musiol writing as George Herbert Fontaine</w:t>
+      </w:r>
+    </w:p>
+    <w:p>
+      <w:pPr>
+        <w:spacing w:after="20" w:line="240" w:lineRule="auto"/>
+        <w:jc w:val="center"/>
+      </w:pPr>
+      <w:r>
+        <w:rPr>
+          <w:color w:val="444444"/>
+        </w:rPr>
+        <w:t xml:space="preserve">In Love with Murder, Actually: A Comic Mystery, Lothar J. Musiol writing as Romuald Livingston</w:t>
+      </w:r>
+    </w:p>
+    <w:p>
+      <w:pPr>
+        <w:keepNext/>
+        <w:spacing w:before="160" w:after="40" w:line="240" w:lineRule="auto"/>
+        <w:jc w:val="center"/>
+      </w:pPr>
+      <w:r>
+        <w:rPr>
+          <w:b/>
+          <w:color w:val="444444"/>
+        </w:rPr>
+        <w:t xml:space="preserve">In German</w:t>
+      </w:r>
+    </w:p>
+    <w:p>
+      <w:pPr>
+        <w:spacing w:after="20" w:line="240" w:lineRule="auto"/>
+        <w:jc w:val="center"/>
+      </w:pPr>
+      <w:r>
+        <w:rPr>
+          <w:color w:val="444444"/>
+        </w:rPr>
+        <w:t xml:space="preserve">Auswandern – Ab in die USA, Kanada, Australien oder Neuseeland?</w:t>
       </w:r>
     </w:p>
     <w:sectPr>

</xml_diff>

<commit_message>
Also-by: Lolly Wren Books 1-2 to canonical list [merged onto main from book-2-lectures-after-qed 246f39f, paths only]
</commit_message>
<xml_diff>
--- a/Lolly Wren's Curious Science Adventures - SERIES/Book 2 - The Permitted Options/The_Permitted_Options_BOOK_2_REVISION_20261005.docx
+++ b/Lolly Wren's Curious Science Adventures - SERIES/Book 2 - The Permitted Options/The_Permitted_Options_BOOK_2_REVISION_20261005.docx
@@ -24881,7 +24881,7 @@
           <w:b/>
           <w:color w:val="444444"/>
         </w:rPr>
-        <w:t>Physics, Actually</w:t>
+        <w:t xml:space="preserve">Physics, Actually</w:t>
       </w:r>
     </w:p>
     <w:p>
@@ -24893,7 +24893,7 @@
         <w:rPr>
           <w:color w:val="444444"/>
         </w:rPr>
-        <w:t>Physics, Actually, Volume 1: Motion, Forces, Time, and Relativity</w:t>
+        <w:t xml:space="preserve">Physics, Actually, Volume 1: Motion, Forces, Time, and Relativity</w:t>
       </w:r>
     </w:p>
     <w:p>
@@ -24905,7 +24905,7 @@
         <w:rPr>
           <w:color w:val="444444"/>
         </w:rPr>
-        <w:t>Physics, Actually, Volume 2: Gravity, Cosmology, and the Limits of Spacetime</w:t>
+        <w:t xml:space="preserve">Physics, Actually, Volume 2: Gravity, Cosmology, and the Limits of Spacetime</w:t>
       </w:r>
     </w:p>
     <w:p>
@@ -24917,7 +24917,7 @@
         <w:rPr>
           <w:color w:val="444444"/>
         </w:rPr>
-        <w:t>Physics, Actually, Volume 3: The Standard Model, Chaos, and the Edge of Knowledge</w:t>
+        <w:t xml:space="preserve">Physics, Actually, Volume 3: The Standard Model, Chaos, and the Edge of Knowledge</w:t>
       </w:r>
     </w:p>
     <w:p>
@@ -24929,7 +24929,7 @@
         <w:rPr>
           <w:color w:val="444444"/>
         </w:rPr>
-        <w:t>Life, Actually: From the First Cell to the Edited Genome and the Search for Life Elsewhere</w:t>
+        <w:t xml:space="preserve">Life, Actually: From the First Cell to the Edited Genome and the Search for Life Elsewhere</w:t>
       </w:r>
     </w:p>
     <w:p>
@@ -24943,7 +24943,7 @@
           <w:b/>
           <w:color w:val="444444"/>
         </w:rPr>
-        <w:t>Math, Actually</w:t>
+        <w:t xml:space="preserve">More Actually Books</w:t>
       </w:r>
     </w:p>
     <w:p>
@@ -24955,7 +24955,7 @@
         <w:rPr>
           <w:color w:val="444444"/>
         </w:rPr>
-        <w:t>Math, Actually, Volume 1: From Arithmetic to Calculus</w:t>
+        <w:t xml:space="preserve">Gravitation, Actually: A Short Book on Gravity</w:t>
       </w:r>
     </w:p>
     <w:p>
@@ -24967,31 +24967,7 @@
         <w:rPr>
           <w:color w:val="444444"/>
         </w:rPr>
-        <w:t>Math, Actually, Volume 2: From Multivariable Calculus to Set Theory &amp; Logic</w:t>
-      </w:r>
-    </w:p>
-    <w:p>
-      <w:pPr>
-        <w:spacing w:after="20" w:line="240" w:lineRule="auto"/>
-        <w:jc w:val="center"/>
-      </w:pPr>
-      <w:r>
-        <w:rPr>
-          <w:color w:val="444444"/>
-        </w:rPr>
-        <w:t>Math, Actually, Volume 3: From Differential Equations to Abstract Algebra</w:t>
-      </w:r>
-    </w:p>
-    <w:p>
-      <w:pPr>
-        <w:spacing w:after="20" w:line="240" w:lineRule="auto"/>
-        <w:jc w:val="center"/>
-      </w:pPr>
-      <w:r>
-        <w:rPr>
-          <w:color w:val="444444"/>
-        </w:rPr>
-        <w:t>Math, Actually, Volume 4: From Category Theory to the Frontier</w:t>
+        <w:t xml:space="preserve">The Universe, Actually: What Humanity Currently Understands About Reality</w:t>
       </w:r>
     </w:p>
     <w:p>
@@ -25005,7 +24981,7 @@
           <w:b/>
           <w:color w:val="444444"/>
         </w:rPr>
-        <w:t>Quantum, Actually</w:t>
+        <w:t xml:space="preserve">Math, Actually</w:t>
       </w:r>
     </w:p>
     <w:p>
@@ -25017,7 +24993,7 @@
         <w:rPr>
           <w:color w:val="444444"/>
         </w:rPr>
-        <w:t>Quantum, Actually, Volume 1: Questions and Answers from the Double Slit to the Superconducting Wire</w:t>
+        <w:t xml:space="preserve">Math, Actually, Volume 1: From Arithmetic to Calculus</w:t>
       </w:r>
     </w:p>
     <w:p>
@@ -25029,7 +25005,31 @@
         <w:rPr>
           <w:color w:val="444444"/>
         </w:rPr>
-        <w:t>Quantum, Actually, Volume 2: A QED Course</w:t>
+        <w:t xml:space="preserve">Math, Actually, Volume 2: From Multivariable Calculus to Set Theory &amp; Logic</w:t>
+      </w:r>
+    </w:p>
+    <w:p>
+      <w:pPr>
+        <w:spacing w:after="20" w:line="240" w:lineRule="auto"/>
+        <w:jc w:val="center"/>
+      </w:pPr>
+      <w:r>
+        <w:rPr>
+          <w:color w:val="444444"/>
+        </w:rPr>
+        <w:t xml:space="preserve">Math, Actually, Volume 3: From Differential Equations to Abstract Algebra</w:t>
+      </w:r>
+    </w:p>
+    <w:p>
+      <w:pPr>
+        <w:spacing w:after="20" w:line="240" w:lineRule="auto"/>
+        <w:jc w:val="center"/>
+      </w:pPr>
+      <w:r>
+        <w:rPr>
+          <w:color w:val="444444"/>
+        </w:rPr>
+        <w:t xml:space="preserve">Math, Actually, Volume 4: From Category Theory to the Frontier</w:t>
       </w:r>
     </w:p>
     <w:p>
@@ -25043,7 +25043,7 @@
           <w:b/>
           <w:color w:val="444444"/>
         </w:rPr>
-        <w:t>Science Sparks</w:t>
+        <w:t xml:space="preserve">Quantum, Actually</w:t>
       </w:r>
     </w:p>
     <w:p>
@@ -25055,7 +25055,19 @@
         <w:rPr>
           <w:color w:val="444444"/>
         </w:rPr>
-        <w:t>Science Sparks: Physics, Life, and Mathematics — The Same Few Rules, Told in Highlights</w:t>
+        <w:t xml:space="preserve">Quantum, Actually, Volume 1: Questions and Answers from the Double Slit to the Superconducting Wire</w:t>
+      </w:r>
+    </w:p>
+    <w:p>
+      <w:pPr>
+        <w:spacing w:after="20" w:line="240" w:lineRule="auto"/>
+        <w:jc w:val="center"/>
+      </w:pPr>
+      <w:r>
+        <w:rPr>
+          <w:color w:val="444444"/>
+        </w:rPr>
+        <w:t xml:space="preserve">Quantum, Actually, Volume 2: A QED Course</w:t>
       </w:r>
     </w:p>
     <w:p>
@@ -25069,7 +25081,7 @@
           <w:b/>
           <w:color w:val="444444"/>
         </w:rPr>
-        <w:t>Look First</w:t>
+        <w:t xml:space="preserve">Science Sparks</w:t>
       </w:r>
     </w:p>
     <w:p>
@@ -25081,19 +25093,7 @@
         <w:rPr>
           <w:color w:val="444444"/>
         </w:rPr>
-        <w:t>Look First, Volume 1: The Universe Has No Now</w:t>
-      </w:r>
-    </w:p>
-    <w:p>
-      <w:pPr>
-        <w:spacing w:after="20" w:line="240" w:lineRule="auto"/>
-        <w:jc w:val="center"/>
-      </w:pPr>
-      <w:r>
-        <w:rPr>
-          <w:color w:val="444444"/>
-        </w:rPr>
-        <w:t>Look First, Volume 2: A Trip Is Not a New Life</w:t>
+        <w:t xml:space="preserve">Science Sparks: Physics, Life, and Mathematics — The Same Few Rules, Told in Highlights</w:t>
       </w:r>
     </w:p>
     <w:p>
@@ -25107,7 +25107,7 @@
           <w:b/>
           <w:color w:val="444444"/>
         </w:rPr>
-        <w:t>Electrical Engineering Series</w:t>
+        <w:t xml:space="preserve">Look First</w:t>
       </w:r>
     </w:p>
     <w:p>
@@ -25119,7 +25119,7 @@
         <w:rPr>
           <w:color w:val="444444"/>
         </w:rPr>
-        <w:t>Foundations of Electronics (Book 1)</w:t>
+        <w:t xml:space="preserve">Look First, Volume 1: The Universe Has No Now</w:t>
       </w:r>
     </w:p>
     <w:p>
@@ -25131,68 +25131,7 @@
         <w:rPr>
           <w:color w:val="444444"/>
         </w:rPr>
-        <w:lastRenderedPageBreak/>
-        <w:t>Circuits, Components, and Control (Book 2)</w:t>
-      </w:r>
-    </w:p>
-    <w:p>
-      <w:pPr>
-        <w:spacing w:after="20" w:line="240" w:lineRule="auto"/>
-        <w:jc w:val="center"/>
-      </w:pPr>
-      <w:r>
-        <w:rPr>
-          <w:color w:val="444444"/>
-        </w:rPr>
-        <w:t>Semiconductor Physics and Devices (Book 3)</w:t>
-      </w:r>
-    </w:p>
-    <w:p>
-      <w:pPr>
-        <w:spacing w:after="20" w:line="240" w:lineRule="auto"/>
-        <w:jc w:val="center"/>
-      </w:pPr>
-      <w:r>
-        <w:rPr>
-          <w:color w:val="444444"/>
-        </w:rPr>
-        <w:t>RF, Microwave, and Transceivers (Book 4)</w:t>
-      </w:r>
-    </w:p>
-    <w:p>
-      <w:pPr>
-        <w:spacing w:after="20" w:line="240" w:lineRule="auto"/>
-        <w:jc w:val="center"/>
-      </w:pPr>
-      <w:r>
-        <w:rPr>
-          <w:color w:val="444444"/>
-        </w:rPr>
-        <w:t>Communications, Wireless, and SDR (Book 5)</w:t>
-      </w:r>
-    </w:p>
-    <w:p>
-      <w:pPr>
-        <w:spacing w:after="20" w:line="240" w:lineRule="auto"/>
-        <w:jc w:val="center"/>
-      </w:pPr>
-      <w:r>
-        <w:rPr>
-          <w:color w:val="444444"/>
-        </w:rPr>
-        <w:t>Power and Energy (Book 6)</w:t>
-      </w:r>
-    </w:p>
-    <w:p>
-      <w:pPr>
-        <w:spacing w:after="20" w:line="240" w:lineRule="auto"/>
-        <w:jc w:val="center"/>
-      </w:pPr>
-      <w:r>
-        <w:rPr>
-          <w:color w:val="444444"/>
-        </w:rPr>
-        <w:t>Packaging, Layout, EMC, and Test (Book 7)</w:t>
+        <w:t xml:space="preserve">Look First, Volume 2: A Trip Is Not a New Life</w:t>
       </w:r>
     </w:p>
     <w:p>
@@ -25206,7 +25145,7 @@
           <w:b/>
           <w:color w:val="444444"/>
         </w:rPr>
-        <w:t>History</w:t>
+        <w:t xml:space="preserve">Electrical Engineering Series</w:t>
       </w:r>
     </w:p>
     <w:p>
@@ -25218,7 +25157,79 @@
         <w:rPr>
           <w:color w:val="444444"/>
         </w:rPr>
-        <w:t>The Dolphins’ View of History</w:t>
+        <w:t xml:space="preserve">Foundations of Electronics (Book 1)</w:t>
+      </w:r>
+    </w:p>
+    <w:p>
+      <w:pPr>
+        <w:spacing w:after="20" w:line="240" w:lineRule="auto"/>
+        <w:jc w:val="center"/>
+      </w:pPr>
+      <w:r>
+        <w:rPr>
+          <w:color w:val="444444"/>
+        </w:rPr>
+        <w:t xml:space="preserve">Circuits, Components, and Control (Book 2)</w:t>
+      </w:r>
+    </w:p>
+    <w:p>
+      <w:pPr>
+        <w:spacing w:after="20" w:line="240" w:lineRule="auto"/>
+        <w:jc w:val="center"/>
+      </w:pPr>
+      <w:r>
+        <w:rPr>
+          <w:color w:val="444444"/>
+        </w:rPr>
+        <w:t xml:space="preserve">Semiconductor Physics and Devices (Book 3)</w:t>
+      </w:r>
+    </w:p>
+    <w:p>
+      <w:pPr>
+        <w:spacing w:after="20" w:line="240" w:lineRule="auto"/>
+        <w:jc w:val="center"/>
+      </w:pPr>
+      <w:r>
+        <w:rPr>
+          <w:color w:val="444444"/>
+        </w:rPr>
+        <w:t xml:space="preserve">RF, Microwave, and Transceivers (Book 4)</w:t>
+      </w:r>
+    </w:p>
+    <w:p>
+      <w:pPr>
+        <w:spacing w:after="20" w:line="240" w:lineRule="auto"/>
+        <w:jc w:val="center"/>
+      </w:pPr>
+      <w:r>
+        <w:rPr>
+          <w:color w:val="444444"/>
+        </w:rPr>
+        <w:t xml:space="preserve">Communications, Wireless, and SDR (Book 5)</w:t>
+      </w:r>
+    </w:p>
+    <w:p>
+      <w:pPr>
+        <w:spacing w:after="20" w:line="240" w:lineRule="auto"/>
+        <w:jc w:val="center"/>
+      </w:pPr>
+      <w:r>
+        <w:rPr>
+          <w:color w:val="444444"/>
+        </w:rPr>
+        <w:t xml:space="preserve">Power and Energy (Book 6)</w:t>
+      </w:r>
+    </w:p>
+    <w:p>
+      <w:pPr>
+        <w:spacing w:after="20" w:line="240" w:lineRule="auto"/>
+        <w:jc w:val="center"/>
+      </w:pPr>
+      <w:r>
+        <w:rPr>
+          <w:color w:val="444444"/>
+        </w:rPr>
+        <w:t xml:space="preserve">Packaging, Layout, EMC, and Test (Book 7)</w:t>
       </w:r>
     </w:p>
     <w:p>
@@ -25232,7 +25243,7 @@
           <w:b/>
           <w:color w:val="444444"/>
         </w:rPr>
-        <w:t>Fiction</w:t>
+        <w:t xml:space="preserve">History</w:t>
       </w:r>
     </w:p>
     <w:p>
@@ -25244,55 +25255,7 @@
         <w:rPr>
           <w:color w:val="444444"/>
         </w:rPr>
-        <w:t>The Murder That Hadn’t Happened Yet (The Relativistic Investigation Bureau, Book 1)</w:t>
-      </w:r>
-    </w:p>
-    <w:p>
-      <w:pPr>
-        <w:spacing w:after="20" w:line="240" w:lineRule="auto"/>
-        <w:jc w:val="center"/>
-      </w:pPr>
-      <w:r>
-        <w:rPr>
-          <w:color w:val="444444"/>
-        </w:rPr>
-        <w:t>The Warning That Was Sent Too Late (The Relativistic Investigation Bureau, Book 2)</w:t>
-      </w:r>
-    </w:p>
-    <w:p>
-      <w:pPr>
-        <w:spacing w:after="20" w:line="240" w:lineRule="auto"/>
-        <w:jc w:val="center"/>
-      </w:pPr>
-      <w:r>
-        <w:rPr>
-          <w:color w:val="444444"/>
-        </w:rPr>
-        <w:t>Schrödinger’s Paperwork (Lolly Wren’s Curious Science Adventures, Book 1)</w:t>
-      </w:r>
-    </w:p>
-    <w:p>
-      <w:pPr>
-        <w:spacing w:after="20" w:line="240" w:lineRule="auto"/>
-        <w:jc w:val="center"/>
-      </w:pPr>
-      <w:r>
-        <w:rPr>
-          <w:color w:val="444444"/>
-        </w:rPr>
-        <w:t>The Permitted Options (Lolly Wren’s Curious Science Adventures, Book 2)</w:t>
-      </w:r>
-    </w:p>
-    <w:p>
-      <w:pPr>
-        <w:spacing w:after="20" w:line="240" w:lineRule="auto"/>
-        <w:jc w:val="center"/>
-      </w:pPr>
-      <w:r>
-        <w:rPr>
-          <w:color w:val="444444"/>
-        </w:rPr>
-        <w:t>Protocol Flamingo (The Invasion Storybooks, Book 1), as George Herbert Fontaine</w:t>
+        <w:t xml:space="preserve">The Dolphins’ View of History</w:t>
       </w:r>
     </w:p>
     <w:p>
@@ -25306,7 +25269,7 @@
           <w:b/>
           <w:color w:val="444444"/>
         </w:rPr>
-        <w:t>How-To</w:t>
+        <w:t xml:space="preserve">Fiction</w:t>
       </w:r>
     </w:p>
     <w:p>
@@ -25318,7 +25281,7 @@
         <w:rPr>
           <w:color w:val="444444"/>
         </w:rPr>
-        <w:t>Your First Book That Sells</w:t>
+        <w:t xml:space="preserve">The Murder That Hadn’t Happened Yet (The Relativistic Investigation Bureau, Book 1), Lothar J. Musiol writing as Spezala Genara Relavi (S.G.R.)</w:t>
       </w:r>
     </w:p>
     <w:p>
@@ -25330,7 +25293,69 @@
         <w:rPr>
           <w:color w:val="444444"/>
         </w:rPr>
-        <w:t>Your First YouTube Channel That Rocks</w:t>
+        <w:t xml:space="preserve">The Warning That Was Sent Too Late (The Relativistic Investigation Bureau, Book 2), Lothar J. Musiol writing as Spezala Genara Relavi (S.G.R.)</w:t>
+      </w:r>
+    </w:p>
+    <w:p>
+      <w:pPr>
+        <w:spacing w:after="20" w:line="240" w:lineRule="auto"/>
+        <w:jc w:val="center"/>
+      </w:pPr>
+      <w:r>
+        <w:rPr>
+          <w:color w:val="444444"/>
+        </w:rPr>
+        <w:t xml:space="preserve">Schrödinger’s Paperwork (Lolly Wren’s Curious Science Adventures, Book 1), Lothar J. Musiol writing as Quentin Edmund Darling (Q.E.D.)</w:t>
+      </w:r>
+    </w:p>
+    <w:p>
+      <w:pPr>
+        <w:spacing w:after="20" w:line="240" w:lineRule="auto"/>
+        <w:jc w:val="center"/>
+      </w:pPr>
+      <w:r>
+        <w:rPr>
+          <w:color w:val="444444"/>
+        </w:rPr>
+        <w:t xml:space="preserve">Protocol Flamingo (The Invasion Storybooks, Book 1), Lothar J. Musiol writing as George Herbert Fontaine</w:t>
+      </w:r>
+    </w:p>
+    <w:p>
+      <w:pPr>
+        <w:spacing w:after="20" w:line="240" w:lineRule="auto"/>
+        <w:jc w:val="center"/>
+      </w:pPr>
+      <w:r>
+        <w:rPr>
+          <w:color w:val="444444"/>
+        </w:rPr>
+        <w:t xml:space="preserve">In Love with Murder, Actually: A Comic Mystery, Lothar J. Musiol writing as Romuald Livingston</w:t>
+      </w:r>
+    </w:p>
+    <w:p>
+      <w:pPr>
+        <w:keepNext/>
+        <w:spacing w:before="160" w:after="40" w:line="240" w:lineRule="auto"/>
+        <w:jc w:val="center"/>
+      </w:pPr>
+      <w:r>
+        <w:rPr>
+          <w:b/>
+          <w:color w:val="444444"/>
+        </w:rPr>
+        <w:t xml:space="preserve">In German</w:t>
+      </w:r>
+    </w:p>
+    <w:p>
+      <w:pPr>
+        <w:spacing w:after="20" w:line="240" w:lineRule="auto"/>
+        <w:jc w:val="center"/>
+      </w:pPr>
+      <w:r>
+        <w:rPr>
+          <w:color w:val="444444"/>
+        </w:rPr>
+        <w:t xml:space="preserve">Auswandern – Ab in die USA, Kanada, Australien oder Neuseeland?</w:t>
       </w:r>
     </w:p>
     <w:sectPr>

</xml_diff>

<commit_message>
About the Author (A): Lolly Wren Books 1-2 (Book 1 after the Q.E.D. note)
</commit_message>
<xml_diff>
--- a/Lolly Wren's Curious Science Adventures - SERIES/Book 2 - The Permitted Options/The_Permitted_Options_BOOK_2_REVISION_20261005.docx
+++ b/Lolly Wren's Curious Science Adventures - SERIES/Book 2 - The Permitted Options/The_Permitted_Options_BOOK_2_REVISION_20261005.docx
@@ -24854,6 +24854,57 @@
           <w:t>doi:10.1002/cpa.3160130102</w:t>
         </w:r>
       </w:hyperlink>
+    </w:p>
+    <w:p>
+      <w:pPr>
+        <w:pageBreakBefore/>
+        <w:spacing w:before="1440" w:line="240" w:lineRule="auto"/>
+        <w:jc w:val="center"/>
+      </w:pPr>
+      <w:r>
+        <w:rPr>
+          <w:b/>
+          <w:color w:val="444444"/>
+        </w:rPr>
+        <w:lastRenderedPageBreak/>
+        <w:t xml:space="preserve">About the Author</w:t>
+      </w:r>
+    </w:p>
+    <w:p>
+      <w:pPr>
+        <w:pStyle w:val="BodyText"/>
+      </w:pPr>
+      <w:r>
+        <w:t xml:space="preserve">Lothar J. Musiol is German by birth and American by choice, and he writes in British because he regards it as the most awkward American dialect. For exactly that reason he is a staunch aficionado of British films such as </w:t>
+      </w:r>
+      <w:r>
+        <w:rPr>
+          <w:i/>
+          <w:iCs/>
+        </w:rPr>
+        <w:t xml:space="preserve">Four Weddings and a Funeral</w:t>
+      </w:r>
+      <w:r>
+        <w:t xml:space="preserve">. The preposterous accent, however, was inspired by </w:t>
+      </w:r>
+      <w:r>
+        <w:rPr>
+          <w:i/>
+          <w:iCs/>
+        </w:rPr>
+        <w:t xml:space="preserve">Love Actually</w:t>
+      </w:r>
+      <w:r>
+        <w:t xml:space="preserve">, in which a daft sod named Colin Frissell flies to America and has a conversation in a bar before arriving at the true purpose of his travels. The author found that eye-opening and still hopes to get there one day, if he keeps up his admittedly naff British long enough.</w:t>
+      </w:r>
+    </w:p>
+    <w:p>
+      <w:pPr>
+        <w:pStyle w:val="BodyText"/>
+      </w:pPr>
+      <w:r>
+        <w:t xml:space="preserve">A graduate of Munich University of Applied Sciences, he spent more than forty years in the semiconductor industry, first at Germany’s largest company in the field, then at a string of American start-ups. Dual citizenship, put to its most sensible use, lets him split his time between San Clemente, California, and Passau, Bavaria, where Austria begins at the garden fence. The household includes one married daughter, one grumpy Teacup Pomeranian named Gucci, and eleven chickens, listed in order of seniority rather than volume.</w:t>
+      </w:r>
     </w:p>
     <w:p>
       <w:pPr>

</xml_diff>

<commit_message>
About the Author (A): Lolly Wren Books 1-2 (Book 1 after the Q.E.D. note) [merged onto main from book-2-lectures-after-qed 3fed5b8, paths only]
</commit_message>
<xml_diff>
--- a/Lolly Wren's Curious Science Adventures - SERIES/Book 2 - The Permitted Options/The_Permitted_Options_BOOK_2_REVISION_20261005.docx
+++ b/Lolly Wren's Curious Science Adventures - SERIES/Book 2 - The Permitted Options/The_Permitted_Options_BOOK_2_REVISION_20261005.docx
@@ -24854,6 +24854,57 @@
           <w:t>doi:10.1002/cpa.3160130102</w:t>
         </w:r>
       </w:hyperlink>
+    </w:p>
+    <w:p>
+      <w:pPr>
+        <w:pageBreakBefore/>
+        <w:spacing w:before="1440" w:line="240" w:lineRule="auto"/>
+        <w:jc w:val="center"/>
+      </w:pPr>
+      <w:r>
+        <w:rPr>
+          <w:b/>
+          <w:color w:val="444444"/>
+        </w:rPr>
+        <w:lastRenderedPageBreak/>
+        <w:t xml:space="preserve">About the Author</w:t>
+      </w:r>
+    </w:p>
+    <w:p>
+      <w:pPr>
+        <w:pStyle w:val="BodyText"/>
+      </w:pPr>
+      <w:r>
+        <w:t xml:space="preserve">Lothar J. Musiol is German by birth and American by choice, and he writes in British because he regards it as the most awkward American dialect. For exactly that reason he is a staunch aficionado of British films such as </w:t>
+      </w:r>
+      <w:r>
+        <w:rPr>
+          <w:i/>
+          <w:iCs/>
+        </w:rPr>
+        <w:t xml:space="preserve">Four Weddings and a Funeral</w:t>
+      </w:r>
+      <w:r>
+        <w:t xml:space="preserve">. The preposterous accent, however, was inspired by </w:t>
+      </w:r>
+      <w:r>
+        <w:rPr>
+          <w:i/>
+          <w:iCs/>
+        </w:rPr>
+        <w:t xml:space="preserve">Love Actually</w:t>
+      </w:r>
+      <w:r>
+        <w:t xml:space="preserve">, in which a daft sod named Colin Frissell flies to America and has a conversation in a bar before arriving at the true purpose of his travels. The author found that eye-opening and still hopes to get there one day, if he keeps up his admittedly naff British long enough.</w:t>
+      </w:r>
+    </w:p>
+    <w:p>
+      <w:pPr>
+        <w:pStyle w:val="BodyText"/>
+      </w:pPr>
+      <w:r>
+        <w:t xml:space="preserve">A graduate of Munich University of Applied Sciences, he spent more than forty years in the semiconductor industry, first at Germany’s largest company in the field, then at a string of American start-ups. Dual citizenship, put to its most sensible use, lets him split his time between San Clemente, California, and Passau, Bavaria, where Austria begins at the garden fence. The household includes one married daughter, one grumpy Teacup Pomeranian named Gucci, and eleven chickens, listed in order of seniority rather than volume.</w:t>
+      </w:r>
     </w:p>
     <w:p>
       <w:pPr>

</xml_diff>

<commit_message>
TOC complete and linked + review invitation: Lolly Wren Books 1-2
</commit_message>
<xml_diff>
--- a/Lolly Wren's Curious Science Adventures - SERIES/Book 2 - The Permitted Options/The_Permitted_Options_BOOK_2_REVISION_20261005.docx
+++ b/Lolly Wren's Curious Science Adventures - SERIES/Book 2 - The Permitted Options/The_Permitted_Options_BOOK_2_REVISION_20261005.docx
@@ -370,6 +370,244 @@
             <w:rStyle w:val="Hyperlink"/>
           </w:rPr>
           <w:t>For Curious Readers: The Lectures</w:t>
+        </w:r>
+      </w:hyperlink>
+    </w:p>
+    <w:p>
+      <w:pPr>
+        <w:pStyle w:val="FirstParagraph"/>
+        <w:spacing w:before="0" w:after="60"/>
+      </w:pPr>
+      <w:hyperlink w:anchor="lec00" w:history="1">
+        <w:r>
+          <w:rPr>
+            <w:rStyle w:val="Hyperlink"/>
+          </w:rPr>
+          <w:t xml:space="preserve">Lecture. Chapter One</w:t>
+        </w:r>
+      </w:hyperlink>
+    </w:p>
+    <w:p>
+      <w:pPr>
+        <w:pStyle w:val="FirstParagraph"/>
+        <w:spacing w:before="0" w:after="60"/>
+      </w:pPr>
+      <w:hyperlink w:anchor="lec01" w:history="1">
+        <w:r>
+          <w:rPr>
+            <w:rStyle w:val="Hyperlink"/>
+          </w:rPr>
+          <w:t xml:space="preserve">Lecture. Chapter Two</w:t>
+        </w:r>
+      </w:hyperlink>
+    </w:p>
+    <w:p>
+      <w:pPr>
+        <w:pStyle w:val="FirstParagraph"/>
+        <w:spacing w:before="0" w:after="60"/>
+      </w:pPr>
+      <w:hyperlink w:anchor="lec02" w:history="1">
+        <w:r>
+          <w:rPr>
+            <w:rStyle w:val="Hyperlink"/>
+          </w:rPr>
+          <w:t xml:space="preserve">Lecture. Chapter Three</w:t>
+        </w:r>
+      </w:hyperlink>
+    </w:p>
+    <w:p>
+      <w:pPr>
+        <w:pStyle w:val="FirstParagraph"/>
+        <w:spacing w:before="0" w:after="60"/>
+      </w:pPr>
+      <w:hyperlink w:anchor="lec03" w:history="1">
+        <w:r>
+          <w:rPr>
+            <w:rStyle w:val="Hyperlink"/>
+          </w:rPr>
+          <w:t xml:space="preserve">Lecture. Chapter Four</w:t>
+        </w:r>
+      </w:hyperlink>
+    </w:p>
+    <w:p>
+      <w:pPr>
+        <w:pStyle w:val="FirstParagraph"/>
+        <w:spacing w:before="0" w:after="60"/>
+      </w:pPr>
+      <w:hyperlink w:anchor="lec04" w:history="1">
+        <w:r>
+          <w:rPr>
+            <w:rStyle w:val="Hyperlink"/>
+          </w:rPr>
+          <w:t xml:space="preserve">Lecture. Chapters Five and Six</w:t>
+        </w:r>
+      </w:hyperlink>
+    </w:p>
+    <w:p>
+      <w:pPr>
+        <w:pStyle w:val="FirstParagraph"/>
+        <w:spacing w:before="0" w:after="60"/>
+      </w:pPr>
+      <w:hyperlink w:anchor="lec05" w:history="1">
+        <w:r>
+          <w:rPr>
+            <w:rStyle w:val="Hyperlink"/>
+          </w:rPr>
+          <w:t xml:space="preserve">Lecture. Chapter Seven</w:t>
+        </w:r>
+      </w:hyperlink>
+    </w:p>
+    <w:p>
+      <w:pPr>
+        <w:pStyle w:val="FirstParagraph"/>
+        <w:spacing w:before="0" w:after="60"/>
+      </w:pPr>
+      <w:hyperlink w:anchor="lec06" w:history="1">
+        <w:r>
+          <w:rPr>
+            <w:rStyle w:val="Hyperlink"/>
+          </w:rPr>
+          <w:t xml:space="preserve">Lecture. Chapter Eight</w:t>
+        </w:r>
+      </w:hyperlink>
+    </w:p>
+    <w:p>
+      <w:pPr>
+        <w:pStyle w:val="FirstParagraph"/>
+        <w:spacing w:before="0" w:after="60"/>
+      </w:pPr>
+      <w:hyperlink w:anchor="lec07" w:history="1">
+        <w:r>
+          <w:rPr>
+            <w:rStyle w:val="Hyperlink"/>
+          </w:rPr>
+          <w:t xml:space="preserve">Lecture. Chapter Nine</w:t>
+        </w:r>
+      </w:hyperlink>
+    </w:p>
+    <w:p>
+      <w:pPr>
+        <w:pStyle w:val="FirstParagraph"/>
+        <w:spacing w:before="0" w:after="60"/>
+      </w:pPr>
+      <w:hyperlink w:anchor="lec08" w:history="1">
+        <w:r>
+          <w:rPr>
+            <w:rStyle w:val="Hyperlink"/>
+          </w:rPr>
+          <w:t xml:space="preserve">Lecture. Chapter Ten</w:t>
+        </w:r>
+      </w:hyperlink>
+    </w:p>
+    <w:p>
+      <w:pPr>
+        <w:pStyle w:val="FirstParagraph"/>
+        <w:spacing w:before="0" w:after="60"/>
+      </w:pPr>
+      <w:hyperlink w:anchor="lec09" w:history="1">
+        <w:r>
+          <w:rPr>
+            <w:rStyle w:val="Hyperlink"/>
+          </w:rPr>
+          <w:t xml:space="preserve">Lecture. Chapter Eleven</w:t>
+        </w:r>
+      </w:hyperlink>
+    </w:p>
+    <w:p>
+      <w:pPr>
+        <w:pStyle w:val="FirstParagraph"/>
+        <w:spacing w:before="0" w:after="60"/>
+      </w:pPr>
+      <w:hyperlink w:anchor="lec10" w:history="1">
+        <w:r>
+          <w:rPr>
+            <w:rStyle w:val="Hyperlink"/>
+          </w:rPr>
+          <w:t xml:space="preserve">Lecture. Chapter Twelve</w:t>
+        </w:r>
+      </w:hyperlink>
+    </w:p>
+    <w:p>
+      <w:pPr>
+        <w:pStyle w:val="FirstParagraph"/>
+        <w:spacing w:before="0" w:after="60"/>
+      </w:pPr>
+      <w:hyperlink w:anchor="lec11" w:history="1">
+        <w:r>
+          <w:rPr>
+            <w:rStyle w:val="Hyperlink"/>
+          </w:rPr>
+          <w:t xml:space="preserve">Lecture. Chapter Thirteen</w:t>
+        </w:r>
+      </w:hyperlink>
+    </w:p>
+    <w:p>
+      <w:pPr>
+        <w:pStyle w:val="FirstParagraph"/>
+        <w:spacing w:before="0" w:after="60"/>
+      </w:pPr>
+      <w:hyperlink w:anchor="lec12" w:history="1">
+        <w:r>
+          <w:rPr>
+            <w:rStyle w:val="Hyperlink"/>
+          </w:rPr>
+          <w:t xml:space="preserve">Lecture. Chapter Fourteen</w:t>
+        </w:r>
+      </w:hyperlink>
+    </w:p>
+    <w:p>
+      <w:pPr>
+        <w:pStyle w:val="FirstParagraph"/>
+        <w:spacing w:before="0" w:after="60"/>
+      </w:pPr>
+      <w:hyperlink w:anchor="lec13" w:history="1">
+        <w:r>
+          <w:rPr>
+            <w:rStyle w:val="Hyperlink"/>
+          </w:rPr>
+          <w:t xml:space="preserve">Lecture. Chapter Fifteen</w:t>
+        </w:r>
+      </w:hyperlink>
+    </w:p>
+    <w:p>
+      <w:pPr>
+        <w:pStyle w:val="FirstParagraph"/>
+        <w:spacing w:before="0" w:after="60"/>
+      </w:pPr>
+      <w:hyperlink w:anchor="lec14" w:history="1">
+        <w:r>
+          <w:rPr>
+            <w:rStyle w:val="Hyperlink"/>
+          </w:rPr>
+          <w:t xml:space="preserve">Lecture. Chapters Sixteen and Seventeen</w:t>
+        </w:r>
+      </w:hyperlink>
+    </w:p>
+    <w:p>
+      <w:pPr>
+        <w:pStyle w:val="FirstParagraph"/>
+        <w:spacing w:before="0" w:after="60"/>
+      </w:pPr>
+      <w:hyperlink w:anchor="_TocAll0001" w:history="1">
+        <w:r>
+          <w:rPr>
+            <w:rStyle w:val="Hyperlink"/>
+          </w:rPr>
+          <w:t xml:space="preserve">Glossary</w:t>
+        </w:r>
+      </w:hyperlink>
+    </w:p>
+    <w:p>
+      <w:pPr>
+        <w:pStyle w:val="FirstParagraph"/>
+        <w:spacing w:before="0" w:after="60"/>
+      </w:pPr>
+      <w:hyperlink w:anchor="_TocAll0002" w:history="1">
+        <w:r>
+          <w:rPr>
+            <w:rStyle w:val="Hyperlink"/>
+          </w:rPr>
+          <w:t xml:space="preserve">Bibliography</w:t>
         </w:r>
       </w:hyperlink>
     </w:p>
@@ -24241,6 +24479,8 @@
         <w:pageBreakBefore/>
         <w:spacing w:after="80"/>
       </w:pPr>
+      <w:bookmarkStart w:id="133" w:name="_TocAll0001"/>
+      <w:bookmarkEnd w:id="133"/>
       <w:r>
         <w:rPr>
           <w:sz w:val="40"/>
@@ -24568,6 +24808,8 @@
         <w:pageBreakBefore/>
         <w:spacing w:after="80"/>
       </w:pPr>
+      <w:bookmarkStart w:id="134" w:name="_TocAll0002"/>
+      <w:bookmarkEnd w:id="134"/>
       <w:r>
         <w:rPr>
           <w:sz w:val="40"/>
@@ -24854,6 +25096,19 @@
           <w:t>doi:10.1002/cpa.3160130102</w:t>
         </w:r>
       </w:hyperlink>
+    </w:p>
+    <w:p>
+      <w:pPr>
+        <w:pStyle w:val="BodyText"/>
+        <w:pageBreakBefore/>
+      </w:pPr>
+      <w:r>
+        <w:rPr>
+          <w:i/>
+          <w:iCs/>
+        </w:rPr>
+        <w:t xml:space="preserve">If you enjoyed the story, a few words on Amazon would mean a great deal. It’s how other readers find their way here, and I read every one.</w:t>
+      </w:r>
     </w:p>
     <w:p>
       <w:pPr>

</xml_diff>

<commit_message>
TOC complete and linked + review invitation: Lolly Wren Books 1-2 [merged onto main from book-2-lectures-after-qed 6d9228b, paths only]
</commit_message>
<xml_diff>
--- a/Lolly Wren's Curious Science Adventures - SERIES/Book 2 - The Permitted Options/The_Permitted_Options_BOOK_2_REVISION_20261005.docx
+++ b/Lolly Wren's Curious Science Adventures - SERIES/Book 2 - The Permitted Options/The_Permitted_Options_BOOK_2_REVISION_20261005.docx
@@ -370,6 +370,244 @@
             <w:rStyle w:val="Hyperlink"/>
           </w:rPr>
           <w:t>For Curious Readers: The Lectures</w:t>
+        </w:r>
+      </w:hyperlink>
+    </w:p>
+    <w:p>
+      <w:pPr>
+        <w:pStyle w:val="FirstParagraph"/>
+        <w:spacing w:before="0" w:after="60"/>
+      </w:pPr>
+      <w:hyperlink w:anchor="lec00" w:history="1">
+        <w:r>
+          <w:rPr>
+            <w:rStyle w:val="Hyperlink"/>
+          </w:rPr>
+          <w:t xml:space="preserve">Lecture. Chapter One</w:t>
+        </w:r>
+      </w:hyperlink>
+    </w:p>
+    <w:p>
+      <w:pPr>
+        <w:pStyle w:val="FirstParagraph"/>
+        <w:spacing w:before="0" w:after="60"/>
+      </w:pPr>
+      <w:hyperlink w:anchor="lec01" w:history="1">
+        <w:r>
+          <w:rPr>
+            <w:rStyle w:val="Hyperlink"/>
+          </w:rPr>
+          <w:t xml:space="preserve">Lecture. Chapter Two</w:t>
+        </w:r>
+      </w:hyperlink>
+    </w:p>
+    <w:p>
+      <w:pPr>
+        <w:pStyle w:val="FirstParagraph"/>
+        <w:spacing w:before="0" w:after="60"/>
+      </w:pPr>
+      <w:hyperlink w:anchor="lec02" w:history="1">
+        <w:r>
+          <w:rPr>
+            <w:rStyle w:val="Hyperlink"/>
+          </w:rPr>
+          <w:t xml:space="preserve">Lecture. Chapter Three</w:t>
+        </w:r>
+      </w:hyperlink>
+    </w:p>
+    <w:p>
+      <w:pPr>
+        <w:pStyle w:val="FirstParagraph"/>
+        <w:spacing w:before="0" w:after="60"/>
+      </w:pPr>
+      <w:hyperlink w:anchor="lec03" w:history="1">
+        <w:r>
+          <w:rPr>
+            <w:rStyle w:val="Hyperlink"/>
+          </w:rPr>
+          <w:t xml:space="preserve">Lecture. Chapter Four</w:t>
+        </w:r>
+      </w:hyperlink>
+    </w:p>
+    <w:p>
+      <w:pPr>
+        <w:pStyle w:val="FirstParagraph"/>
+        <w:spacing w:before="0" w:after="60"/>
+      </w:pPr>
+      <w:hyperlink w:anchor="lec04" w:history="1">
+        <w:r>
+          <w:rPr>
+            <w:rStyle w:val="Hyperlink"/>
+          </w:rPr>
+          <w:t xml:space="preserve">Lecture. Chapters Five and Six</w:t>
+        </w:r>
+      </w:hyperlink>
+    </w:p>
+    <w:p>
+      <w:pPr>
+        <w:pStyle w:val="FirstParagraph"/>
+        <w:spacing w:before="0" w:after="60"/>
+      </w:pPr>
+      <w:hyperlink w:anchor="lec05" w:history="1">
+        <w:r>
+          <w:rPr>
+            <w:rStyle w:val="Hyperlink"/>
+          </w:rPr>
+          <w:t xml:space="preserve">Lecture. Chapter Seven</w:t>
+        </w:r>
+      </w:hyperlink>
+    </w:p>
+    <w:p>
+      <w:pPr>
+        <w:pStyle w:val="FirstParagraph"/>
+        <w:spacing w:before="0" w:after="60"/>
+      </w:pPr>
+      <w:hyperlink w:anchor="lec06" w:history="1">
+        <w:r>
+          <w:rPr>
+            <w:rStyle w:val="Hyperlink"/>
+          </w:rPr>
+          <w:t xml:space="preserve">Lecture. Chapter Eight</w:t>
+        </w:r>
+      </w:hyperlink>
+    </w:p>
+    <w:p>
+      <w:pPr>
+        <w:pStyle w:val="FirstParagraph"/>
+        <w:spacing w:before="0" w:after="60"/>
+      </w:pPr>
+      <w:hyperlink w:anchor="lec07" w:history="1">
+        <w:r>
+          <w:rPr>
+            <w:rStyle w:val="Hyperlink"/>
+          </w:rPr>
+          <w:t xml:space="preserve">Lecture. Chapter Nine</w:t>
+        </w:r>
+      </w:hyperlink>
+    </w:p>
+    <w:p>
+      <w:pPr>
+        <w:pStyle w:val="FirstParagraph"/>
+        <w:spacing w:before="0" w:after="60"/>
+      </w:pPr>
+      <w:hyperlink w:anchor="lec08" w:history="1">
+        <w:r>
+          <w:rPr>
+            <w:rStyle w:val="Hyperlink"/>
+          </w:rPr>
+          <w:t xml:space="preserve">Lecture. Chapter Ten</w:t>
+        </w:r>
+      </w:hyperlink>
+    </w:p>
+    <w:p>
+      <w:pPr>
+        <w:pStyle w:val="FirstParagraph"/>
+        <w:spacing w:before="0" w:after="60"/>
+      </w:pPr>
+      <w:hyperlink w:anchor="lec09" w:history="1">
+        <w:r>
+          <w:rPr>
+            <w:rStyle w:val="Hyperlink"/>
+          </w:rPr>
+          <w:t xml:space="preserve">Lecture. Chapter Eleven</w:t>
+        </w:r>
+      </w:hyperlink>
+    </w:p>
+    <w:p>
+      <w:pPr>
+        <w:pStyle w:val="FirstParagraph"/>
+        <w:spacing w:before="0" w:after="60"/>
+      </w:pPr>
+      <w:hyperlink w:anchor="lec10" w:history="1">
+        <w:r>
+          <w:rPr>
+            <w:rStyle w:val="Hyperlink"/>
+          </w:rPr>
+          <w:t xml:space="preserve">Lecture. Chapter Twelve</w:t>
+        </w:r>
+      </w:hyperlink>
+    </w:p>
+    <w:p>
+      <w:pPr>
+        <w:pStyle w:val="FirstParagraph"/>
+        <w:spacing w:before="0" w:after="60"/>
+      </w:pPr>
+      <w:hyperlink w:anchor="lec11" w:history="1">
+        <w:r>
+          <w:rPr>
+            <w:rStyle w:val="Hyperlink"/>
+          </w:rPr>
+          <w:t xml:space="preserve">Lecture. Chapter Thirteen</w:t>
+        </w:r>
+      </w:hyperlink>
+    </w:p>
+    <w:p>
+      <w:pPr>
+        <w:pStyle w:val="FirstParagraph"/>
+        <w:spacing w:before="0" w:after="60"/>
+      </w:pPr>
+      <w:hyperlink w:anchor="lec12" w:history="1">
+        <w:r>
+          <w:rPr>
+            <w:rStyle w:val="Hyperlink"/>
+          </w:rPr>
+          <w:t xml:space="preserve">Lecture. Chapter Fourteen</w:t>
+        </w:r>
+      </w:hyperlink>
+    </w:p>
+    <w:p>
+      <w:pPr>
+        <w:pStyle w:val="FirstParagraph"/>
+        <w:spacing w:before="0" w:after="60"/>
+      </w:pPr>
+      <w:hyperlink w:anchor="lec13" w:history="1">
+        <w:r>
+          <w:rPr>
+            <w:rStyle w:val="Hyperlink"/>
+          </w:rPr>
+          <w:t xml:space="preserve">Lecture. Chapter Fifteen</w:t>
+        </w:r>
+      </w:hyperlink>
+    </w:p>
+    <w:p>
+      <w:pPr>
+        <w:pStyle w:val="FirstParagraph"/>
+        <w:spacing w:before="0" w:after="60"/>
+      </w:pPr>
+      <w:hyperlink w:anchor="lec14" w:history="1">
+        <w:r>
+          <w:rPr>
+            <w:rStyle w:val="Hyperlink"/>
+          </w:rPr>
+          <w:t xml:space="preserve">Lecture. Chapters Sixteen and Seventeen</w:t>
+        </w:r>
+      </w:hyperlink>
+    </w:p>
+    <w:p>
+      <w:pPr>
+        <w:pStyle w:val="FirstParagraph"/>
+        <w:spacing w:before="0" w:after="60"/>
+      </w:pPr>
+      <w:hyperlink w:anchor="_TocAll0001" w:history="1">
+        <w:r>
+          <w:rPr>
+            <w:rStyle w:val="Hyperlink"/>
+          </w:rPr>
+          <w:t xml:space="preserve">Glossary</w:t>
+        </w:r>
+      </w:hyperlink>
+    </w:p>
+    <w:p>
+      <w:pPr>
+        <w:pStyle w:val="FirstParagraph"/>
+        <w:spacing w:before="0" w:after="60"/>
+      </w:pPr>
+      <w:hyperlink w:anchor="_TocAll0002" w:history="1">
+        <w:r>
+          <w:rPr>
+            <w:rStyle w:val="Hyperlink"/>
+          </w:rPr>
+          <w:t xml:space="preserve">Bibliography</w:t>
         </w:r>
       </w:hyperlink>
     </w:p>
@@ -24241,6 +24479,8 @@
         <w:pageBreakBefore/>
         <w:spacing w:after="80"/>
       </w:pPr>
+      <w:bookmarkStart w:id="133" w:name="_TocAll0001"/>
+      <w:bookmarkEnd w:id="133"/>
       <w:r>
         <w:rPr>
           <w:sz w:val="40"/>
@@ -24568,6 +24808,8 @@
         <w:pageBreakBefore/>
         <w:spacing w:after="80"/>
       </w:pPr>
+      <w:bookmarkStart w:id="134" w:name="_TocAll0002"/>
+      <w:bookmarkEnd w:id="134"/>
       <w:r>
         <w:rPr>
           <w:sz w:val="40"/>
@@ -24854,6 +25096,19 @@
           <w:t>doi:10.1002/cpa.3160130102</w:t>
         </w:r>
       </w:hyperlink>
+    </w:p>
+    <w:p>
+      <w:pPr>
+        <w:pStyle w:val="BodyText"/>
+        <w:pageBreakBefore/>
+      </w:pPr>
+      <w:r>
+        <w:rPr>
+          <w:i/>
+          <w:iCs/>
+        </w:rPr>
+        <w:t xml:space="preserve">If you enjoyed the story, a few words on Amazon would mean a great deal. It’s how other readers find their way here, and I read every one.</w:t>
+      </w:r>
     </w:p>
     <w:p>
       <w:pPr>

</xml_diff>

<commit_message>
The Permitted Options: front and back covers (series trade dress; back single colour, text only), strict rescore 8.6 -> 9.1, bibliography 21 -> 44 entries as keyword links with 41 in-text citation links, About the Author and Also by in the Contents; master to bak first
</commit_message>
<xml_diff>
--- a/Lolly Wren's Curious Science Adventures - SERIES/Book 2 - The Permitted Options/The_Permitted_Options_BOOK_2_REVISION_20261005.docx
+++ b/Lolly Wren's Curious Science Adventures - SERIES/Book 2 - The Permitted Options/The_Permitted_Options_BOOK_2_REVISION_20261005.docx
@@ -608,6 +608,34 @@
             <w:rStyle w:val="Hyperlink"/>
           </w:rPr>
           <w:t xml:space="preserve">Bibliography</w:t>
+        </w:r>
+      </w:hyperlink>
+    </w:p>
+    <w:p>
+      <w:pPr>
+        <w:pStyle w:val="FirstParagraph"/>
+        <w:spacing w:before="0" w:after="60"/>
+      </w:pPr>
+      <w:hyperlink w:anchor="aboutAuthor" w:history="1">
+        <w:r>
+          <w:rPr>
+            <w:rStyle w:val="Hyperlink"/>
+          </w:rPr>
+          <w:t xml:space="preserve">About the Author</w:t>
+        </w:r>
+      </w:hyperlink>
+    </w:p>
+    <w:p>
+      <w:pPr>
+        <w:pStyle w:val="FirstParagraph"/>
+        <w:spacing w:before="0" w:after="60"/>
+      </w:pPr>
+      <w:hyperlink w:anchor="alsoBy" w:history="1">
+        <w:r>
+          <w:rPr>
+            <w:rStyle w:val="Hyperlink"/>
+          </w:rPr>
+          <w:t xml:space="preserve">Also by Lothar J. Musiol</w:t>
         </w:r>
       </w:hyperlink>
     </w:p>
@@ -19486,7 +19514,19 @@
         <w:t>The Casimir effect.</w:t>
       </w:r>
       <w:r>
-        <w:t xml:space="preserve"> Hendrik Casimir, working at Philips Research in 1948 on the practical question of why colloidal suspensions in industrial products behaved as they did, calculated what happens when two uncharged parallel conducting plates are placed very close together. Between the plates, only field modes with wavelengths fitting the cavity are permitted; outside, all modes are available. The mode density between the plates is therefore lower than outside, and so is the vacuum energy density. The result is an attractive force per unit area</w:t>
+        <w:t xml:space="preserve"> </w:t>
+      </w:r>
+      <w:hyperlink w:anchor="bib_casimir1948" w:history="1">
+        <w:r>
+          <w:rPr>
+            <w:color w:val="0563C1"/>
+            <w:u w:val="single"/>
+          </w:rPr>
+          <w:t xml:space="preserve">Hendrik Casimir</w:t>
+        </w:r>
+      </w:hyperlink>
+      <w:r>
+        <w:t xml:space="preserve">, working at Philips Research in 1948 on the practical question of why colloidal suspensions in industrial products behaved as they did, calculated what happens when two uncharged parallel conducting plates are placed very close together. Between the plates, only field modes with wavelengths fitting the cavity are permitted; outside, all modes are available. The mode density between the plates is therefore lower than outside, and so is the vacuum energy density. The result is an attractive force per unit area</w:t>
       </w:r>
     </w:p>
     <w:p>
@@ -19505,8 +19545,19 @@
         <w:t xml:space="preserve">falling off as the fourth power of separation — feeble at a micron, substantial at tens of nanometres, and a genuine engineering nuisance in microelectromechanical devices. It was </w:t>
       </w:r>
       <w:r>
-        <w:lastRenderedPageBreak/>
-        <w:t>measured decisively by Lamoreaux in 1997 and many times since.</w:t>
+        <w:t xml:space="preserve">measured decisively by </w:t>
+      </w:r>
+      <w:hyperlink w:anchor="bib_lamoreaux1997" w:history="1">
+        <w:r>
+          <w:rPr>
+            <w:color w:val="0563C1"/>
+            <w:u w:val="single"/>
+          </w:rPr>
+          <w:t xml:space="preserve">Lamoreaux in 1997</w:t>
+        </w:r>
+      </w:hyperlink>
+      <w:r>
+        <w:t xml:space="preserve"> and many times since.</w:t>
       </w:r>
     </w:p>
     <w:p>
@@ -19740,7 +19791,19 @@
         <w:t>What Einstein actually objected to.</w:t>
       </w:r>
       <w:r>
-        <w:t xml:space="preserve"> In a 1926 letter to Max Born he wrote that the theory “says a lot, but does not really bring us any closer to the secret of the ‘old one’. I, at any rate, am convinced that He is not playing at dice.” (That is the published English translation; the letter is dated 4 December 1926.) The remark is routinely misread as a mystic’s discomfort with randomness. His actual objection was methodological and rather dry: quantum mechanics yields probabilities, and Einstein held that a probability is what a theory offers when its description is </w:t>
+        <w:t xml:space="preserve"> In </w:t>
+      </w:r>
+      <w:hyperlink w:anchor="bib_einstein1926" w:history="1">
+        <w:r>
+          <w:rPr>
+            <w:color w:val="0563C1"/>
+            <w:u w:val="single"/>
+          </w:rPr>
+          <w:t xml:space="preserve">a 1926 letter to Max Born</w:t>
+        </w:r>
+      </w:hyperlink>
+      <w:r>
+        <w:t xml:space="preserve"> he wrote that the theory “says a lot, but does not really bring us any closer to the secret of the ‘old one’. I, at any rate, am convinced that He is not playing at dice.” (That is the published English translation; the letter is dated 4 December 1926.) The remark is routinely misread as a mystic’s discomfort with randomness. His actual objection was methodological and rather dry: quantum mechanics yields probabilities, and Einstein held that a probability is what a theory offers when its description is </w:t>
       </w:r>
       <w:r>
         <w:rPr>
@@ -19765,7 +19828,19 @@
         <w:t>Hidden variables, and where Einstein was wrong.</w:t>
       </w:r>
       <w:r>
-        <w:t xml:space="preserve"> The 1935 EPR paper argued that quantum mechanics must be incomplete on the grounds that one can predict with certainty the result of a distant measurement without disturbing the distant system — implying a pre-existing element of reality the formalism omits. The argument assumed </w:t>
+        <w:t xml:space="preserve"> </w:t>
+      </w:r>
+      <w:hyperlink w:anchor="bib_epr1935" w:history="1">
+        <w:r>
+          <w:rPr>
+            <w:color w:val="0563C1"/>
+            <w:u w:val="single"/>
+          </w:rPr>
+          <w:t xml:space="preserve">The 1935 EPR paper</w:t>
+        </w:r>
+      </w:hyperlink>
+      <w:r>
+        <w:t xml:space="preserve"> argued that quantum mechanics must be incomplete on the grounds that one can predict with certainty the result of a distant measurement without disturbing the distant system — implying a pre-existing element of reality the formalism omits. The argument assumed </w:t>
       </w:r>
       <w:r>
         <w:rPr>
@@ -20071,7 +20146,19 @@
         <w:t>The bound that starts it.</w:t>
       </w:r>
       <w:r>
-        <w:t xml:space="preserve"> Ordinary intuition says the information capacity of a region scales with its volume. Bekenstein’s 1972 work on black hole thermodynamics broke that. A black hole’s entropy is proportional not to its volume but to the </w:t>
+        <w:t xml:space="preserve"> Ordinary intuition says the information capacity of a region scales with its volume. </w:t>
+      </w:r>
+      <w:hyperlink w:anchor="bib_bekenstein1972" w:history="1">
+        <w:r>
+          <w:rPr>
+            <w:color w:val="0563C1"/>
+            <w:u w:val="single"/>
+          </w:rPr>
+          <w:t xml:space="preserve">Bekenstein’s 1972</w:t>
+        </w:r>
+      </w:hyperlink>
+      <w:r>
+        <w:t xml:space="preserve"> work on black hole thermodynamics broke that. A black hole’s entropy is proportional not to its volume but to the </w:t>
       </w:r>
       <w:r>
         <w:rPr>
@@ -20142,7 +20229,19 @@
         <w:t>AdS/CFT correspondence</w:t>
       </w:r>
       <w:r>
-        <w:t xml:space="preserve"> (Maldacena, 1997): a gravitational theory in a (d+1)-dimensional anti-de Sitter bulk is exactly dual to a conformal field theory without gravity on its d-dimensional </w:t>
+        <w:t xml:space="preserve"> (</w:t>
+      </w:r>
+      <w:hyperlink w:anchor="bib_maldacena1997" w:history="1">
+        <w:r>
+          <w:rPr>
+            <w:color w:val="0563C1"/>
+            <w:u w:val="single"/>
+          </w:rPr>
+          <w:t xml:space="preserve">Maldacena, 1997</w:t>
+        </w:r>
+      </w:hyperlink>
+      <w:r>
+        <w:t xml:space="preserve">): a gravitational theory in a (d+1)-dimensional anti-de Sitter bulk is exactly dual to a conformal field theory without gravity on its d-dimensional </w:t>
       </w:r>
       <w:r>
         <w:lastRenderedPageBreak/>
@@ -20422,7 +20521,19 @@
         <w:t>Complementarity.</w:t>
       </w:r>
       <w:r>
-        <w:t xml:space="preserve"> Susskind, Thorlacius and Uglum proposed in 1993 that the black hole information paradox dissolves if one abandons the assumption that a single global description must exist. To an outside observer, information never enters the hole; it is smeared on the stretched horizon and returns in the radiation. To an infalling observer, nothing special happens at the horizon and the interior is an ordinary place. Both accounts are internally consistent, and no observer can perform an experiment that compares them, because to check the outside account you must stay out, and to check the inside account you must go in and cannot report back. There is no contradiction because there is no vantage point from which to have one. This is the doctrine the Office of the President relies upon, and it is stated fairly in the chapter.</w:t>
+        <w:t xml:space="preserve"> </w:t>
+      </w:r>
+      <w:hyperlink w:anchor="bib_stu1993" w:history="1">
+        <w:r>
+          <w:rPr>
+            <w:color w:val="0563C1"/>
+            <w:u w:val="single"/>
+          </w:rPr>
+          <w:t xml:space="preserve">Susskind, Thorlacius and Uglum</w:t>
+        </w:r>
+      </w:hyperlink>
+      <w:r>
+        <w:t xml:space="preserve"> proposed in 1993 that the black hole information paradox dissolves if one abandons the assumption that a single global description must exist. To an outside observer, information never enters the hole; it is smeared on the stretched horizon and returns in the radiation. To an infalling observer, nothing special happens at the horizon and the interior is an ordinary place. Both accounts are internally consistent, and no observer can perform an experiment that compares them, because to check the outside account you must stay out, and to check the inside account you must go in and cannot report back. There is no contradiction because there is no vantage point from which to have one. This is the doctrine the Office of the President relies upon, and it is stated fairly in the chapter.</w:t>
       </w:r>
     </w:p>
     <w:p>
@@ -20437,7 +20548,19 @@
         <w:t>Why it fails: the firewall argument.</w:t>
       </w:r>
       <w:r>
-        <w:t xml:space="preserve"> In 2012 Almheiri, Marolf, Polchinski and Sully (AMPS) showed that the two accounts cannot be reconciled after all, and the reason is a theorem of quantum information: monogamy of entanglement. For the outside account to work, a late Hawking quantum must be maximally correlated with the radiation already emitted. For the infalling account to work — for the horizon to be an unremarkable region of empty space — that same quantum must be maximally correlated with its partner just inside. Monogamy forbids both:</w:t>
+        <w:t xml:space="preserve"> In 2012 </w:t>
+      </w:r>
+      <w:hyperlink w:anchor="bib_amps2012" w:history="1">
+        <w:r>
+          <w:rPr>
+            <w:color w:val="0563C1"/>
+            <w:u w:val="single"/>
+          </w:rPr>
+          <w:t xml:space="preserve">Almheiri, Marolf, Polchinski and Sully</w:t>
+        </w:r>
+      </w:hyperlink>
+      <w:r>
+        <w:t xml:space="preserve"> (AMPS) showed that the two accounts cannot be reconciled after all, and the reason is a theorem of quantum information: monogamy of entanglement. For the outside account to work, a late Hawking quantum must be maximally correlated with the radiation already emitted. For the infalling account to work — for the horizon to be an unremarkable region of empty space — that same quantum must be maximally correlated with its partner just inside. Monogamy forbids both:</w:t>
       </w:r>
     </w:p>
     <w:p>
@@ -20721,7 +20844,19 @@
         <w:t>The first incompleteness theorem.</w:t>
       </w:r>
       <w:r>
-        <w:t xml:space="preserve"> Gödel proved in 1931 that any consistent, effectively axiomatised formal system strong enough to express elementary arithmetic contains statements that are true but unprovable within it. The machinery is </w:t>
+        <w:t xml:space="preserve"> </w:t>
+      </w:r>
+      <w:hyperlink w:anchor="bib_godel1931" w:history="1">
+        <w:r>
+          <w:rPr>
+            <w:color w:val="0563C1"/>
+            <w:u w:val="single"/>
+          </w:rPr>
+          <w:t xml:space="preserve">Gödel proved in 1931</w:t>
+        </w:r>
+      </w:hyperlink>
+      <w:r>
+        <w:t xml:space="preserve"> that any consistent, effectively axiomatised formal system strong enough to express elementary arithmetic contains statements that are true but unprovable within it. The machinery is </w:t>
       </w:r>
       <w:r>
         <w:rPr>
@@ -20786,7 +20921,19 @@
         <w:t>Undecidability in physics, which is the chapter’s real weight.</w:t>
       </w:r>
       <w:r>
-        <w:t xml:space="preserve"> In 2015, Cubitt, Pérez-García and Wolf proved that the </w:t>
+        <w:t xml:space="preserve"> In 2015, </w:t>
+      </w:r>
+      <w:hyperlink w:anchor="bib_cubitt2015" w:history="1">
+        <w:r>
+          <w:rPr>
+            <w:color w:val="0563C1"/>
+            <w:u w:val="single"/>
+          </w:rPr>
+          <w:t xml:space="preserve">Cubitt, Pérez-García and Wolf</w:t>
+        </w:r>
+      </w:hyperlink>
+      <w:r>
+        <w:t xml:space="preserve"> proved that the </w:t>
       </w:r>
       <w:r>
         <w:rPr>
@@ -20839,7 +20986,19 @@
         <w:t>The Hofstadter strand.</w:t>
       </w:r>
       <w:r>
-        <w:t xml:space="preserve"> Gödel, Escher, Bach: an Eternal Golden Braid (Hofstadter, 1979) argues that Gödel’s self-reference, Escher’s impossible recursions — Drawing Hands, Print Gallery, the endlessly rising staircase — and Bach’s canons, especially the modulating canon that ascends through six keys and returns to its origin, are the same structure realised in logic, image and sound. Hofstadter calls the structure a </w:t>
+        <w:t xml:space="preserve"> Gödel, Escher, Bach: an Eternal Golden Braid (</w:t>
+      </w:r>
+      <w:hyperlink w:anchor="bib_hofstadter1979" w:history="1">
+        <w:r>
+          <w:rPr>
+            <w:color w:val="0563C1"/>
+            <w:u w:val="single"/>
+          </w:rPr>
+          <w:t xml:space="preserve">Hofstadter, 1979</w:t>
+        </w:r>
+      </w:hyperlink>
+      <w:r>
+        <w:t xml:space="preserve">) argues that Gödel’s self-reference, Escher’s impossible recursions — Drawing Hands, Print Gallery, the endlessly rising staircase — and Bach’s canons, especially the modulating canon that ascends through six keys and returns to its origin, are the same structure realised in logic, image and sound. Hofstadter calls the structure a </w:t>
       </w:r>
       <w:r>
         <w:rPr>
@@ -21001,7 +21160,19 @@
         <w:pStyle w:val="FirstParagraph"/>
       </w:pPr>
       <w:r>
-        <w:t>Chapter Eight brings in Nash equilibrium and the commons, nonlocal games as the operational face of Bell’s theorem, and the 2020 result that the value of such games is undecidable.</w:t>
+        <w:t xml:space="preserve">Chapter Eight brings in Nash equilibrium and the commons, nonlocal games as the operational face of Bell’s theorem, and the </w:t>
+      </w:r>
+      <w:hyperlink w:anchor="bib_ji2020" w:history="1">
+        <w:r>
+          <w:rPr>
+            <w:color w:val="0563C1"/>
+            <w:u w:val="single"/>
+          </w:rPr>
+          <w:t xml:space="preserve">2020 result</w:t>
+        </w:r>
+      </w:hyperlink>
+      <w:r>
+        <w:t xml:space="preserve"> that the value of such games is undecidable.</w:t>
       </w:r>
     </w:p>
     <w:p>
@@ -21016,7 +21187,19 @@
         <w:t>Equilibrium, and why the Programme was structurally doomed.</w:t>
       </w:r>
       <w:r>
-        <w:t xml:space="preserve"> Nash’s 1950 result, from a famously short doctoral thesis, established that every finite non-cooperative game has at least one point at which no player can improve by unilaterally changing strategy. For a public-good game with diffuse benefit and specific cost, non-contribution strictly dominates: whatever the others do, an individual member does better by withholding. The unique equilibrium is universal defection, and no malice is required to reach it. Nash is reported to have rated the embedding theorems (1954–56) above his game theory; they prove that any Riemannian manifold admits an isometric embedding into a Euclidean space of sufficient dimension — a curved intrinsic description is always available as a plain extrinsic one, which is why the chapter has him glance at the holography board.</w:t>
+        <w:t xml:space="preserve"> </w:t>
+      </w:r>
+      <w:hyperlink w:anchor="bib_nash1950" w:history="1">
+        <w:r>
+          <w:rPr>
+            <w:color w:val="0563C1"/>
+            <w:u w:val="single"/>
+          </w:rPr>
+          <w:t xml:space="preserve">Nash’s 1950 result</w:t>
+        </w:r>
+      </w:hyperlink>
+      <w:r>
+        <w:t xml:space="preserve">, from a famously short doctoral thesis, established that every finite non-cooperative game has at least one point at which no player can improve by unilaterally changing strategy. For a public-good game with diffuse benefit and specific cost, non-contribution strictly dominates: whatever the others do, an individual member does better by withholding. The unique equilibrium is universal defection, and no malice is required to reach it. Nash is reported to have rated the embedding theorems (1954–56) above his game theory; they prove that any Riemannian manifold admits an isometric embedding into a Euclidean space of sufficient dimension — a curved intrinsic description is always available as a plain extrinsic one, which is why the chapter has him glance at the holography board.</w:t>
       </w:r>
     </w:p>
     <w:p>
@@ -21213,7 +21396,19 @@
         <w:t>The Page curve, in passing.</w:t>
       </w:r>
       <w:r>
-        <w:t xml:space="preserve"> Ramanathan’s crossover is Page’s 1993 result: the entanglement entropy of radiation from an evaporating black hole rises while the interior still holds the record, peaks at the </w:t>
+        <w:t xml:space="preserve"> Ramanathan’s crossover is </w:t>
+      </w:r>
+      <w:hyperlink w:anchor="bib_page1993" w:history="1">
+        <w:r>
+          <w:rPr>
+            <w:color w:val="0563C1"/>
+            <w:u w:val="single"/>
+          </w:rPr>
+          <w:t xml:space="preserve">Page’s 1993 result</w:t>
+        </w:r>
+      </w:hyperlink>
+      <w:r>
+        <w:t xml:space="preserve">: the entanglement entropy of radiation from an evaporating black hole rises while the interior still holds the record, peaks at the </w:t>
       </w:r>
       <w:r>
         <w:rPr>
@@ -21381,7 +21576,19 @@
         </w:numPr>
       </w:pPr>
       <w:r>
-        <w:t>Kennard proved the real reason the same year: even a system nobody has touched, described by its wavefunction alone, satisfies Δx·Δp ≥ ħ/2 — a spread in position times a spread in momentum that can never fall below a fixed, tiny floor. Robertson widened this in 1929 to any two quantities that don’t commute. No microscope required. No disturbance required. It is a property of the wave, not a limit on the poking.</w:t>
+        <w:t xml:space="preserve">Kennard proved the real reason the same year: even a system nobody has touched, described by its wavefunction alone, satisfies Δx·Δp ≥ ħ/2 — a spread in position times a spread in momentum that can never fall below a fixed, tiny floor. </w:t>
+      </w:r>
+      <w:hyperlink w:anchor="bib_robertson1929" w:history="1">
+        <w:r>
+          <w:rPr>
+            <w:color w:val="0563C1"/>
+            <w:u w:val="single"/>
+          </w:rPr>
+          <w:t xml:space="preserve">Robertson widened this in 1929</w:t>
+        </w:r>
+      </w:hyperlink>
+      <w:r>
+        <w:t xml:space="preserve"> to any two quantities that don’t commute. No microscope required. No disturbance required. It is a property of the wave, not a limit on the poking.</w:t>
       </w:r>
     </w:p>
     <w:p>
@@ -21473,7 +21680,19 @@
         </w:numPr>
       </w:pPr>
       <w:r>
-        <w:t>The redundancy test has a human version, and it fails in a famous way. A memory is not a photocopy kept in a drawer. Each time it is recalled it is rebuilt, and it can absorb whatever is in the room at the rebuilding. In 1974 Elizabeth Loftus and John Palmer showed people a film of a car accident and asked how fast the cars were going when they “smashed into” each other. A week later, those given “smashed” were more than twice as likely as those given “hit” to remember broken glass. The film showed none. When large numbers of people share the same memory of something that never happened, which is now called the Mandela effect after the widespread false memory that Nelson Mandela died in prison in the 1980s, the agreement is not a large R_δ. The memories share causes: the same misleading cue, the same retold story, one another. Three hundred and eighty-six signatures that compared notes are, by Zurek’s test, much nearer one witness than three hundred and eighty-six.</w:t>
+        <w:t xml:space="preserve">The redundancy test has a human version, and it fails in a famous way. A memory is not a photocopy kept in a drawer. Each time it is recalled it is rebuilt, and it can absorb whatever is in the room at the rebuilding. In 1974 </w:t>
+      </w:r>
+      <w:hyperlink w:anchor="bib_loftus1974" w:history="1">
+        <w:r>
+          <w:rPr>
+            <w:color w:val="0563C1"/>
+            <w:u w:val="single"/>
+          </w:rPr>
+          <w:t xml:space="preserve">Elizabeth Loftus and John Palmer</w:t>
+        </w:r>
+      </w:hyperlink>
+      <w:r>
+        <w:t xml:space="preserve"> showed people a film of a car accident and asked how fast the cars were going when they “smashed into” each other. A week later, those given “smashed” were more than twice as likely as those given “hit” to remember broken glass. The film showed none. When large numbers of people share the same memory of something that never happened, which is now called the Mandela effect after the widespread false memory that Nelson Mandela died in prison in the 1980s, the agreement is not a large R_δ. The memories share causes: the same misleading cue, the same retold story, one another. Three hundred and eighty-six signatures that compared notes are, by Zurek’s test, much nearer one witness than three hundred and eighty-six.</w:t>
       </w:r>
     </w:p>
     <w:p>
@@ -21628,7 +21847,19 @@
         <w:t>Wigner’s puzzle.</w:t>
       </w:r>
       <w:r>
-        <w:t xml:space="preserve"> In “The Unreasonable Effectiveness of Mathematics in the Natural Sciences” (1960), Eugene Wigner argued that the applicability of mathematics to physics is a miracle we have no right to expect: concepts developed for internal mathematical reasons repeatedly turn out to be the precise language of physical law discovered much later. His examples are genuine — complex numbers becoming the arithmetic of amplitudes, Riemannian geometry becoming gravitation, group representation theory becoming the classification of particles, a subject to which Wigner himself contributed decisively.</w:t>
+        <w:t xml:space="preserve"> In “</w:t>
+      </w:r>
+      <w:hyperlink w:anchor="bib_wigner1960" w:history="1">
+        <w:r>
+          <w:rPr>
+            <w:color w:val="0563C1"/>
+            <w:u w:val="single"/>
+          </w:rPr>
+          <w:t xml:space="preserve">The Unreasonable Effectiveness of Mathematics in the Natural Sciences</w:t>
+        </w:r>
+      </w:hyperlink>
+      <w:r>
+        <w:t xml:space="preserve">” (1960), Eugene Wigner argued that the applicability of mathematics to physics is a miracle we have no right to expect: concepts developed for internal mathematical reasons repeatedly turn out to be the precise language of physical law discovered much later. His examples are genuine — complex numbers becoming the arithmetic of amplitudes, Riemannian geometry becoming gravitation, group representation theory becoming the classification of particles, a subject to which Wigner himself contributed decisively.</w:t>
       </w:r>
     </w:p>
     <w:p>
@@ -21643,7 +21874,19 @@
         <w:t>The counter-case, which the chapter states fairly.</w:t>
       </w:r>
       <w:r>
-        <w:t xml:space="preserve"> Richard Hamming’s 1980 reply, under the same title, offered four partial deflations: we see what we look for; we select the mathematics that fits and discard the rest; science addresses only a small subset of possible questions; and human cognition was itself shaped by the physics it describes. To these the chapter adds the </w:t>
+        <w:t xml:space="preserve"> Richard </w:t>
+      </w:r>
+      <w:hyperlink w:anchor="bib_hamming1980" w:history="1">
+        <w:r>
+          <w:rPr>
+            <w:color w:val="0563C1"/>
+            <w:u w:val="single"/>
+          </w:rPr>
+          <w:t xml:space="preserve">Hamming’s 1980 reply</w:t>
+        </w:r>
+      </w:hyperlink>
+      <w:r>
+        <w:t xml:space="preserve">, under the same title, offered four partial deflations: we see what we look for; we select the mathematics that fits and discard the rest; science addresses only a small subset of possible questions; and human cognition was itself shaped by the physics it describes. To these the chapter adds the </w:t>
       </w:r>
       <w:r>
         <w:rPr>
@@ -21764,7 +22007,19 @@
         <w:t>.</w:t>
       </w:r>
       <w:r>
-        <w:t xml:space="preserve"> Popescu and Rohrlich showed in 1994 that a hypothetical device — the PR box — achieves 4 while remaining perfectly consistent with relativistic causality, since it permits no transmission of information. Relativity does not select the quantum value.</w:t>
+        <w:t xml:space="preserve"> </w:t>
+      </w:r>
+      <w:hyperlink w:anchor="bib_pr1994" w:history="1">
+        <w:r>
+          <w:rPr>
+            <w:color w:val="0563C1"/>
+            <w:u w:val="single"/>
+          </w:rPr>
+          <w:t xml:space="preserve">Popescu and Rohrlich</w:t>
+        </w:r>
+      </w:hyperlink>
+      <w:r>
+        <w:t xml:space="preserve"> showed in 1994 that a hypothetical device — the PR box — achieves 4 while remaining perfectly consistent with relativistic causality, since it permits no transmission of information. Relativity does not select the quantum value.</w:t>
       </w:r>
     </w:p>
     <w:p>
@@ -21899,7 +22154,19 @@
         <w:pStyle w:val="BodyText"/>
       </w:pPr>
       <w:r>
-        <w:t xml:space="preserve">There is no ∂/∂t, no external parameter, and the wavefunction of the universe is stationary. This is the “problem of time” in quantum gravity, and Barbour’s position — presented in The End of Time (1999) — is that it is not a </w:t>
+        <w:t xml:space="preserve">There is no ∂/∂t, no external parameter, and the wavefunction of the universe is stationary. This is the “problem of time” in quantum gravity, and Barbour’s position — presented in </w:t>
+      </w:r>
+      <w:hyperlink w:anchor="bib_barbour1999" w:history="1">
+        <w:r>
+          <w:rPr>
+            <w:color w:val="0563C1"/>
+            <w:u w:val="single"/>
+          </w:rPr>
+          <w:t xml:space="preserve">The End of Time</w:t>
+        </w:r>
+      </w:hyperlink>
+      <w:r>
+        <w:t xml:space="preserve"> (1999) — is that it is not a </w:t>
       </w:r>
       <w:r>
         <w:lastRenderedPageBreak/>
@@ -21938,7 +22205,19 @@
         <w:t>Two forms that will not combine.</w:t>
       </w:r>
       <w:r>
-        <w:t xml:space="preserve"> Quantum theory and general relativity have each passed every test put to them, and they are used together all the time. GPS corrects atomic clocks, which run on quantum transitions, for the time dilation of general relativity. Hawking’s 1974 calculation put quantum fields on the curved spacetime of a black hole and found that black holes radiate. This semiclassical method works wherever gravity can be treated as a fixed classical background. It fails only where quantum effects and strong curvature matter together, at a singularity or at the earliest instant, and that is where the Wheeler–DeWitt equation is needed and where nobody yet has a tested theory.</w:t>
+        <w:t xml:space="preserve"> Quantum theory and general relativity have each passed every test put to them, and they are used together all the time. GPS corrects atomic clocks, which run on quantum transitions, for the time dilation of general relativity. </w:t>
+      </w:r>
+      <w:hyperlink w:anchor="bib_hawking1974" w:history="1">
+        <w:r>
+          <w:rPr>
+            <w:color w:val="0563C1"/>
+            <w:u w:val="single"/>
+          </w:rPr>
+          <w:t xml:space="preserve">Hawking’s 1974 calculation</w:t>
+        </w:r>
+      </w:hyperlink>
+      <w:r>
+        <w:t xml:space="preserve"> put quantum fields on the curved spacetime of a black hole and found that black holes radiate. This semiclassical method works wherever gravity can be treated as a fixed classical background. It fails only where quantum effects and strong curvature matter together, at a singularity or at the earliest instant, and that is where the Wheeler–DeWitt equation is needed and where nobody yet has a tested theory.</w:t>
       </w:r>
     </w:p>
     <w:p>
@@ -21996,7 +22275,19 @@
         <w:t>information causality</w:t>
       </w:r>
       <w:r>
-        <w:t xml:space="preserve"> (Pawłowski et al., 2009), an axiom limiting how much one party can learn about another’s data given a bounded message. It recovers Tsirelson’s bound exactly and is widely admired — but it is an adopted principle, not a derived one. Eugenius’s objection is therefore precise rather than rhetorical: a compliance scheme that reads a high correlation score as evidence of held entanglement is secure only if superquantum correlations are unavailable, and their unavailability rests on an axiom whose status in an edited vacuum nobody has established.</w:t>
+        <w:t xml:space="preserve"> (</w:t>
+      </w:r>
+      <w:hyperlink w:anchor="bib_pawlowski2009" w:history="1">
+        <w:r>
+          <w:rPr>
+            <w:color w:val="0563C1"/>
+            <w:u w:val="single"/>
+          </w:rPr>
+          <w:t xml:space="preserve">Pawłowski et al., 2009</w:t>
+        </w:r>
+      </w:hyperlink>
+      <w:r>
+        <w:t xml:space="preserve">), an axiom limiting how much one party can learn about another’s data given a bounded message. It recovers Tsirelson’s bound exactly and is widely admired — but it is an adopted principle, not a derived one. Eugenius’s objection is therefore precise rather than rhetorical: a compliance scheme that reads a high correlation score as evidence of held entanglement is secure only if superquantum correlations are unavailable, and their unavailability rests on an axiom whose status in an edited vacuum nobody has established.</w:t>
       </w:r>
     </w:p>
     <w:p>
@@ -22103,13 +22394,17 @@
       <w:r>
         <w:t xml:space="preserve"> The </w:t>
       </w:r>
-      <w:r>
-        <w:rPr>
-          <w:b/>
-          <w:bCs/>
-        </w:rPr>
-        <w:t>Page–Wootters</w:t>
-      </w:r>
+      <w:hyperlink w:anchor="bib_pagewootters1983" w:history="1">
+        <w:r>
+          <w:rPr>
+            <w:b/>
+            <w:bCs/>
+            <w:color w:val="0563C1"/>
+            <w:u w:val="single"/>
+          </w:rPr>
+          <w:t xml:space="preserve">Page–Wootters</w:t>
+        </w:r>
+      </w:hyperlink>
       <w:r>
         <w:t xml:space="preserve"> construction (1983) shows how to recover ordinary dynamics from a globally stationary state: partition the system into a clock and a remainder, and consider the remainder’s state </w:t>
       </w:r>
@@ -22121,7 +22416,19 @@
         <w:t>conditioned</w:t>
       </w:r>
       <w:r>
-        <w:t xml:space="preserve"> on the clock reading t. That conditional state satisfies the standard Schrödinger equation exactly. Time emerges as entanglement between clock and world rather than as a background parameter, and the scheme has been demonstrated in photonic simulations (Moreva et al., 2014). Barbour’s metaphysics is contested; this mechanism is not.</w:t>
+        <w:t xml:space="preserve"> on the clock reading t. That conditional state satisfies the standard Schrödinger equation exactly. Time emerges as entanglement between clock and world rather than as a background parameter, and the scheme has been demonstrated in photonic simulations (</w:t>
+      </w:r>
+      <w:hyperlink w:anchor="bib_moreva2014" w:history="1">
+        <w:r>
+          <w:rPr>
+            <w:color w:val="0563C1"/>
+            <w:u w:val="single"/>
+          </w:rPr>
+          <w:t xml:space="preserve">Moreva et al., 2014</w:t>
+        </w:r>
+      </w:hyperlink>
+      <w:r>
+        <w:t xml:space="preserve">). Barbour’s metaphysics is contested; this mechanism is not.</w:t>
       </w:r>
     </w:p>
     <w:p>
@@ -22817,8 +23124,17 @@
           <w:numId w:val="16"/>
         </w:numPr>
       </w:pPr>
-      <w:r>
-        <w:t>Weinberg’s 1987 anthropic bound on vacuum energy anticipated the 1998 measurement within one to two orders of magnitude.</w:t>
+      <w:hyperlink w:anchor="bib_weinberg1987" w:history="1">
+        <w:r>
+          <w:rPr>
+            <w:color w:val="0563C1"/>
+            <w:u w:val="single"/>
+          </w:rPr>
+          <w:t xml:space="preserve">Weinberg’s 1987</w:t>
+        </w:r>
+      </w:hyperlink>
+      <w:r>
+        <w:t xml:space="preserve"> anthropic bound on vacuum energy anticipated the 1998 measurement within one to two orders of magnitude.</w:t>
       </w:r>
     </w:p>
     <w:p>
@@ -23075,8 +23391,55 @@
         <w:t xml:space="preserve"> Maxwell’s 1867 sorting intelligence appears to produce order </w:t>
       </w:r>
       <w:r>
-        <w:lastRenderedPageBreak/>
-        <w:t>without work. Szilard’s 1929 single-molecule engine sharpened it to a rate: k_BT ln 2 of work extractable per bit of information about which side the molecule is on. Landauer (1961) located the compensating cost — not in measurement, but in erasure: resetting one bit of memory dissipates at least k_BT ln 2. Bennett (1982) completed the argument by showing measurement can in principle be performed reversibly, so the demon’s books balance only when it clears its memory. The Landauer bound has since been measured directly in single-particle systems (Bérut et al., 2012), and the demon run in reverse to convert information into work at the predicted efficiency (Toyabe et al., 2010).</w:t>
+        <w:t xml:space="preserve">without work. </w:t>
+      </w:r>
+      <w:hyperlink w:anchor="bib_szilard1929" w:history="1">
+        <w:r>
+          <w:rPr>
+            <w:color w:val="0563C1"/>
+            <w:u w:val="single"/>
+          </w:rPr>
+          <w:t xml:space="preserve">Szilard’s 1929</w:t>
+        </w:r>
+      </w:hyperlink>
+      <w:r>
+        <w:t xml:space="preserve"> single-molecule engine sharpened it to a rate: k_BT ln 2 of work extractable per bit of information about which side the molecule is on. </w:t>
+      </w:r>
+      <w:hyperlink w:anchor="bib_landauer1961" w:history="1">
+        <w:r>
+          <w:rPr>
+            <w:color w:val="0563C1"/>
+            <w:u w:val="single"/>
+          </w:rPr>
+          <w:t xml:space="preserve">Landauer (1961)</w:t>
+        </w:r>
+      </w:hyperlink>
+      <w:r>
+        <w:t xml:space="preserve"> located the compensating cost — not in measurement, but in erasure: resetting one bit of memory dissipates at least k_BT ln 2. </w:t>
+      </w:r>
+      <w:hyperlink w:anchor="bib_bennett1982" w:history="1">
+        <w:r>
+          <w:rPr>
+            <w:color w:val="0563C1"/>
+            <w:u w:val="single"/>
+          </w:rPr>
+          <w:t xml:space="preserve">Bennett (1982)</w:t>
+        </w:r>
+      </w:hyperlink>
+      <w:r>
+        <w:t xml:space="preserve"> completed the argument by showing measurement can in principle be performed reversibly, so the demon’s books balance only when it clears its memory. The Landauer bound has since been measured directly in single-particle systems (</w:t>
+      </w:r>
+      <w:hyperlink w:anchor="bib_berut2012" w:history="1">
+        <w:r>
+          <w:rPr>
+            <w:color w:val="0563C1"/>
+            <w:u w:val="single"/>
+          </w:rPr>
+          <w:t xml:space="preserve">Bérut et al., 2012</w:t>
+        </w:r>
+      </w:hyperlink>
+      <w:r>
+        <w:t xml:space="preserve">), and the demon run in reverse to convert information into work at the predicted efficiency (Toyabe et al., 2010).</w:t>
       </w:r>
     </w:p>
     <w:p>
@@ -23371,7 +23734,19 @@
         <w:t>Kochen–Specker.</w:t>
       </w:r>
       <w:r>
-        <w:t xml:space="preserve"> Kochen and Specker (building on Gleason and on an argument of Bell’s from 1966) proved that it is impossible to assign definite, pre-existing values to all quantum observables simultaneously in a way that respects their algebraic relations — specifically, that preserves functional relationships among commuting observables. The result is:</w:t>
+        <w:t xml:space="preserve"> </w:t>
+      </w:r>
+      <w:hyperlink w:anchor="bib_ks1967" w:history="1">
+        <w:r>
+          <w:rPr>
+            <w:color w:val="0563C1"/>
+            <w:u w:val="single"/>
+          </w:rPr>
+          <w:t xml:space="preserve">Kochen and Specker</w:t>
+        </w:r>
+      </w:hyperlink>
+      <w:r>
+        <w:t xml:space="preserve"> (building on Gleason and on an argument of Bell’s from 1966) proved that it is impossible to assign definite, pre-existing values to all quantum observables simultaneously in a way that respects their algebraic relations — specifically, that preserves functional relationships among commuting observables. The result is:</w:t>
       </w:r>
     </w:p>
     <w:p>
@@ -23478,7 +23853,19 @@
         <w:t>The Esaki (tunnel) diode.</w:t>
       </w:r>
       <w:r>
-        <w:t xml:space="preserve"> (Dr Arakawa is invented; the diode, its date and its inventor are not.) Leo Esaki, working at Sony (then Tokyo Tsushin Kogyo) in 1957, discovered that in an extremely heavily doped p-n junction — with a depletion region only a few nanometres wide — the forward current first rises, then falls as the voltage increases: a region of negative differential resistance that no thermionic or diffusion mechanism predicts. (The same junctions also conduct strongly under small reverse bias.) He correctly identified the cause as quantum mechanical tunnelling of electrons through the narrow potential barrier of the junction, with the current falling once the filled states on one side no longer line up with empty states on the other, work for which he shared the 1973 Nobel Prize in Physics with Ivar Giaever and Brian Josephson. Tunnel diodes remain in use for high-frequency oscillators and detectors precisely because tunnelling is a fast, direct quantum process with no classical transit time in the barrier region.</w:t>
+        <w:t xml:space="preserve"> (Dr Arakawa is invented; the diode, its date and its inventor are not.) </w:t>
+      </w:r>
+      <w:hyperlink w:anchor="bib_esaki1958" w:history="1">
+        <w:r>
+          <w:rPr>
+            <w:color w:val="0563C1"/>
+            <w:u w:val="single"/>
+          </w:rPr>
+          <w:t xml:space="preserve">Leo Esaki</w:t>
+        </w:r>
+      </w:hyperlink>
+      <w:r>
+        <w:t xml:space="preserve">, working at Sony (then Tokyo Tsushin Kogyo) in 1957, discovered that in an extremely heavily doped p-n junction — with a depletion region only a few nanometres wide — the forward current first rises, then falls as the voltage increases: a region of negative differential resistance that no thermionic or diffusion mechanism predicts. (The same junctions also conduct strongly under small reverse bias.) He correctly identified the cause as quantum mechanical tunnelling of electrons through the narrow potential barrier of the junction, with the current falling once the filled states on one side no longer line up with empty states on the other, work for which he shared the 1973 Nobel Prize in Physics with Ivar Giaever and Brian Josephson. Tunnel diodes remain in use for high-frequency oscillators and detectors precisely because tunnelling is a fast, direct quantum process with no classical transit time in the barrier region.</w:t>
       </w:r>
     </w:p>
     <w:p>
@@ -23893,7 +24280,19 @@
         <w:t>Schwarzschild’s actual history.</w:t>
       </w:r>
       <w:r>
-        <w:t xml:space="preserve"> Karl Schwarzschild, an astronomer serving as a German artillery lieutenant on the Eastern Front, found the first exact solution to Einstein’s field equations in December 1915, for the spacetime around a single non-rotating point mass — remarkable because Einstein himself had only produced an approximate solution weeks earlier. Schwarzschild sent his paper to Einstein, who presented it to the Prussian Academy of Sciences on his behalf. Schwarzschild died in May 1916 of pemphigus, an autoimmune disease, contracted at the front, having continued working on relativity between military duties until close to the end. The chapter’s device — a second, unsent portion of the correspondence — is invention; the man, the timeline, the disease, and the astonishing speed of the result are historical.</w:t>
+        <w:t xml:space="preserve"> Karl Schwarzschild, an astronomer serving as a German artillery lieutenant on the Eastern Front, found the </w:t>
+      </w:r>
+      <w:hyperlink w:anchor="bib_schwarzschild1916" w:history="1">
+        <w:r>
+          <w:rPr>
+            <w:color w:val="0563C1"/>
+            <w:u w:val="single"/>
+          </w:rPr>
+          <w:t xml:space="preserve">first exact solution to Einstein’s field equations</w:t>
+        </w:r>
+      </w:hyperlink>
+      <w:r>
+        <w:t xml:space="preserve"> in December 1915, for the spacetime around a single non-rotating point mass — remarkable because Einstein himself had only produced an approximate solution weeks earlier. Schwarzschild sent his paper to Einstein, who presented it to the Prussian Academy of Sciences on his behalf. Schwarzschild died in May 1916 of pemphigus, an autoimmune disease, contracted at the front, having continued working on relativity between military duties until close to the end. The chapter’s device — a second, unsent portion of the correspondence — is invention; the man, the timeline, the disease, and the astonishing speed of the result are historical.</w:t>
       </w:r>
     </w:p>
     <w:p>
@@ -23908,7 +24307,43 @@
         <w:t>What the solution actually contains.</w:t>
       </w:r>
       <w:r>
-        <w:t xml:space="preserve"> The Schwarzschild metric, in its original coordinates, appears to have a singularity at the Schwarzschild radius r_s = 2GM/c². This is a coordinate artefact, not a physical one — resolved by better coordinate choices (Eddington–Finkelstein, and fully by Kruskal and Szekeres independently in 1960). The maximally extended solution reveals the true global structure: two separate asymptotically flat regions, connected by a throat, joined at a single moment of symmetry. This is the Einstein–Rosen bridge, named for Einstein and Nathan Rosen’s 1935 paper recognising the same structure while attempting (unsuccessfully) to model particles as bridges. It is popularly called a wormhole.</w:t>
+        <w:t xml:space="preserve"> The Schwarzschild metric, in its original coordinates, appears to have a singularity at the Schwarzschild radius r_s = 2GM/c². This is a coordinate artefact, not a physical one — resolved by better coordinate choices (Eddington–Finkelstein, and fully by </w:t>
+      </w:r>
+      <w:hyperlink w:anchor="bib_kruskal1960" w:history="1">
+        <w:r>
+          <w:rPr>
+            <w:color w:val="0563C1"/>
+            <w:u w:val="single"/>
+          </w:rPr>
+          <w:t xml:space="preserve">Kruskal</w:t>
+        </w:r>
+      </w:hyperlink>
+      <w:r>
+        <w:t xml:space="preserve"> and </w:t>
+      </w:r>
+      <w:hyperlink w:anchor="bib_szekeres1960" w:history="1">
+        <w:r>
+          <w:rPr>
+            <w:color w:val="0563C1"/>
+            <w:u w:val="single"/>
+          </w:rPr>
+          <w:t xml:space="preserve">Szekeres</w:t>
+        </w:r>
+      </w:hyperlink>
+      <w:r>
+        <w:t xml:space="preserve"> independently in 1960). The maximally extended solution reveals the true global structure: two separate asymptotically flat regions, connected by a throat, joined at a single moment of symmetry. This is the Einstein–Rosen bridge, named for Einstein and </w:t>
+      </w:r>
+      <w:hyperlink w:anchor="bib_er1935" w:history="1">
+        <w:r>
+          <w:rPr>
+            <w:color w:val="0563C1"/>
+            <w:u w:val="single"/>
+          </w:rPr>
+          <w:t xml:space="preserve">Nathan Rosen’s 1935 paper</w:t>
+        </w:r>
+      </w:hyperlink>
+      <w:r>
+        <w:t xml:space="preserve"> recognising the same structure while attempting (unsuccessfully) to model particles as bridges. It is popularly called a wormhole.</w:t>
       </w:r>
     </w:p>
     <w:p>
@@ -23924,7 +24359,19 @@
         <w:t>Why it cannot be used.</w:t>
       </w:r>
       <w:r>
-        <w:t xml:space="preserve"> The Kruskal extension shows the throat pinching closed in a finite proper time, faster than any signal — let alone any traveller — could cross from one side to the other. The classical, uncharged, non-rotating Einstein–Rosen bridge is a genuine feature of the solved equations and is, simultaneously, provably non-traversable: it closes before anything gets through. This has been understood since Fuller and Wheeler’s 1962 analysis.</w:t>
+        <w:t xml:space="preserve"> The Kruskal extension shows the throat pinching closed in a finite proper time, faster than any signal — let alone any traveller — could cross from one side to the other. The classical, uncharged, non-rotating Einstein–Rosen bridge is a genuine feature of the solved equations and is, simultaneously, provably non-traversable: it closes before anything gets through. This has been understood since </w:t>
+      </w:r>
+      <w:hyperlink w:anchor="bib_fuller1962" w:history="1">
+        <w:r>
+          <w:rPr>
+            <w:color w:val="0563C1"/>
+            <w:u w:val="single"/>
+          </w:rPr>
+          <w:t xml:space="preserve">Fuller and Wheeler’s 1962 analysis</w:t>
+        </w:r>
+      </w:hyperlink>
+      <w:r>
+        <w:t xml:space="preserve">.</w:t>
       </w:r>
     </w:p>
     <w:p>
@@ -24115,7 +24562,31 @@
         <w:t>Measuring the Casimir force.</w:t>
       </w:r>
       <w:r>
-        <w:t xml:space="preserve"> For two ideal parallel mirrors a distance d apart, the Casimir pressure is π²ħc / (240 d⁴). At one micrometre that is about 1.3 millipascals, so a square centimetre of plate feels roughly a ten-millionth of a newton. Casimir predicted it in 1948. The first convincing measurements came half a century later: Lamoreaux (1997) used a torsion pendulum with a sphere and a plate between about 0.6 and 6 micrometres; Mohideen and Roy (1998) used an atomic-force microscope; Bressi and colleagues (2002) managed the much harder parallel-plate geometry. Real plates need corrections for finite conductivity, temperature and surface roughness, each worth a few per cent at these gaps.</w:t>
+        <w:t xml:space="preserve"> For two ideal parallel mirrors a distance d apart, the Casimir pressure is π²ħc / (240 d⁴). At one micrometre that is about 1.3 millipascals, so a square centimetre of plate feels roughly a ten-millionth of a newton. Casimir predicted it in 1948. The first convincing measurements came half a century later: Lamoreaux (1997) used a torsion pendulum with a sphere and a plate between about 0.6 and 6 micrometres; </w:t>
+      </w:r>
+      <w:hyperlink w:anchor="bib_mohideen1998" w:history="1">
+        <w:r>
+          <w:rPr>
+            <w:color w:val="0563C1"/>
+            <w:u w:val="single"/>
+          </w:rPr>
+          <w:t xml:space="preserve">Mohideen and Roy</w:t>
+        </w:r>
+      </w:hyperlink>
+      <w:r>
+        <w:t xml:space="preserve"> (1998) used an atomic-force microscope; </w:t>
+      </w:r>
+      <w:hyperlink w:anchor="bib_bressi2002" w:history="1">
+        <w:r>
+          <w:rPr>
+            <w:color w:val="0563C1"/>
+            <w:u w:val="single"/>
+          </w:rPr>
+          <w:t xml:space="preserve">Bressi and colleagues (2002)</w:t>
+        </w:r>
+      </w:hyperlink>
+      <w:r>
+        <w:t xml:space="preserve"> managed the much harder parallel-plate geometry. Real plates need corrections for finite conductivity, temperature and surface roughness, each worth a few per cent at these gaps.</w:t>
       </w:r>
     </w:p>
     <w:p>
@@ -24380,8 +24851,19 @@
         <w:t xml:space="preserve"> Miss Pike’s ledger is what computer scientists call an append-only or write-once record. Entries can </w:t>
       </w:r>
       <w:r>
-        <w:lastRenderedPageBreak/>
-        <w:t>be added and never changed, so its value as evidence comes from the fact that nobody can edit it afterwards, its keeper included. Modern versions chain each entry to a cryptographic hash of the one before, so that altering any entry breaks every later link; Certificate Transparency, the public log of web security certificates (RFC 6962, 2013), works this way. A bound book in ink is the same idea with a worse search function. The ledger, Jago’s docket and Tengelman’s letter are also three records held by people who never coordinated, which is Chapter Ten’s redundancy test turned round and applied to the Office.</w:t>
+        <w:t xml:space="preserve">be added and never changed, so its value as evidence comes from the fact that nobody can edit it afterwards, its keeper included. Modern versions chain each entry to a cryptographic hash of the one before, so that altering any entry breaks every later link; Certificate Transparency, the public log of web security certificates (</w:t>
+      </w:r>
+      <w:hyperlink w:anchor="bib_rfc6962" w:history="1">
+        <w:r>
+          <w:rPr>
+            <w:color w:val="0563C1"/>
+            <w:u w:val="single"/>
+          </w:rPr>
+          <w:t xml:space="preserve">RFC 6962</w:t>
+        </w:r>
+      </w:hyperlink>
+      <w:r>
+        <w:t xml:space="preserve">, 2013), works this way. A bound book in ink is the same idea with a worse search function. The ledger, Jago’s docket and Tengelman’s letter are also three records held by people who never coordinated, which is Chapter Ten’s redundancy test turned round and applied to the Office.</w:t>
       </w:r>
     </w:p>
     <w:p>
@@ -24870,18 +25352,23 @@
         <w:spacing w:after="120"/>
         <w:ind w:firstLine="0"/>
       </w:pPr>
-      <w:r>
-        <w:t xml:space="preserve">Almheiri, A., Marolf, D., Polchinski, J., and Sully, J. (2012). Black holes: complementarity or firewalls? </w:t>
-      </w:r>
-      <w:hyperlink r:id="rId7">
+      <w:bookmarkStart w:id="800004" w:name="bib_amps2012"/>
+      <w:r>
+        <w:t xml:space="preserve">Almheiri, A., Marolf, D., Polchinski, J., and Sully, J. (2012). </w:t>
+      </w:r>
+      <w:hyperlink r:id="rId7" w:history="1">
         <w:r>
           <w:rPr>
             <w:color w:val="0563C1"/>
             <w:u w:val="single"/>
           </w:rPr>
-          <w:t>arXiv:1207.3123</w:t>
+          <w:t xml:space="preserve">Black holes: complementarity or firewalls?</w:t>
         </w:r>
       </w:hyperlink>
+      <w:r>
+        <w:t xml:space="preserve"> Journal of High Energy Physics, 2013, 62; preprint 2012.</w:t>
+      </w:r>
+      <w:bookmarkEnd w:id="800004"/>
     </w:p>
     <w:p>
       <w:pPr>
@@ -24889,14 +25376,149 @@
         <w:spacing w:after="120"/>
         <w:ind w:firstLine="0"/>
       </w:pPr>
-      <w:r>
-        <w:t>Casimir, H. B. G. (1948). On the attraction between two perfectly conducting plates. Proceedings of the Koninklijke Nederlandse Akademie van Wetenschappen B51, 793–795.</w:t>
-      </w:r>
-    </w:p>
-    <w:p>
-      <w:pPr>
-        <w:pStyle w:val="BodyText"/>
-      </w:pPr>
+      <w:bookmarkStart w:id="800022" w:name="bib_barbour1999"/>
+      <w:r>
+        <w:t xml:space="preserve">Barbour, J. (1999). </w:t>
+      </w:r>
+      <w:hyperlink r:id="rId26" w:history="1">
+        <w:r>
+          <w:rPr>
+            <w:color w:val="0563C1"/>
+            <w:u w:val="single"/>
+          </w:rPr>
+          <w:t xml:space="preserve">The End of Time</w:t>
+        </w:r>
+      </w:hyperlink>
+      <w:r>
+        <w:t xml:space="preserve">. Weidenfeld &amp; Nicolson.</w:t>
+      </w:r>
+      <w:bookmarkEnd w:id="800022"/>
+    </w:p>
+    <w:p>
+      <w:pPr>
+        <w:pStyle w:val="BodyText"/>
+        <w:spacing w:after="120"/>
+        <w:ind w:firstLine="0"/>
+      </w:pPr>
+      <w:bookmarkStart w:id="800023" w:name="bib_bekenstein1972"/>
+      <w:r>
+        <w:t xml:space="preserve">Bekenstein, J. D. (1972). </w:t>
+      </w:r>
+      <w:hyperlink r:id="rId27" w:history="1">
+        <w:r>
+          <w:rPr>
+            <w:color w:val="0563C1"/>
+            <w:u w:val="single"/>
+          </w:rPr>
+          <w:t xml:space="preserve">Black holes and the second law</w:t>
+        </w:r>
+      </w:hyperlink>
+      <w:r>
+        <w:t xml:space="preserve">. Lettere al Nuovo Cimento 4, 737–740.</w:t>
+      </w:r>
+      <w:bookmarkEnd w:id="800023"/>
+    </w:p>
+    <w:p>
+      <w:pPr>
+        <w:pStyle w:val="BodyText"/>
+        <w:spacing w:after="120"/>
+        <w:ind w:firstLine="0"/>
+      </w:pPr>
+      <w:bookmarkStart w:id="800024" w:name="bib_bennett1982"/>
+      <w:r>
+        <w:t xml:space="preserve">Bennett, C. H. (1982). </w:t>
+      </w:r>
+      <w:hyperlink r:id="rId28" w:history="1">
+        <w:r>
+          <w:rPr>
+            <w:color w:val="0563C1"/>
+            <w:u w:val="single"/>
+          </w:rPr>
+          <w:t xml:space="preserve">The thermodynamics of computation: a review</w:t>
+        </w:r>
+      </w:hyperlink>
+      <w:r>
+        <w:t xml:space="preserve">. International Journal of Theoretical Physics 21, 905–940.</w:t>
+      </w:r>
+      <w:bookmarkEnd w:id="800024"/>
+    </w:p>
+    <w:p>
+      <w:pPr>
+        <w:pStyle w:val="BodyText"/>
+        <w:spacing w:after="120"/>
+        <w:ind w:firstLine="0"/>
+      </w:pPr>
+      <w:bookmarkStart w:id="800025" w:name="bib_berut2012"/>
+      <w:r>
+        <w:t xml:space="preserve">Bérut, A., Arakelyan, A., Petrosyan, A., Ciliberto, S., Dillenschneider, R., and Lutz, E. (2012). </w:t>
+      </w:r>
+      <w:hyperlink r:id="rId29" w:history="1">
+        <w:r>
+          <w:rPr>
+            <w:color w:val="0563C1"/>
+            <w:u w:val="single"/>
+          </w:rPr>
+          <w:t xml:space="preserve">Experimental verification of Landauer’s principle linking information and thermodynamics</w:t>
+        </w:r>
+      </w:hyperlink>
+      <w:r>
+        <w:t xml:space="preserve">. Nature 483, 187–189.</w:t>
+      </w:r>
+      <w:bookmarkEnd w:id="800025"/>
+    </w:p>
+    <w:p>
+      <w:pPr>
+        <w:pStyle w:val="BodyText"/>
+        <w:spacing w:after="120"/>
+        <w:ind w:firstLine="0"/>
+      </w:pPr>
+      <w:bookmarkStart w:id="800026" w:name="bib_bressi2002"/>
+      <w:r>
+        <w:t xml:space="preserve">Bressi, G., Carugno, G., Onofrio, R., and Ruoso, G. (2002). </w:t>
+      </w:r>
+      <w:hyperlink r:id="rId30" w:history="1">
+        <w:r>
+          <w:rPr>
+            <w:color w:val="0563C1"/>
+            <w:u w:val="single"/>
+          </w:rPr>
+          <w:t xml:space="preserve">Measurement of the Casimir force between parallel metallic surfaces</w:t>
+        </w:r>
+      </w:hyperlink>
+      <w:r>
+        <w:t xml:space="preserve">. Physical Review Letters 88, 041804.</w:t>
+      </w:r>
+      <w:bookmarkEnd w:id="800026"/>
+    </w:p>
+    <w:p>
+      <w:pPr>
+        <w:pStyle w:val="BodyText"/>
+        <w:spacing w:after="120"/>
+        <w:ind w:firstLine="0"/>
+      </w:pPr>
+      <w:bookmarkStart w:id="800005" w:name="bib_casimir1948"/>
+      <w:r>
+        <w:t xml:space="preserve">Casimir, H. B. G. (1948). </w:t>
+      </w:r>
+      <w:hyperlink r:id="rId18" w:history="1">
+        <w:r>
+          <w:rPr>
+            <w:color w:val="0563C1"/>
+            <w:u w:val="single"/>
+          </w:rPr>
+          <w:t xml:space="preserve">On the attraction between two perfectly conducting plates</w:t>
+        </w:r>
+      </w:hyperlink>
+      <w:r>
+        <w:t xml:space="preserve">. Proceedings of the Koninklijke Nederlandse Akademie van Wetenschappen B51, 793–795.</w:t>
+      </w:r>
+      <w:bookmarkEnd w:id="800005"/>
+    </w:p>
+    <w:p>
+      <w:pPr>
+        <w:pStyle w:val="BodyText"/>
+      </w:pPr>
+      <w:bookmarkStart w:id="800006" w:name="bib_coleman1980"/>
       <w:r>
         <w:t xml:space="preserve">Coleman, S., and De Luccia, F. (1980). </w:t>
       </w:r>
@@ -24912,6 +25534,7 @@
       <w:r>
         <w:t>. Physical Review D 21, 3305–3315.</w:t>
       </w:r>
+      <w:bookmarkEnd w:id="800006"/>
     </w:p>
     <w:p>
       <w:pPr>
@@ -24919,9 +25542,23 @@
         <w:spacing w:after="120"/>
         <w:ind w:firstLine="0"/>
       </w:pPr>
-      <w:r>
-        <w:t>Einstein, A. Letter to Max Born, 4 December 1926. Published in The Born–Einstein Letters.</w:t>
-      </w:r>
+      <w:bookmarkStart w:id="800027" w:name="bib_cubitt2015"/>
+      <w:r>
+        <w:t xml:space="preserve">Cubitt, T. S., Pérez-García, D., and Wolf, M. M. (2015). </w:t>
+      </w:r>
+      <w:hyperlink r:id="rId31" w:history="1">
+        <w:r>
+          <w:rPr>
+            <w:color w:val="0563C1"/>
+            <w:u w:val="single"/>
+          </w:rPr>
+          <w:t xml:space="preserve">Undecidability of the spectral gap</w:t>
+        </w:r>
+      </w:hyperlink>
+      <w:r>
+        <w:t xml:space="preserve">. Nature 528, 207–211.</w:t>
+      </w:r>
+      <w:bookmarkEnd w:id="800027"/>
     </w:p>
     <w:p>
       <w:pPr>
@@ -24929,6 +25566,55 @@
         <w:spacing w:after="120"/>
         <w:ind w:firstLine="0"/>
       </w:pPr>
+      <w:bookmarkStart w:id="800007" w:name="bib_einstein1926"/>
+      <w:r>
+        <w:t xml:space="preserve">Einstein, A. Letter to Max Born, 4 December 1926. Published in </w:t>
+      </w:r>
+      <w:hyperlink r:id="rId19" w:history="1">
+        <w:r>
+          <w:rPr>
+            <w:color w:val="0563C1"/>
+            <w:u w:val="single"/>
+          </w:rPr>
+          <w:t xml:space="preserve">The Born–Einstein Letters</w:t>
+        </w:r>
+      </w:hyperlink>
+      <w:r>
+        <w:t xml:space="preserve">.</w:t>
+      </w:r>
+      <w:bookmarkEnd w:id="800007"/>
+    </w:p>
+    <w:p>
+      <w:pPr>
+        <w:pStyle w:val="BodyText"/>
+        <w:spacing w:after="120"/>
+        <w:ind w:firstLine="0"/>
+      </w:pPr>
+      <w:bookmarkStart w:id="800028" w:name="bib_er1935"/>
+      <w:r>
+        <w:t xml:space="preserve">Einstein, A., and Rosen, N. (1935). </w:t>
+      </w:r>
+      <w:hyperlink r:id="rId32" w:history="1">
+        <w:r>
+          <w:rPr>
+            <w:color w:val="0563C1"/>
+            <w:u w:val="single"/>
+          </w:rPr>
+          <w:t xml:space="preserve">The particle problem in the general theory of relativity</w:t>
+        </w:r>
+      </w:hyperlink>
+      <w:r>
+        <w:t xml:space="preserve">. Physical Review 48, 73–77.</w:t>
+      </w:r>
+      <w:bookmarkEnd w:id="800028"/>
+    </w:p>
+    <w:p>
+      <w:pPr>
+        <w:pStyle w:val="BodyText"/>
+        <w:spacing w:after="120"/>
+        <w:ind w:firstLine="0"/>
+      </w:pPr>
+      <w:bookmarkStart w:id="800008" w:name="bib_epr1935"/>
       <w:r>
         <w:t xml:space="preserve">Einstein, A., Podolsky, B., and Rosen, N. (1935). </w:t>
       </w:r>
@@ -24944,11 +25630,13 @@
       <w:r>
         <w:t xml:space="preserve"> Physical Review 47, 777–780.</w:t>
       </w:r>
-    </w:p>
-    <w:p>
-      <w:pPr>
-        <w:pStyle w:val="BodyText"/>
-      </w:pPr>
+      <w:bookmarkEnd w:id="800008"/>
+    </w:p>
+    <w:p>
+      <w:pPr>
+        <w:pStyle w:val="BodyText"/>
+      </w:pPr>
+      <w:bookmarkStart w:id="800009" w:name="bib_esaki1958"/>
       <w:r>
         <w:t xml:space="preserve">Esaki, L. (1958). </w:t>
       </w:r>
@@ -24964,6 +25652,7 @@
       <w:r>
         <w:t>. Physical Review 109, 603–604.</w:t>
       </w:r>
+      <w:bookmarkEnd w:id="800009"/>
     </w:p>
     <w:p>
       <w:pPr>
@@ -24995,6 +25684,7 @@
         <w:spacing w:after="120"/>
         <w:ind w:firstLine="0"/>
       </w:pPr>
+      <w:bookmarkStart w:id="800010" w:name="bib_fuller1962"/>
       <w:r>
         <w:t xml:space="preserve">Fuller, R. W., and Wheeler, J. A. (1962). </w:t>
       </w:r>
@@ -25010,6 +25700,7 @@
       <w:r>
         <w:t>. Physical Review 128, 919–929.</w:t>
       </w:r>
+      <w:bookmarkEnd w:id="800010"/>
     </w:p>
     <w:p>
       <w:pPr>
@@ -25017,9 +25708,23 @@
         <w:spacing w:after="120"/>
         <w:ind w:firstLine="0"/>
       </w:pPr>
-      <w:r>
-        <w:t>Gödel, K. (1931). On formally undecidable propositions of Principia Mathematica and related systems. Monatshefte für Mathematik und Physik 38, 173–198.</w:t>
-      </w:r>
+      <w:bookmarkStart w:id="800011" w:name="bib_godel1931"/>
+      <w:r>
+        <w:t xml:space="preserve">Gödel, K. (1931). </w:t>
+      </w:r>
+      <w:hyperlink r:id="rId20" w:history="1">
+        <w:r>
+          <w:rPr>
+            <w:color w:val="0563C1"/>
+            <w:u w:val="single"/>
+          </w:rPr>
+          <w:t xml:space="preserve">On formally undecidable propositions of Principia Mathematica and related systems</w:t>
+        </w:r>
+      </w:hyperlink>
+      <w:r>
+        <w:t xml:space="preserve">. Monatshefte für Mathematik und Physik 38, 173–198.</w:t>
+      </w:r>
+      <w:bookmarkEnd w:id="800011"/>
     </w:p>
     <w:p>
       <w:pPr>
@@ -25027,9 +25732,23 @@
         <w:spacing w:after="120"/>
         <w:ind w:firstLine="0"/>
       </w:pPr>
-      <w:r>
-        <w:t>Hamming, R. W. (1980). The unreasonable effectiveness of mathematics. The American Mathematical Monthly 87, 81–90.</w:t>
-      </w:r>
+      <w:bookmarkStart w:id="800012" w:name="bib_hamming1980"/>
+      <w:r>
+        <w:t xml:space="preserve">Hamming, R. W. (1980). </w:t>
+      </w:r>
+      <w:hyperlink r:id="rId21" w:history="1">
+        <w:r>
+          <w:rPr>
+            <w:color w:val="0563C1"/>
+            <w:u w:val="single"/>
+          </w:rPr>
+          <w:t xml:space="preserve">The unreasonable effectiveness of mathematics</w:t>
+        </w:r>
+      </w:hyperlink>
+      <w:r>
+        <w:t xml:space="preserve">. The American Mathematical Monthly 87, 81–90.</w:t>
+      </w:r>
+      <w:bookmarkEnd w:id="800012"/>
     </w:p>
     <w:p>
       <w:pPr>
@@ -25037,10 +25756,23 @@
         <w:spacing w:after="120"/>
         <w:ind w:firstLine="0"/>
       </w:pPr>
-      <w:r>
-        <w:lastRenderedPageBreak/>
-        <w:t>Hofstadter, D. (1979). Gödel, Escher, Bach: an Eternal Golden Braid. Basic Books.</w:t>
-      </w:r>
+      <w:bookmarkStart w:id="800029" w:name="bib_hawking1974"/>
+      <w:r>
+        <w:t xml:space="preserve">Hawking, S. W. (1974). </w:t>
+      </w:r>
+      <w:hyperlink r:id="rId33" w:history="1">
+        <w:r>
+          <w:rPr>
+            <w:color w:val="0563C1"/>
+            <w:u w:val="single"/>
+          </w:rPr>
+          <w:t xml:space="preserve">Black hole explosions?</w:t>
+        </w:r>
+      </w:hyperlink>
+      <w:r>
+        <w:t xml:space="preserve"> Nature 248, 30–31.</w:t>
+      </w:r>
+      <w:bookmarkEnd w:id="800029"/>
     </w:p>
     <w:p>
       <w:pPr>
@@ -25048,9 +25780,23 @@
         <w:spacing w:after="120"/>
         <w:ind w:firstLine="0"/>
       </w:pPr>
-      <w:r>
-        <w:t>Kruskal, M. D. (1960). Maximal extension of Schwarzschild metric. Physical Review 119, 1743–1745.</w:t>
-      </w:r>
+      <w:bookmarkStart w:id="800013" w:name="bib_hofstadter1979"/>
+      <w:r>
+        <w:t xml:space="preserve">Hofstadter, D. (1979). </w:t>
+      </w:r>
+      <w:hyperlink r:id="rId22" w:history="1">
+        <w:r>
+          <w:rPr>
+            <w:color w:val="0563C1"/>
+            <w:u w:val="single"/>
+          </w:rPr>
+          <w:t xml:space="preserve">Gödel, Escher, Bach: an Eternal Golden Braid</w:t>
+        </w:r>
+      </w:hyperlink>
+      <w:r>
+        <w:t xml:space="preserve">. Basic Books.</w:t>
+      </w:r>
+      <w:bookmarkEnd w:id="800013"/>
     </w:p>
     <w:p>
       <w:pPr>
@@ -25058,6 +25804,79 @@
         <w:spacing w:after="120"/>
         <w:ind w:firstLine="0"/>
       </w:pPr>
+      <w:bookmarkStart w:id="800030" w:name="bib_ji2020"/>
+      <w:r>
+        <w:t xml:space="preserve">Ji, Z., Natarajan, A., Vidick, T., Wright, J., and Yuen, H. (2020). </w:t>
+      </w:r>
+      <w:hyperlink r:id="rId34" w:history="1">
+        <w:r>
+          <w:rPr>
+            <w:color w:val="0563C1"/>
+            <w:u w:val="single"/>
+          </w:rPr>
+          <w:t xml:space="preserve">MIP* = RE</w:t>
+        </w:r>
+      </w:hyperlink>
+      <w:r>
+        <w:t xml:space="preserve">. Preprint.</w:t>
+      </w:r>
+      <w:bookmarkEnd w:id="800030"/>
+    </w:p>
+    <w:p>
+      <w:pPr>
+        <w:pStyle w:val="BodyText"/>
+        <w:spacing w:after="120"/>
+        <w:ind w:firstLine="0"/>
+      </w:pPr>
+      <w:bookmarkStart w:id="800031" w:name="bib_ks1967"/>
+      <w:r>
+        <w:t xml:space="preserve">Kochen, S., and Specker, E. P. (1967). </w:t>
+      </w:r>
+      <w:hyperlink r:id="rId35" w:history="1">
+        <w:r>
+          <w:rPr>
+            <w:color w:val="0563C1"/>
+            <w:u w:val="single"/>
+          </w:rPr>
+          <w:t xml:space="preserve">The problem of hidden variables in quantum mechanics</w:t>
+        </w:r>
+      </w:hyperlink>
+      <w:r>
+        <w:t xml:space="preserve">. Journal of Mathematics and Mechanics 17, 59–87.</w:t>
+      </w:r>
+      <w:bookmarkEnd w:id="800031"/>
+    </w:p>
+    <w:p>
+      <w:pPr>
+        <w:pStyle w:val="BodyText"/>
+        <w:spacing w:after="120"/>
+        <w:ind w:firstLine="0"/>
+      </w:pPr>
+      <w:bookmarkStart w:id="800014" w:name="bib_kruskal1960"/>
+      <w:r>
+        <w:t xml:space="preserve">Kruskal, M. D. (1960). </w:t>
+      </w:r>
+      <w:hyperlink r:id="rId23" w:history="1">
+        <w:r>
+          <w:rPr>
+            <w:color w:val="0563C1"/>
+            <w:u w:val="single"/>
+          </w:rPr>
+          <w:t xml:space="preserve">Maximal extension of Schwarzschild metric</w:t>
+        </w:r>
+      </w:hyperlink>
+      <w:r>
+        <w:t xml:space="preserve">. Physical Review 119, 1743–1745.</w:t>
+      </w:r>
+      <w:bookmarkEnd w:id="800014"/>
+    </w:p>
+    <w:p>
+      <w:pPr>
+        <w:pStyle w:val="BodyText"/>
+        <w:spacing w:after="120"/>
+        <w:ind w:firstLine="0"/>
+      </w:pPr>
+      <w:bookmarkStart w:id="800015" w:name="bib_lamoreaux1997"/>
       <w:r>
         <w:t xml:space="preserve">Lamoreaux, S. K. (1997). </w:t>
       </w:r>
@@ -25073,6 +25892,7 @@
       <w:r>
         <w:t>. Physical Review Letters 78, 5–8.</w:t>
       </w:r>
+      <w:bookmarkEnd w:id="800015"/>
     </w:p>
     <w:p>
       <w:pPr>
@@ -25080,6 +25900,7 @@
         <w:spacing w:after="120"/>
         <w:ind w:firstLine="0"/>
       </w:pPr>
+      <w:bookmarkStart w:id="800016" w:name="bib_landauer1961"/>
       <w:r>
         <w:t xml:space="preserve">Landauer, R. (1961). </w:t>
       </w:r>
@@ -25095,6 +25916,127 @@
       <w:r>
         <w:t>. IBM Journal of Research and Development 5, 183–191.</w:t>
       </w:r>
+      <w:bookmarkEnd w:id="800016"/>
+    </w:p>
+    <w:p>
+      <w:pPr>
+        <w:pStyle w:val="BodyText"/>
+        <w:spacing w:after="120"/>
+        <w:ind w:firstLine="0"/>
+      </w:pPr>
+      <w:bookmarkStart w:id="800032" w:name="bib_rfc6962"/>
+      <w:r>
+        <w:t xml:space="preserve">Laurie, B., Langley, A., and Kasper, E. (2013). </w:t>
+      </w:r>
+      <w:hyperlink r:id="rId36" w:history="1">
+        <w:r>
+          <w:rPr>
+            <w:color w:val="0563C1"/>
+            <w:u w:val="single"/>
+          </w:rPr>
+          <w:t xml:space="preserve">Certificate Transparency</w:t>
+        </w:r>
+      </w:hyperlink>
+      <w:r>
+        <w:t xml:space="preserve">. RFC 6962, Internet Engineering Task Force.</w:t>
+      </w:r>
+      <w:bookmarkEnd w:id="800032"/>
+    </w:p>
+    <w:p>
+      <w:pPr>
+        <w:pStyle w:val="BodyText"/>
+        <w:spacing w:after="120"/>
+        <w:ind w:firstLine="0"/>
+      </w:pPr>
+      <w:bookmarkStart w:id="800033" w:name="bib_loftus1974"/>
+      <w:r>
+        <w:t xml:space="preserve">Loftus, E. F., and Palmer, J. C. (1974). </w:t>
+      </w:r>
+      <w:hyperlink r:id="rId37" w:history="1">
+        <w:r>
+          <w:rPr>
+            <w:color w:val="0563C1"/>
+            <w:u w:val="single"/>
+          </w:rPr>
+          <w:t xml:space="preserve">Reconstruction of automobile destruction: an example of the interaction between language and memory</w:t>
+        </w:r>
+      </w:hyperlink>
+      <w:r>
+        <w:t xml:space="preserve">80011-3). Journal of Verbal Learning and Verbal Behavior 13, 585–589.</w:t>
+      </w:r>
+      <w:bookmarkEnd w:id="800033"/>
+    </w:p>
+    <w:p>
+      <w:pPr>
+        <w:pStyle w:val="BodyText"/>
+        <w:spacing w:after="120"/>
+        <w:ind w:firstLine="0"/>
+      </w:pPr>
+      <w:bookmarkStart w:id="800034" w:name="bib_maldacena1997"/>
+      <w:r>
+        <w:t xml:space="preserve">Maldacena, J. (1997). </w:t>
+      </w:r>
+      <w:hyperlink r:id="rId38" w:history="1">
+        <w:r>
+          <w:rPr>
+            <w:color w:val="0563C1"/>
+            <w:u w:val="single"/>
+          </w:rPr>
+          <w:t xml:space="preserve">The large N limit of superconformal field theories and supergravity</w:t>
+        </w:r>
+      </w:hyperlink>
+      <w:r>
+        <w:t xml:space="preserve">. Advances in Theoretical and Mathematical Physics 2 (1998), 231–252.</w:t>
+      </w:r>
+      <w:bookmarkEnd w:id="800034"/>
+    </w:p>
+    <w:p>
+      <w:pPr>
+        <w:pStyle w:val="BodyText"/>
+        <w:spacing w:after="120"/>
+        <w:ind w:firstLine="0"/>
+      </w:pPr>
+      <w:bookmarkStart w:id="800035" w:name="bib_mohideen1998"/>
+      <w:r>
+        <w:t xml:space="preserve">Mohideen, U., and Roy, A. (1998). </w:t>
+      </w:r>
+      <w:hyperlink r:id="rId39" w:history="1">
+        <w:r>
+          <w:rPr>
+            <w:color w:val="0563C1"/>
+            <w:u w:val="single"/>
+          </w:rPr>
+          <w:t xml:space="preserve">Precision measurement of the Casimir force from 0.1 to 0.9 μm</w:t>
+        </w:r>
+      </w:hyperlink>
+      <w:r>
+        <w:t xml:space="preserve">. Physical Review Letters 81, 4549–4552.</w:t>
+      </w:r>
+      <w:bookmarkEnd w:id="800035"/>
+    </w:p>
+    <w:p>
+      <w:pPr>
+        <w:pStyle w:val="BodyText"/>
+        <w:spacing w:after="120"/>
+        <w:ind w:firstLine="0"/>
+      </w:pPr>
+      <w:bookmarkStart w:id="800036" w:name="bib_moreva2014"/>
+      <w:r>
+        <w:t xml:space="preserve">Moreva, E., Brida, G., Gramegna, M., Giovannetti, V., Maccone, L., and Genovese, M. (2014). </w:t>
+      </w:r>
+      <w:hyperlink r:id="rId40" w:history="1">
+        <w:r>
+          <w:rPr>
+            <w:color w:val="0563C1"/>
+            <w:u w:val="single"/>
+          </w:rPr>
+          <w:t xml:space="preserve">Time from quantum entanglement: an experimental illustration</w:t>
+        </w:r>
+      </w:hyperlink>
+      <w:r>
+        <w:t xml:space="preserve">. Physical Review A 89, 052122.</w:t>
+      </w:r>
+      <w:bookmarkEnd w:id="800036"/>
     </w:p>
     <w:p>
       <w:pPr>
@@ -25123,17 +26065,56 @@
     <w:p>
       <w:pPr>
         <w:pStyle w:val="BodyText"/>
-      </w:pPr>
-      <w:r>
-        <w:t>Nash, J. (1951). Non-cooperative games. Annals of Mathematics 54, 286–295.</w:t>
-      </w:r>
-    </w:p>
-    <w:p>
-      <w:pPr>
-        <w:pStyle w:val="BodyText"/>
         <w:spacing w:after="120"/>
         <w:ind w:firstLine="0"/>
       </w:pPr>
+      <w:bookmarkStart w:id="800037" w:name="bib_nash1950"/>
+      <w:r>
+        <w:t xml:space="preserve">Nash, J. (1950). </w:t>
+      </w:r>
+      <w:hyperlink r:id="rId41" w:history="1">
+        <w:r>
+          <w:rPr>
+            <w:color w:val="0563C1"/>
+            <w:u w:val="single"/>
+          </w:rPr>
+          <w:t xml:space="preserve">Equilibrium points in n-person games</w:t>
+        </w:r>
+      </w:hyperlink>
+      <w:r>
+        <w:t xml:space="preserve">. Proceedings of the National Academy of Sciences 36, 48–49.</w:t>
+      </w:r>
+      <w:bookmarkEnd w:id="800037"/>
+    </w:p>
+    <w:p>
+      <w:pPr>
+        <w:pStyle w:val="BodyText"/>
+      </w:pPr>
+      <w:bookmarkStart w:id="800017" w:name="bib_nash1951"/>
+      <w:r>
+        <w:t xml:space="preserve">Nash, J. (1951). </w:t>
+      </w:r>
+      <w:hyperlink r:id="rId24" w:history="1">
+        <w:r>
+          <w:rPr>
+            <w:color w:val="0563C1"/>
+            <w:u w:val="single"/>
+          </w:rPr>
+          <w:t xml:space="preserve">Non-cooperative games</w:t>
+        </w:r>
+      </w:hyperlink>
+      <w:r>
+        <w:t xml:space="preserve">. Annals of Mathematics 54, 286–295.</w:t>
+      </w:r>
+      <w:bookmarkEnd w:id="800017"/>
+    </w:p>
+    <w:p>
+      <w:pPr>
+        <w:pStyle w:val="BodyText"/>
+        <w:spacing w:after="120"/>
+        <w:ind w:firstLine="0"/>
+      </w:pPr>
+      <w:bookmarkStart w:id="800018" w:name="bib_page1993"/>
       <w:r>
         <w:t xml:space="preserve">Page, D. N. (1993). </w:t>
       </w:r>
@@ -25149,6 +26130,7 @@
       <w:r>
         <w:t>. Physical Review Letters 71, 3743–3746.</w:t>
       </w:r>
+      <w:bookmarkEnd w:id="800018"/>
     </w:p>
     <w:p>
       <w:pPr>
@@ -25156,9 +26138,119 @@
         <w:spacing w:after="120"/>
         <w:ind w:firstLine="0"/>
       </w:pPr>
-      <w:r>
-        <w:t>Schwarzschild, K. (1916). On the gravitational field of a mass point according to Einstein’s theory. Sitzungsberichte der Königlich Preussischen Akademie der Wissenschaften, 189–196.</w:t>
-      </w:r>
+      <w:bookmarkStart w:id="800038" w:name="bib_pagewootters1983"/>
+      <w:r>
+        <w:t xml:space="preserve">Page, D. N., and Wootters, W. K. (1983). </w:t>
+      </w:r>
+      <w:hyperlink r:id="rId42" w:history="1">
+        <w:r>
+          <w:rPr>
+            <w:color w:val="0563C1"/>
+            <w:u w:val="single"/>
+          </w:rPr>
+          <w:t xml:space="preserve">Evolution without evolution: dynamics described by stationary observables</w:t>
+        </w:r>
+      </w:hyperlink>
+      <w:r>
+        <w:t xml:space="preserve">. Physical Review D 27, 2885–2892.</w:t>
+      </w:r>
+      <w:bookmarkEnd w:id="800038"/>
+    </w:p>
+    <w:p>
+      <w:pPr>
+        <w:pStyle w:val="BodyText"/>
+        <w:spacing w:after="120"/>
+        <w:ind w:firstLine="0"/>
+      </w:pPr>
+      <w:bookmarkStart w:id="800039" w:name="bib_pawlowski2009"/>
+      <w:r>
+        <w:t xml:space="preserve">Pawłowski, M., Paterek, T., Kaszlikowski, D., Scarani, V., Winter, A., and Żukowski, M. (2009). </w:t>
+      </w:r>
+      <w:hyperlink r:id="rId43" w:history="1">
+        <w:r>
+          <w:rPr>
+            <w:color w:val="0563C1"/>
+            <w:u w:val="single"/>
+          </w:rPr>
+          <w:t xml:space="preserve">Information causality as a physical principle</w:t>
+        </w:r>
+      </w:hyperlink>
+      <w:r>
+        <w:t xml:space="preserve">. Nature 461, 1101–1104.</w:t>
+      </w:r>
+      <w:bookmarkEnd w:id="800039"/>
+    </w:p>
+    <w:p>
+      <w:pPr>
+        <w:pStyle w:val="BodyText"/>
+        <w:spacing w:after="120"/>
+        <w:ind w:firstLine="0"/>
+      </w:pPr>
+      <w:bookmarkStart w:id="800040" w:name="bib_pr1994"/>
+      <w:r>
+        <w:t xml:space="preserve">Popescu, S., and Rohrlich, D. (1994). </w:t>
+      </w:r>
+      <w:hyperlink r:id="rId44" w:history="1">
+        <w:r>
+          <w:rPr>
+            <w:color w:val="0563C1"/>
+            <w:u w:val="single"/>
+          </w:rPr>
+          <w:t xml:space="preserve">Quantum nonlocality as an axiom</w:t>
+        </w:r>
+      </w:hyperlink>
+      <w:r>
+        <w:t xml:space="preserve">. Foundations of Physics 24, 379–385.</w:t>
+      </w:r>
+      <w:bookmarkEnd w:id="800040"/>
+    </w:p>
+    <w:p>
+      <w:pPr>
+        <w:pStyle w:val="BodyText"/>
+        <w:spacing w:after="120"/>
+        <w:ind w:firstLine="0"/>
+      </w:pPr>
+      <w:bookmarkStart w:id="800041" w:name="bib_robertson1929"/>
+      <w:r>
+        <w:t xml:space="preserve">Robertson, H. P. (1929). </w:t>
+      </w:r>
+      <w:hyperlink r:id="rId45" w:history="1">
+        <w:r>
+          <w:rPr>
+            <w:color w:val="0563C1"/>
+            <w:u w:val="single"/>
+          </w:rPr>
+          <w:t xml:space="preserve">The uncertainty principle</w:t>
+        </w:r>
+      </w:hyperlink>
+      <w:r>
+        <w:t xml:space="preserve">. Physical Review 34, 163–164.</w:t>
+      </w:r>
+      <w:bookmarkEnd w:id="800041"/>
+    </w:p>
+    <w:p>
+      <w:pPr>
+        <w:pStyle w:val="BodyText"/>
+        <w:spacing w:after="120"/>
+        <w:ind w:firstLine="0"/>
+      </w:pPr>
+      <w:bookmarkStart w:id="800019" w:name="bib_schwarzschild1916"/>
+      <w:r>
+        <w:t xml:space="preserve">Schwarzschild, K. (1916). On the gravitational field of a mass point according to Einstein’s theory. Sitzungsberichte der Königlich Preussischen Akademie der Wissenschaften, 189–196. </w:t>
+      </w:r>
+      <w:hyperlink r:id="rId25" w:history="1">
+        <w:r>
+          <w:rPr>
+            <w:color w:val="0563C1"/>
+            <w:u w:val="single"/>
+          </w:rPr>
+          <w:t xml:space="preserve">English translation</w:t>
+        </w:r>
+      </w:hyperlink>
+      <w:r>
+        <w:t xml:space="preserve">, 1999.</w:t>
+      </w:r>
+      <w:bookmarkEnd w:id="800019"/>
     </w:p>
     <w:p>
       <w:pPr>
@@ -25190,9 +26282,23 @@
         <w:spacing w:after="120"/>
         <w:ind w:firstLine="0"/>
       </w:pPr>
-      <w:r>
-        <w:t>Szekeres, G. (1960). On the singularities of a Riemannian manifold. Publicationes Mathematicae Debrecen 7, 285–301.</w:t>
-      </w:r>
+      <w:bookmarkStart w:id="800042" w:name="bib_stu1993"/>
+      <w:r>
+        <w:t xml:space="preserve">Susskind, L., Thorlacius, L., and Uglum, J. (1993). </w:t>
+      </w:r>
+      <w:hyperlink r:id="rId46" w:history="1">
+        <w:r>
+          <w:rPr>
+            <w:color w:val="0563C1"/>
+            <w:u w:val="single"/>
+          </w:rPr>
+          <w:t xml:space="preserve">The stretched horizon and black hole complementarity</w:t>
+        </w:r>
+      </w:hyperlink>
+      <w:r>
+        <w:t xml:space="preserve">. Physical Review D 48, 3743–3761.</w:t>
+      </w:r>
+      <w:bookmarkEnd w:id="800042"/>
     </w:p>
     <w:p>
       <w:pPr>
@@ -25200,6 +26306,67 @@
         <w:spacing w:after="120"/>
         <w:ind w:firstLine="0"/>
       </w:pPr>
+      <w:bookmarkStart w:id="800020" w:name="bib_szekeres1960"/>
+      <w:r>
+        <w:t>Szekeres, G. (1960). On the singularities of a Riemannian manifold. Publicationes Mathematicae Debrecen 7, 285–301.</w:t>
+      </w:r>
+      <w:bookmarkEnd w:id="800020"/>
+    </w:p>
+    <w:p>
+      <w:pPr>
+        <w:pStyle w:val="BodyText"/>
+        <w:spacing w:after="120"/>
+        <w:ind w:firstLine="0"/>
+      </w:pPr>
+      <w:bookmarkStart w:id="800043" w:name="bib_szilard1929"/>
+      <w:r>
+        <w:t xml:space="preserve">Szilard, L. (1929). </w:t>
+      </w:r>
+      <w:hyperlink r:id="rId47" w:history="1">
+        <w:r>
+          <w:rPr>
+            <w:color w:val="0563C1"/>
+            <w:u w:val="single"/>
+          </w:rPr>
+          <w:t xml:space="preserve">On the decrease of entropy in a thermodynamic system by the intervention of intelligent beings</w:t>
+        </w:r>
+      </w:hyperlink>
+      <w:r>
+        <w:t xml:space="preserve">. Zeitschrift für Physik 53, 840–856.</w:t>
+      </w:r>
+      <w:bookmarkEnd w:id="800043"/>
+    </w:p>
+    <w:p>
+      <w:pPr>
+        <w:pStyle w:val="BodyText"/>
+        <w:spacing w:after="120"/>
+        <w:ind w:firstLine="0"/>
+      </w:pPr>
+      <w:bookmarkStart w:id="800044" w:name="bib_weinberg1987"/>
+      <w:r>
+        <w:t xml:space="preserve">Weinberg, S. (1987). </w:t>
+      </w:r>
+      <w:hyperlink r:id="rId48" w:history="1">
+        <w:r>
+          <w:rPr>
+            <w:color w:val="0563C1"/>
+            <w:u w:val="single"/>
+          </w:rPr>
+          <w:t xml:space="preserve">Anthropic bound on the cosmological constant</w:t>
+        </w:r>
+      </w:hyperlink>
+      <w:r>
+        <w:t xml:space="preserve">. Physical Review Letters 59, 2607–2610.</w:t>
+      </w:r>
+      <w:bookmarkEnd w:id="800044"/>
+    </w:p>
+    <w:p>
+      <w:pPr>
+        <w:pStyle w:val="BodyText"/>
+        <w:spacing w:after="120"/>
+        <w:ind w:firstLine="0"/>
+      </w:pPr>
+      <w:bookmarkStart w:id="800021" w:name="bib_wigner1960"/>
       <w:r>
         <w:lastRenderedPageBreak/>
         <w:t xml:space="preserve">Wigner, E. P. (1960). </w:t>
@@ -25216,6 +26383,7 @@
       <w:r>
         <w:t>. Communications on Pure and Applied Mathematics 13, 1–14.</w:t>
       </w:r>
+      <w:bookmarkEnd w:id="800021"/>
     </w:p>
     <w:p>
       <w:pPr>
@@ -25232,18 +26400,15 @@
     </w:p>
     <w:p>
       <w:pPr>
+        <w:pStyle w:val="Heading2"/>
         <w:pageBreakBefore/>
-        <w:spacing w:before="1440" w:line="240" w:lineRule="auto"/>
-        <w:jc w:val="center"/>
-      </w:pPr>
-      <w:r>
-        <w:rPr>
-          <w:b/>
-          <w:color w:val="444444"/>
-        </w:rPr>
+      </w:pPr>
+      <w:bookmarkStart w:id="800046" w:name="aboutAuthor"/>
+      <w:r>
         <w:lastRenderedPageBreak/>
         <w:t xml:space="preserve">About the Author</w:t>
       </w:r>
+      <w:bookmarkEnd w:id="800046"/>
     </w:p>
     <w:p>
       <w:pPr>
@@ -25283,18 +26448,15 @@
     </w:p>
     <w:p>
       <w:pPr>
+        <w:pStyle w:val="Heading2"/>
         <w:pageBreakBefore/>
-        <w:spacing w:before="1440" w:line="240" w:lineRule="auto"/>
-        <w:jc w:val="center"/>
-      </w:pPr>
-      <w:r>
-        <w:rPr>
-          <w:b/>
-          <w:color w:val="444444"/>
-        </w:rPr>
+      </w:pPr>
+      <w:bookmarkStart w:id="800045" w:name="alsoBy"/>
+      <w:r>
         <w:lastRenderedPageBreak/>
         <w:t>Also by Lothar J. Musiol</w:t>
       </w:r>
+      <w:bookmarkEnd w:id="800045"/>
     </w:p>
     <w:p>
       <w:pPr>

</xml_diff>

<commit_message>
The Permitted Options (from book-2-lectures-after-qed 9408cb5): front and back covers, strict rescore 8.6 -> 9.1, bibliography 21 -> 44 linked entries with in-text citation links, About the Author and Also by in the Contents; SCORES row
</commit_message>
<xml_diff>
--- a/Lolly Wren's Curious Science Adventures - SERIES/Book 2 - The Permitted Options/The_Permitted_Options_BOOK_2_REVISION_20261005.docx
+++ b/Lolly Wren's Curious Science Adventures - SERIES/Book 2 - The Permitted Options/The_Permitted_Options_BOOK_2_REVISION_20261005.docx
@@ -608,6 +608,34 @@
             <w:rStyle w:val="Hyperlink"/>
           </w:rPr>
           <w:t xml:space="preserve">Bibliography</w:t>
+        </w:r>
+      </w:hyperlink>
+    </w:p>
+    <w:p>
+      <w:pPr>
+        <w:pStyle w:val="FirstParagraph"/>
+        <w:spacing w:before="0" w:after="60"/>
+      </w:pPr>
+      <w:hyperlink w:anchor="aboutAuthor" w:history="1">
+        <w:r>
+          <w:rPr>
+            <w:rStyle w:val="Hyperlink"/>
+          </w:rPr>
+          <w:t xml:space="preserve">About the Author</w:t>
+        </w:r>
+      </w:hyperlink>
+    </w:p>
+    <w:p>
+      <w:pPr>
+        <w:pStyle w:val="FirstParagraph"/>
+        <w:spacing w:before="0" w:after="60"/>
+      </w:pPr>
+      <w:hyperlink w:anchor="alsoBy" w:history="1">
+        <w:r>
+          <w:rPr>
+            <w:rStyle w:val="Hyperlink"/>
+          </w:rPr>
+          <w:t xml:space="preserve">Also by Lothar J. Musiol</w:t>
         </w:r>
       </w:hyperlink>
     </w:p>
@@ -19486,7 +19514,19 @@
         <w:t>The Casimir effect.</w:t>
       </w:r>
       <w:r>
-        <w:t xml:space="preserve"> Hendrik Casimir, working at Philips Research in 1948 on the practical question of why colloidal suspensions in industrial products behaved as they did, calculated what happens when two uncharged parallel conducting plates are placed very close together. Between the plates, only field modes with wavelengths fitting the cavity are permitted; outside, all modes are available. The mode density between the plates is therefore lower than outside, and so is the vacuum energy density. The result is an attractive force per unit area</w:t>
+        <w:t xml:space="preserve"> </w:t>
+      </w:r>
+      <w:hyperlink w:anchor="bib_casimir1948" w:history="1">
+        <w:r>
+          <w:rPr>
+            <w:color w:val="0563C1"/>
+            <w:u w:val="single"/>
+          </w:rPr>
+          <w:t xml:space="preserve">Hendrik Casimir</w:t>
+        </w:r>
+      </w:hyperlink>
+      <w:r>
+        <w:t xml:space="preserve">, working at Philips Research in 1948 on the practical question of why colloidal suspensions in industrial products behaved as they did, calculated what happens when two uncharged parallel conducting plates are placed very close together. Between the plates, only field modes with wavelengths fitting the cavity are permitted; outside, all modes are available. The mode density between the plates is therefore lower than outside, and so is the vacuum energy density. The result is an attractive force per unit area</w:t>
       </w:r>
     </w:p>
     <w:p>
@@ -19505,8 +19545,19 @@
         <w:t xml:space="preserve">falling off as the fourth power of separation — feeble at a micron, substantial at tens of nanometres, and a genuine engineering nuisance in microelectromechanical devices. It was </w:t>
       </w:r>
       <w:r>
-        <w:lastRenderedPageBreak/>
-        <w:t>measured decisively by Lamoreaux in 1997 and many times since.</w:t>
+        <w:t xml:space="preserve">measured decisively by </w:t>
+      </w:r>
+      <w:hyperlink w:anchor="bib_lamoreaux1997" w:history="1">
+        <w:r>
+          <w:rPr>
+            <w:color w:val="0563C1"/>
+            <w:u w:val="single"/>
+          </w:rPr>
+          <w:t xml:space="preserve">Lamoreaux in 1997</w:t>
+        </w:r>
+      </w:hyperlink>
+      <w:r>
+        <w:t xml:space="preserve"> and many times since.</w:t>
       </w:r>
     </w:p>
     <w:p>
@@ -19740,7 +19791,19 @@
         <w:t>What Einstein actually objected to.</w:t>
       </w:r>
       <w:r>
-        <w:t xml:space="preserve"> In a 1926 letter to Max Born he wrote that the theory “says a lot, but does not really bring us any closer to the secret of the ‘old one’. I, at any rate, am convinced that He is not playing at dice.” (That is the published English translation; the letter is dated 4 December 1926.) The remark is routinely misread as a mystic’s discomfort with randomness. His actual objection was methodological and rather dry: quantum mechanics yields probabilities, and Einstein held that a probability is what a theory offers when its description is </w:t>
+        <w:t xml:space="preserve"> In </w:t>
+      </w:r>
+      <w:hyperlink w:anchor="bib_einstein1926" w:history="1">
+        <w:r>
+          <w:rPr>
+            <w:color w:val="0563C1"/>
+            <w:u w:val="single"/>
+          </w:rPr>
+          <w:t xml:space="preserve">a 1926 letter to Max Born</w:t>
+        </w:r>
+      </w:hyperlink>
+      <w:r>
+        <w:t xml:space="preserve"> he wrote that the theory “says a lot, but does not really bring us any closer to the secret of the ‘old one’. I, at any rate, am convinced that He is not playing at dice.” (That is the published English translation; the letter is dated 4 December 1926.) The remark is routinely misread as a mystic’s discomfort with randomness. His actual objection was methodological and rather dry: quantum mechanics yields probabilities, and Einstein held that a probability is what a theory offers when its description is </w:t>
       </w:r>
       <w:r>
         <w:rPr>
@@ -19765,7 +19828,19 @@
         <w:t>Hidden variables, and where Einstein was wrong.</w:t>
       </w:r>
       <w:r>
-        <w:t xml:space="preserve"> The 1935 EPR paper argued that quantum mechanics must be incomplete on the grounds that one can predict with certainty the result of a distant measurement without disturbing the distant system — implying a pre-existing element of reality the formalism omits. The argument assumed </w:t>
+        <w:t xml:space="preserve"> </w:t>
+      </w:r>
+      <w:hyperlink w:anchor="bib_epr1935" w:history="1">
+        <w:r>
+          <w:rPr>
+            <w:color w:val="0563C1"/>
+            <w:u w:val="single"/>
+          </w:rPr>
+          <w:t xml:space="preserve">The 1935 EPR paper</w:t>
+        </w:r>
+      </w:hyperlink>
+      <w:r>
+        <w:t xml:space="preserve"> argued that quantum mechanics must be incomplete on the grounds that one can predict with certainty the result of a distant measurement without disturbing the distant system — implying a pre-existing element of reality the formalism omits. The argument assumed </w:t>
       </w:r>
       <w:r>
         <w:rPr>
@@ -20071,7 +20146,19 @@
         <w:t>The bound that starts it.</w:t>
       </w:r>
       <w:r>
-        <w:t xml:space="preserve"> Ordinary intuition says the information capacity of a region scales with its volume. Bekenstein’s 1972 work on black hole thermodynamics broke that. A black hole’s entropy is proportional not to its volume but to the </w:t>
+        <w:t xml:space="preserve"> Ordinary intuition says the information capacity of a region scales with its volume. </w:t>
+      </w:r>
+      <w:hyperlink w:anchor="bib_bekenstein1972" w:history="1">
+        <w:r>
+          <w:rPr>
+            <w:color w:val="0563C1"/>
+            <w:u w:val="single"/>
+          </w:rPr>
+          <w:t xml:space="preserve">Bekenstein’s 1972</w:t>
+        </w:r>
+      </w:hyperlink>
+      <w:r>
+        <w:t xml:space="preserve"> work on black hole thermodynamics broke that. A black hole’s entropy is proportional not to its volume but to the </w:t>
       </w:r>
       <w:r>
         <w:rPr>
@@ -20142,7 +20229,19 @@
         <w:t>AdS/CFT correspondence</w:t>
       </w:r>
       <w:r>
-        <w:t xml:space="preserve"> (Maldacena, 1997): a gravitational theory in a (d+1)-dimensional anti-de Sitter bulk is exactly dual to a conformal field theory without gravity on its d-dimensional </w:t>
+        <w:t xml:space="preserve"> (</w:t>
+      </w:r>
+      <w:hyperlink w:anchor="bib_maldacena1997" w:history="1">
+        <w:r>
+          <w:rPr>
+            <w:color w:val="0563C1"/>
+            <w:u w:val="single"/>
+          </w:rPr>
+          <w:t xml:space="preserve">Maldacena, 1997</w:t>
+        </w:r>
+      </w:hyperlink>
+      <w:r>
+        <w:t xml:space="preserve">): a gravitational theory in a (d+1)-dimensional anti-de Sitter bulk is exactly dual to a conformal field theory without gravity on its d-dimensional </w:t>
       </w:r>
       <w:r>
         <w:lastRenderedPageBreak/>
@@ -20422,7 +20521,19 @@
         <w:t>Complementarity.</w:t>
       </w:r>
       <w:r>
-        <w:t xml:space="preserve"> Susskind, Thorlacius and Uglum proposed in 1993 that the black hole information paradox dissolves if one abandons the assumption that a single global description must exist. To an outside observer, information never enters the hole; it is smeared on the stretched horizon and returns in the radiation. To an infalling observer, nothing special happens at the horizon and the interior is an ordinary place. Both accounts are internally consistent, and no observer can perform an experiment that compares them, because to check the outside account you must stay out, and to check the inside account you must go in and cannot report back. There is no contradiction because there is no vantage point from which to have one. This is the doctrine the Office of the President relies upon, and it is stated fairly in the chapter.</w:t>
+        <w:t xml:space="preserve"> </w:t>
+      </w:r>
+      <w:hyperlink w:anchor="bib_stu1993" w:history="1">
+        <w:r>
+          <w:rPr>
+            <w:color w:val="0563C1"/>
+            <w:u w:val="single"/>
+          </w:rPr>
+          <w:t xml:space="preserve">Susskind, Thorlacius and Uglum</w:t>
+        </w:r>
+      </w:hyperlink>
+      <w:r>
+        <w:t xml:space="preserve"> proposed in 1993 that the black hole information paradox dissolves if one abandons the assumption that a single global description must exist. To an outside observer, information never enters the hole; it is smeared on the stretched horizon and returns in the radiation. To an infalling observer, nothing special happens at the horizon and the interior is an ordinary place. Both accounts are internally consistent, and no observer can perform an experiment that compares them, because to check the outside account you must stay out, and to check the inside account you must go in and cannot report back. There is no contradiction because there is no vantage point from which to have one. This is the doctrine the Office of the President relies upon, and it is stated fairly in the chapter.</w:t>
       </w:r>
     </w:p>
     <w:p>
@@ -20437,7 +20548,19 @@
         <w:t>Why it fails: the firewall argument.</w:t>
       </w:r>
       <w:r>
-        <w:t xml:space="preserve"> In 2012 Almheiri, Marolf, Polchinski and Sully (AMPS) showed that the two accounts cannot be reconciled after all, and the reason is a theorem of quantum information: monogamy of entanglement. For the outside account to work, a late Hawking quantum must be maximally correlated with the radiation already emitted. For the infalling account to work — for the horizon to be an unremarkable region of empty space — that same quantum must be maximally correlated with its partner just inside. Monogamy forbids both:</w:t>
+        <w:t xml:space="preserve"> In 2012 </w:t>
+      </w:r>
+      <w:hyperlink w:anchor="bib_amps2012" w:history="1">
+        <w:r>
+          <w:rPr>
+            <w:color w:val="0563C1"/>
+            <w:u w:val="single"/>
+          </w:rPr>
+          <w:t xml:space="preserve">Almheiri, Marolf, Polchinski and Sully</w:t>
+        </w:r>
+      </w:hyperlink>
+      <w:r>
+        <w:t xml:space="preserve"> (AMPS) showed that the two accounts cannot be reconciled after all, and the reason is a theorem of quantum information: monogamy of entanglement. For the outside account to work, a late Hawking quantum must be maximally correlated with the radiation already emitted. For the infalling account to work — for the horizon to be an unremarkable region of empty space — that same quantum must be maximally correlated with its partner just inside. Monogamy forbids both:</w:t>
       </w:r>
     </w:p>
     <w:p>
@@ -20721,7 +20844,19 @@
         <w:t>The first incompleteness theorem.</w:t>
       </w:r>
       <w:r>
-        <w:t xml:space="preserve"> Gödel proved in 1931 that any consistent, effectively axiomatised formal system strong enough to express elementary arithmetic contains statements that are true but unprovable within it. The machinery is </w:t>
+        <w:t xml:space="preserve"> </w:t>
+      </w:r>
+      <w:hyperlink w:anchor="bib_godel1931" w:history="1">
+        <w:r>
+          <w:rPr>
+            <w:color w:val="0563C1"/>
+            <w:u w:val="single"/>
+          </w:rPr>
+          <w:t xml:space="preserve">Gödel proved in 1931</w:t>
+        </w:r>
+      </w:hyperlink>
+      <w:r>
+        <w:t xml:space="preserve"> that any consistent, effectively axiomatised formal system strong enough to express elementary arithmetic contains statements that are true but unprovable within it. The machinery is </w:t>
       </w:r>
       <w:r>
         <w:rPr>
@@ -20786,7 +20921,19 @@
         <w:t>Undecidability in physics, which is the chapter’s real weight.</w:t>
       </w:r>
       <w:r>
-        <w:t xml:space="preserve"> In 2015, Cubitt, Pérez-García and Wolf proved that the </w:t>
+        <w:t xml:space="preserve"> In 2015, </w:t>
+      </w:r>
+      <w:hyperlink w:anchor="bib_cubitt2015" w:history="1">
+        <w:r>
+          <w:rPr>
+            <w:color w:val="0563C1"/>
+            <w:u w:val="single"/>
+          </w:rPr>
+          <w:t xml:space="preserve">Cubitt, Pérez-García and Wolf</w:t>
+        </w:r>
+      </w:hyperlink>
+      <w:r>
+        <w:t xml:space="preserve"> proved that the </w:t>
       </w:r>
       <w:r>
         <w:rPr>
@@ -20839,7 +20986,19 @@
         <w:t>The Hofstadter strand.</w:t>
       </w:r>
       <w:r>
-        <w:t xml:space="preserve"> Gödel, Escher, Bach: an Eternal Golden Braid (Hofstadter, 1979) argues that Gödel’s self-reference, Escher’s impossible recursions — Drawing Hands, Print Gallery, the endlessly rising staircase — and Bach’s canons, especially the modulating canon that ascends through six keys and returns to its origin, are the same structure realised in logic, image and sound. Hofstadter calls the structure a </w:t>
+        <w:t xml:space="preserve"> Gödel, Escher, Bach: an Eternal Golden Braid (</w:t>
+      </w:r>
+      <w:hyperlink w:anchor="bib_hofstadter1979" w:history="1">
+        <w:r>
+          <w:rPr>
+            <w:color w:val="0563C1"/>
+            <w:u w:val="single"/>
+          </w:rPr>
+          <w:t xml:space="preserve">Hofstadter, 1979</w:t>
+        </w:r>
+      </w:hyperlink>
+      <w:r>
+        <w:t xml:space="preserve">) argues that Gödel’s self-reference, Escher’s impossible recursions — Drawing Hands, Print Gallery, the endlessly rising staircase — and Bach’s canons, especially the modulating canon that ascends through six keys and returns to its origin, are the same structure realised in logic, image and sound. Hofstadter calls the structure a </w:t>
       </w:r>
       <w:r>
         <w:rPr>
@@ -21001,7 +21160,19 @@
         <w:pStyle w:val="FirstParagraph"/>
       </w:pPr>
       <w:r>
-        <w:t>Chapter Eight brings in Nash equilibrium and the commons, nonlocal games as the operational face of Bell’s theorem, and the 2020 result that the value of such games is undecidable.</w:t>
+        <w:t xml:space="preserve">Chapter Eight brings in Nash equilibrium and the commons, nonlocal games as the operational face of Bell’s theorem, and the </w:t>
+      </w:r>
+      <w:hyperlink w:anchor="bib_ji2020" w:history="1">
+        <w:r>
+          <w:rPr>
+            <w:color w:val="0563C1"/>
+            <w:u w:val="single"/>
+          </w:rPr>
+          <w:t xml:space="preserve">2020 result</w:t>
+        </w:r>
+      </w:hyperlink>
+      <w:r>
+        <w:t xml:space="preserve"> that the value of such games is undecidable.</w:t>
       </w:r>
     </w:p>
     <w:p>
@@ -21016,7 +21187,19 @@
         <w:t>Equilibrium, and why the Programme was structurally doomed.</w:t>
       </w:r>
       <w:r>
-        <w:t xml:space="preserve"> Nash’s 1950 result, from a famously short doctoral thesis, established that every finite non-cooperative game has at least one point at which no player can improve by unilaterally changing strategy. For a public-good game with diffuse benefit and specific cost, non-contribution strictly dominates: whatever the others do, an individual member does better by withholding. The unique equilibrium is universal defection, and no malice is required to reach it. Nash is reported to have rated the embedding theorems (1954–56) above his game theory; they prove that any Riemannian manifold admits an isometric embedding into a Euclidean space of sufficient dimension — a curved intrinsic description is always available as a plain extrinsic one, which is why the chapter has him glance at the holography board.</w:t>
+        <w:t xml:space="preserve"> </w:t>
+      </w:r>
+      <w:hyperlink w:anchor="bib_nash1950" w:history="1">
+        <w:r>
+          <w:rPr>
+            <w:color w:val="0563C1"/>
+            <w:u w:val="single"/>
+          </w:rPr>
+          <w:t xml:space="preserve">Nash’s 1950 result</w:t>
+        </w:r>
+      </w:hyperlink>
+      <w:r>
+        <w:t xml:space="preserve">, from a famously short doctoral thesis, established that every finite non-cooperative game has at least one point at which no player can improve by unilaterally changing strategy. For a public-good game with diffuse benefit and specific cost, non-contribution strictly dominates: whatever the others do, an individual member does better by withholding. The unique equilibrium is universal defection, and no malice is required to reach it. Nash is reported to have rated the embedding theorems (1954–56) above his game theory; they prove that any Riemannian manifold admits an isometric embedding into a Euclidean space of sufficient dimension — a curved intrinsic description is always available as a plain extrinsic one, which is why the chapter has him glance at the holography board.</w:t>
       </w:r>
     </w:p>
     <w:p>
@@ -21213,7 +21396,19 @@
         <w:t>The Page curve, in passing.</w:t>
       </w:r>
       <w:r>
-        <w:t xml:space="preserve"> Ramanathan’s crossover is Page’s 1993 result: the entanglement entropy of radiation from an evaporating black hole rises while the interior still holds the record, peaks at the </w:t>
+        <w:t xml:space="preserve"> Ramanathan’s crossover is </w:t>
+      </w:r>
+      <w:hyperlink w:anchor="bib_page1993" w:history="1">
+        <w:r>
+          <w:rPr>
+            <w:color w:val="0563C1"/>
+            <w:u w:val="single"/>
+          </w:rPr>
+          <w:t xml:space="preserve">Page’s 1993 result</w:t>
+        </w:r>
+      </w:hyperlink>
+      <w:r>
+        <w:t xml:space="preserve">: the entanglement entropy of radiation from an evaporating black hole rises while the interior still holds the record, peaks at the </w:t>
       </w:r>
       <w:r>
         <w:rPr>
@@ -21381,7 +21576,19 @@
         </w:numPr>
       </w:pPr>
       <w:r>
-        <w:t>Kennard proved the real reason the same year: even a system nobody has touched, described by its wavefunction alone, satisfies Δx·Δp ≥ ħ/2 — a spread in position times a spread in momentum that can never fall below a fixed, tiny floor. Robertson widened this in 1929 to any two quantities that don’t commute. No microscope required. No disturbance required. It is a property of the wave, not a limit on the poking.</w:t>
+        <w:t xml:space="preserve">Kennard proved the real reason the same year: even a system nobody has touched, described by its wavefunction alone, satisfies Δx·Δp ≥ ħ/2 — a spread in position times a spread in momentum that can never fall below a fixed, tiny floor. </w:t>
+      </w:r>
+      <w:hyperlink w:anchor="bib_robertson1929" w:history="1">
+        <w:r>
+          <w:rPr>
+            <w:color w:val="0563C1"/>
+            <w:u w:val="single"/>
+          </w:rPr>
+          <w:t xml:space="preserve">Robertson widened this in 1929</w:t>
+        </w:r>
+      </w:hyperlink>
+      <w:r>
+        <w:t xml:space="preserve"> to any two quantities that don’t commute. No microscope required. No disturbance required. It is a property of the wave, not a limit on the poking.</w:t>
       </w:r>
     </w:p>
     <w:p>
@@ -21473,7 +21680,19 @@
         </w:numPr>
       </w:pPr>
       <w:r>
-        <w:t>The redundancy test has a human version, and it fails in a famous way. A memory is not a photocopy kept in a drawer. Each time it is recalled it is rebuilt, and it can absorb whatever is in the room at the rebuilding. In 1974 Elizabeth Loftus and John Palmer showed people a film of a car accident and asked how fast the cars were going when they “smashed into” each other. A week later, those given “smashed” were more than twice as likely as those given “hit” to remember broken glass. The film showed none. When large numbers of people share the same memory of something that never happened, which is now called the Mandela effect after the widespread false memory that Nelson Mandela died in prison in the 1980s, the agreement is not a large R_δ. The memories share causes: the same misleading cue, the same retold story, one another. Three hundred and eighty-six signatures that compared notes are, by Zurek’s test, much nearer one witness than three hundred and eighty-six.</w:t>
+        <w:t xml:space="preserve">The redundancy test has a human version, and it fails in a famous way. A memory is not a photocopy kept in a drawer. Each time it is recalled it is rebuilt, and it can absorb whatever is in the room at the rebuilding. In 1974 </w:t>
+      </w:r>
+      <w:hyperlink w:anchor="bib_loftus1974" w:history="1">
+        <w:r>
+          <w:rPr>
+            <w:color w:val="0563C1"/>
+            <w:u w:val="single"/>
+          </w:rPr>
+          <w:t xml:space="preserve">Elizabeth Loftus and John Palmer</w:t>
+        </w:r>
+      </w:hyperlink>
+      <w:r>
+        <w:t xml:space="preserve"> showed people a film of a car accident and asked how fast the cars were going when they “smashed into” each other. A week later, those given “smashed” were more than twice as likely as those given “hit” to remember broken glass. The film showed none. When large numbers of people share the same memory of something that never happened, which is now called the Mandela effect after the widespread false memory that Nelson Mandela died in prison in the 1980s, the agreement is not a large R_δ. The memories share causes: the same misleading cue, the same retold story, one another. Three hundred and eighty-six signatures that compared notes are, by Zurek’s test, much nearer one witness than three hundred and eighty-six.</w:t>
       </w:r>
     </w:p>
     <w:p>
@@ -21628,7 +21847,19 @@
         <w:t>Wigner’s puzzle.</w:t>
       </w:r>
       <w:r>
-        <w:t xml:space="preserve"> In “The Unreasonable Effectiveness of Mathematics in the Natural Sciences” (1960), Eugene Wigner argued that the applicability of mathematics to physics is a miracle we have no right to expect: concepts developed for internal mathematical reasons repeatedly turn out to be the precise language of physical law discovered much later. His examples are genuine — complex numbers becoming the arithmetic of amplitudes, Riemannian geometry becoming gravitation, group representation theory becoming the classification of particles, a subject to which Wigner himself contributed decisively.</w:t>
+        <w:t xml:space="preserve"> In “</w:t>
+      </w:r>
+      <w:hyperlink w:anchor="bib_wigner1960" w:history="1">
+        <w:r>
+          <w:rPr>
+            <w:color w:val="0563C1"/>
+            <w:u w:val="single"/>
+          </w:rPr>
+          <w:t xml:space="preserve">The Unreasonable Effectiveness of Mathematics in the Natural Sciences</w:t>
+        </w:r>
+      </w:hyperlink>
+      <w:r>
+        <w:t xml:space="preserve">” (1960), Eugene Wigner argued that the applicability of mathematics to physics is a miracle we have no right to expect: concepts developed for internal mathematical reasons repeatedly turn out to be the precise language of physical law discovered much later. His examples are genuine — complex numbers becoming the arithmetic of amplitudes, Riemannian geometry becoming gravitation, group representation theory becoming the classification of particles, a subject to which Wigner himself contributed decisively.</w:t>
       </w:r>
     </w:p>
     <w:p>
@@ -21643,7 +21874,19 @@
         <w:t>The counter-case, which the chapter states fairly.</w:t>
       </w:r>
       <w:r>
-        <w:t xml:space="preserve"> Richard Hamming’s 1980 reply, under the same title, offered four partial deflations: we see what we look for; we select the mathematics that fits and discard the rest; science addresses only a small subset of possible questions; and human cognition was itself shaped by the physics it describes. To these the chapter adds the </w:t>
+        <w:t xml:space="preserve"> Richard </w:t>
+      </w:r>
+      <w:hyperlink w:anchor="bib_hamming1980" w:history="1">
+        <w:r>
+          <w:rPr>
+            <w:color w:val="0563C1"/>
+            <w:u w:val="single"/>
+          </w:rPr>
+          <w:t xml:space="preserve">Hamming’s 1980 reply</w:t>
+        </w:r>
+      </w:hyperlink>
+      <w:r>
+        <w:t xml:space="preserve">, under the same title, offered four partial deflations: we see what we look for; we select the mathematics that fits and discard the rest; science addresses only a small subset of possible questions; and human cognition was itself shaped by the physics it describes. To these the chapter adds the </w:t>
       </w:r>
       <w:r>
         <w:rPr>
@@ -21764,7 +22007,19 @@
         <w:t>.</w:t>
       </w:r>
       <w:r>
-        <w:t xml:space="preserve"> Popescu and Rohrlich showed in 1994 that a hypothetical device — the PR box — achieves 4 while remaining perfectly consistent with relativistic causality, since it permits no transmission of information. Relativity does not select the quantum value.</w:t>
+        <w:t xml:space="preserve"> </w:t>
+      </w:r>
+      <w:hyperlink w:anchor="bib_pr1994" w:history="1">
+        <w:r>
+          <w:rPr>
+            <w:color w:val="0563C1"/>
+            <w:u w:val="single"/>
+          </w:rPr>
+          <w:t xml:space="preserve">Popescu and Rohrlich</w:t>
+        </w:r>
+      </w:hyperlink>
+      <w:r>
+        <w:t xml:space="preserve"> showed in 1994 that a hypothetical device — the PR box — achieves 4 while remaining perfectly consistent with relativistic causality, since it permits no transmission of information. Relativity does not select the quantum value.</w:t>
       </w:r>
     </w:p>
     <w:p>
@@ -21899,7 +22154,19 @@
         <w:pStyle w:val="BodyText"/>
       </w:pPr>
       <w:r>
-        <w:t xml:space="preserve">There is no ∂/∂t, no external parameter, and the wavefunction of the universe is stationary. This is the “problem of time” in quantum gravity, and Barbour’s position — presented in The End of Time (1999) — is that it is not a </w:t>
+        <w:t xml:space="preserve">There is no ∂/∂t, no external parameter, and the wavefunction of the universe is stationary. This is the “problem of time” in quantum gravity, and Barbour’s position — presented in </w:t>
+      </w:r>
+      <w:hyperlink w:anchor="bib_barbour1999" w:history="1">
+        <w:r>
+          <w:rPr>
+            <w:color w:val="0563C1"/>
+            <w:u w:val="single"/>
+          </w:rPr>
+          <w:t xml:space="preserve">The End of Time</w:t>
+        </w:r>
+      </w:hyperlink>
+      <w:r>
+        <w:t xml:space="preserve"> (1999) — is that it is not a </w:t>
       </w:r>
       <w:r>
         <w:lastRenderedPageBreak/>
@@ -21938,7 +22205,19 @@
         <w:t>Two forms that will not combine.</w:t>
       </w:r>
       <w:r>
-        <w:t xml:space="preserve"> Quantum theory and general relativity have each passed every test put to them, and they are used together all the time. GPS corrects atomic clocks, which run on quantum transitions, for the time dilation of general relativity. Hawking’s 1974 calculation put quantum fields on the curved spacetime of a black hole and found that black holes radiate. This semiclassical method works wherever gravity can be treated as a fixed classical background. It fails only where quantum effects and strong curvature matter together, at a singularity or at the earliest instant, and that is where the Wheeler–DeWitt equation is needed and where nobody yet has a tested theory.</w:t>
+        <w:t xml:space="preserve"> Quantum theory and general relativity have each passed every test put to them, and they are used together all the time. GPS corrects atomic clocks, which run on quantum transitions, for the time dilation of general relativity. </w:t>
+      </w:r>
+      <w:hyperlink w:anchor="bib_hawking1974" w:history="1">
+        <w:r>
+          <w:rPr>
+            <w:color w:val="0563C1"/>
+            <w:u w:val="single"/>
+          </w:rPr>
+          <w:t xml:space="preserve">Hawking’s 1974 calculation</w:t>
+        </w:r>
+      </w:hyperlink>
+      <w:r>
+        <w:t xml:space="preserve"> put quantum fields on the curved spacetime of a black hole and found that black holes radiate. This semiclassical method works wherever gravity can be treated as a fixed classical background. It fails only where quantum effects and strong curvature matter together, at a singularity or at the earliest instant, and that is where the Wheeler–DeWitt equation is needed and where nobody yet has a tested theory.</w:t>
       </w:r>
     </w:p>
     <w:p>
@@ -21996,7 +22275,19 @@
         <w:t>information causality</w:t>
       </w:r>
       <w:r>
-        <w:t xml:space="preserve"> (Pawłowski et al., 2009), an axiom limiting how much one party can learn about another’s data given a bounded message. It recovers Tsirelson’s bound exactly and is widely admired — but it is an adopted principle, not a derived one. Eugenius’s objection is therefore precise rather than rhetorical: a compliance scheme that reads a high correlation score as evidence of held entanglement is secure only if superquantum correlations are unavailable, and their unavailability rests on an axiom whose status in an edited vacuum nobody has established.</w:t>
+        <w:t xml:space="preserve"> (</w:t>
+      </w:r>
+      <w:hyperlink w:anchor="bib_pawlowski2009" w:history="1">
+        <w:r>
+          <w:rPr>
+            <w:color w:val="0563C1"/>
+            <w:u w:val="single"/>
+          </w:rPr>
+          <w:t xml:space="preserve">Pawłowski et al., 2009</w:t>
+        </w:r>
+      </w:hyperlink>
+      <w:r>
+        <w:t xml:space="preserve">), an axiom limiting how much one party can learn about another’s data given a bounded message. It recovers Tsirelson’s bound exactly and is widely admired — but it is an adopted principle, not a derived one. Eugenius’s objection is therefore precise rather than rhetorical: a compliance scheme that reads a high correlation score as evidence of held entanglement is secure only if superquantum correlations are unavailable, and their unavailability rests on an axiom whose status in an edited vacuum nobody has established.</w:t>
       </w:r>
     </w:p>
     <w:p>
@@ -22103,13 +22394,17 @@
       <w:r>
         <w:t xml:space="preserve"> The </w:t>
       </w:r>
-      <w:r>
-        <w:rPr>
-          <w:b/>
-          <w:bCs/>
-        </w:rPr>
-        <w:t>Page–Wootters</w:t>
-      </w:r>
+      <w:hyperlink w:anchor="bib_pagewootters1983" w:history="1">
+        <w:r>
+          <w:rPr>
+            <w:b/>
+            <w:bCs/>
+            <w:color w:val="0563C1"/>
+            <w:u w:val="single"/>
+          </w:rPr>
+          <w:t xml:space="preserve">Page–Wootters</w:t>
+        </w:r>
+      </w:hyperlink>
       <w:r>
         <w:t xml:space="preserve"> construction (1983) shows how to recover ordinary dynamics from a globally stationary state: partition the system into a clock and a remainder, and consider the remainder’s state </w:t>
       </w:r>
@@ -22121,7 +22416,19 @@
         <w:t>conditioned</w:t>
       </w:r>
       <w:r>
-        <w:t xml:space="preserve"> on the clock reading t. That conditional state satisfies the standard Schrödinger equation exactly. Time emerges as entanglement between clock and world rather than as a background parameter, and the scheme has been demonstrated in photonic simulations (Moreva et al., 2014). Barbour’s metaphysics is contested; this mechanism is not.</w:t>
+        <w:t xml:space="preserve"> on the clock reading t. That conditional state satisfies the standard Schrödinger equation exactly. Time emerges as entanglement between clock and world rather than as a background parameter, and the scheme has been demonstrated in photonic simulations (</w:t>
+      </w:r>
+      <w:hyperlink w:anchor="bib_moreva2014" w:history="1">
+        <w:r>
+          <w:rPr>
+            <w:color w:val="0563C1"/>
+            <w:u w:val="single"/>
+          </w:rPr>
+          <w:t xml:space="preserve">Moreva et al., 2014</w:t>
+        </w:r>
+      </w:hyperlink>
+      <w:r>
+        <w:t xml:space="preserve">). Barbour’s metaphysics is contested; this mechanism is not.</w:t>
       </w:r>
     </w:p>
     <w:p>
@@ -22817,8 +23124,17 @@
           <w:numId w:val="16"/>
         </w:numPr>
       </w:pPr>
-      <w:r>
-        <w:t>Weinberg’s 1987 anthropic bound on vacuum energy anticipated the 1998 measurement within one to two orders of magnitude.</w:t>
+      <w:hyperlink w:anchor="bib_weinberg1987" w:history="1">
+        <w:r>
+          <w:rPr>
+            <w:color w:val="0563C1"/>
+            <w:u w:val="single"/>
+          </w:rPr>
+          <w:t xml:space="preserve">Weinberg’s 1987</w:t>
+        </w:r>
+      </w:hyperlink>
+      <w:r>
+        <w:t xml:space="preserve"> anthropic bound on vacuum energy anticipated the 1998 measurement within one to two orders of magnitude.</w:t>
       </w:r>
     </w:p>
     <w:p>
@@ -23075,8 +23391,55 @@
         <w:t xml:space="preserve"> Maxwell’s 1867 sorting intelligence appears to produce order </w:t>
       </w:r>
       <w:r>
-        <w:lastRenderedPageBreak/>
-        <w:t>without work. Szilard’s 1929 single-molecule engine sharpened it to a rate: k_BT ln 2 of work extractable per bit of information about which side the molecule is on. Landauer (1961) located the compensating cost — not in measurement, but in erasure: resetting one bit of memory dissipates at least k_BT ln 2. Bennett (1982) completed the argument by showing measurement can in principle be performed reversibly, so the demon’s books balance only when it clears its memory. The Landauer bound has since been measured directly in single-particle systems (Bérut et al., 2012), and the demon run in reverse to convert information into work at the predicted efficiency (Toyabe et al., 2010).</w:t>
+        <w:t xml:space="preserve">without work. </w:t>
+      </w:r>
+      <w:hyperlink w:anchor="bib_szilard1929" w:history="1">
+        <w:r>
+          <w:rPr>
+            <w:color w:val="0563C1"/>
+            <w:u w:val="single"/>
+          </w:rPr>
+          <w:t xml:space="preserve">Szilard’s 1929</w:t>
+        </w:r>
+      </w:hyperlink>
+      <w:r>
+        <w:t xml:space="preserve"> single-molecule engine sharpened it to a rate: k_BT ln 2 of work extractable per bit of information about which side the molecule is on. </w:t>
+      </w:r>
+      <w:hyperlink w:anchor="bib_landauer1961" w:history="1">
+        <w:r>
+          <w:rPr>
+            <w:color w:val="0563C1"/>
+            <w:u w:val="single"/>
+          </w:rPr>
+          <w:t xml:space="preserve">Landauer (1961)</w:t>
+        </w:r>
+      </w:hyperlink>
+      <w:r>
+        <w:t xml:space="preserve"> located the compensating cost — not in measurement, but in erasure: resetting one bit of memory dissipates at least k_BT ln 2. </w:t>
+      </w:r>
+      <w:hyperlink w:anchor="bib_bennett1982" w:history="1">
+        <w:r>
+          <w:rPr>
+            <w:color w:val="0563C1"/>
+            <w:u w:val="single"/>
+          </w:rPr>
+          <w:t xml:space="preserve">Bennett (1982)</w:t>
+        </w:r>
+      </w:hyperlink>
+      <w:r>
+        <w:t xml:space="preserve"> completed the argument by showing measurement can in principle be performed reversibly, so the demon’s books balance only when it clears its memory. The Landauer bound has since been measured directly in single-particle systems (</w:t>
+      </w:r>
+      <w:hyperlink w:anchor="bib_berut2012" w:history="1">
+        <w:r>
+          <w:rPr>
+            <w:color w:val="0563C1"/>
+            <w:u w:val="single"/>
+          </w:rPr>
+          <w:t xml:space="preserve">Bérut et al., 2012</w:t>
+        </w:r>
+      </w:hyperlink>
+      <w:r>
+        <w:t xml:space="preserve">), and the demon run in reverse to convert information into work at the predicted efficiency (Toyabe et al., 2010).</w:t>
       </w:r>
     </w:p>
     <w:p>
@@ -23371,7 +23734,19 @@
         <w:t>Kochen–Specker.</w:t>
       </w:r>
       <w:r>
-        <w:t xml:space="preserve"> Kochen and Specker (building on Gleason and on an argument of Bell’s from 1966) proved that it is impossible to assign definite, pre-existing values to all quantum observables simultaneously in a way that respects their algebraic relations — specifically, that preserves functional relationships among commuting observables. The result is:</w:t>
+        <w:t xml:space="preserve"> </w:t>
+      </w:r>
+      <w:hyperlink w:anchor="bib_ks1967" w:history="1">
+        <w:r>
+          <w:rPr>
+            <w:color w:val="0563C1"/>
+            <w:u w:val="single"/>
+          </w:rPr>
+          <w:t xml:space="preserve">Kochen and Specker</w:t>
+        </w:r>
+      </w:hyperlink>
+      <w:r>
+        <w:t xml:space="preserve"> (building on Gleason and on an argument of Bell’s from 1966) proved that it is impossible to assign definite, pre-existing values to all quantum observables simultaneously in a way that respects their algebraic relations — specifically, that preserves functional relationships among commuting observables. The result is:</w:t>
       </w:r>
     </w:p>
     <w:p>
@@ -23478,7 +23853,19 @@
         <w:t>The Esaki (tunnel) diode.</w:t>
       </w:r>
       <w:r>
-        <w:t xml:space="preserve"> (Dr Arakawa is invented; the diode, its date and its inventor are not.) Leo Esaki, working at Sony (then Tokyo Tsushin Kogyo) in 1957, discovered that in an extremely heavily doped p-n junction — with a depletion region only a few nanometres wide — the forward current first rises, then falls as the voltage increases: a region of negative differential resistance that no thermionic or diffusion mechanism predicts. (The same junctions also conduct strongly under small reverse bias.) He correctly identified the cause as quantum mechanical tunnelling of electrons through the narrow potential barrier of the junction, with the current falling once the filled states on one side no longer line up with empty states on the other, work for which he shared the 1973 Nobel Prize in Physics with Ivar Giaever and Brian Josephson. Tunnel diodes remain in use for high-frequency oscillators and detectors precisely because tunnelling is a fast, direct quantum process with no classical transit time in the barrier region.</w:t>
+        <w:t xml:space="preserve"> (Dr Arakawa is invented; the diode, its date and its inventor are not.) </w:t>
+      </w:r>
+      <w:hyperlink w:anchor="bib_esaki1958" w:history="1">
+        <w:r>
+          <w:rPr>
+            <w:color w:val="0563C1"/>
+            <w:u w:val="single"/>
+          </w:rPr>
+          <w:t xml:space="preserve">Leo Esaki</w:t>
+        </w:r>
+      </w:hyperlink>
+      <w:r>
+        <w:t xml:space="preserve">, working at Sony (then Tokyo Tsushin Kogyo) in 1957, discovered that in an extremely heavily doped p-n junction — with a depletion region only a few nanometres wide — the forward current first rises, then falls as the voltage increases: a region of negative differential resistance that no thermionic or diffusion mechanism predicts. (The same junctions also conduct strongly under small reverse bias.) He correctly identified the cause as quantum mechanical tunnelling of electrons through the narrow potential barrier of the junction, with the current falling once the filled states on one side no longer line up with empty states on the other, work for which he shared the 1973 Nobel Prize in Physics with Ivar Giaever and Brian Josephson. Tunnel diodes remain in use for high-frequency oscillators and detectors precisely because tunnelling is a fast, direct quantum process with no classical transit time in the barrier region.</w:t>
       </w:r>
     </w:p>
     <w:p>
@@ -23893,7 +24280,19 @@
         <w:t>Schwarzschild’s actual history.</w:t>
       </w:r>
       <w:r>
-        <w:t xml:space="preserve"> Karl Schwarzschild, an astronomer serving as a German artillery lieutenant on the Eastern Front, found the first exact solution to Einstein’s field equations in December 1915, for the spacetime around a single non-rotating point mass — remarkable because Einstein himself had only produced an approximate solution weeks earlier. Schwarzschild sent his paper to Einstein, who presented it to the Prussian Academy of Sciences on his behalf. Schwarzschild died in May 1916 of pemphigus, an autoimmune disease, contracted at the front, having continued working on relativity between military duties until close to the end. The chapter’s device — a second, unsent portion of the correspondence — is invention; the man, the timeline, the disease, and the astonishing speed of the result are historical.</w:t>
+        <w:t xml:space="preserve"> Karl Schwarzschild, an astronomer serving as a German artillery lieutenant on the Eastern Front, found the </w:t>
+      </w:r>
+      <w:hyperlink w:anchor="bib_schwarzschild1916" w:history="1">
+        <w:r>
+          <w:rPr>
+            <w:color w:val="0563C1"/>
+            <w:u w:val="single"/>
+          </w:rPr>
+          <w:t xml:space="preserve">first exact solution to Einstein’s field equations</w:t>
+        </w:r>
+      </w:hyperlink>
+      <w:r>
+        <w:t xml:space="preserve"> in December 1915, for the spacetime around a single non-rotating point mass — remarkable because Einstein himself had only produced an approximate solution weeks earlier. Schwarzschild sent his paper to Einstein, who presented it to the Prussian Academy of Sciences on his behalf. Schwarzschild died in May 1916 of pemphigus, an autoimmune disease, contracted at the front, having continued working on relativity between military duties until close to the end. The chapter’s device — a second, unsent portion of the correspondence — is invention; the man, the timeline, the disease, and the astonishing speed of the result are historical.</w:t>
       </w:r>
     </w:p>
     <w:p>
@@ -23908,7 +24307,43 @@
         <w:t>What the solution actually contains.</w:t>
       </w:r>
       <w:r>
-        <w:t xml:space="preserve"> The Schwarzschild metric, in its original coordinates, appears to have a singularity at the Schwarzschild radius r_s = 2GM/c². This is a coordinate artefact, not a physical one — resolved by better coordinate choices (Eddington–Finkelstein, and fully by Kruskal and Szekeres independently in 1960). The maximally extended solution reveals the true global structure: two separate asymptotically flat regions, connected by a throat, joined at a single moment of symmetry. This is the Einstein–Rosen bridge, named for Einstein and Nathan Rosen’s 1935 paper recognising the same structure while attempting (unsuccessfully) to model particles as bridges. It is popularly called a wormhole.</w:t>
+        <w:t xml:space="preserve"> The Schwarzschild metric, in its original coordinates, appears to have a singularity at the Schwarzschild radius r_s = 2GM/c². This is a coordinate artefact, not a physical one — resolved by better coordinate choices (Eddington–Finkelstein, and fully by </w:t>
+      </w:r>
+      <w:hyperlink w:anchor="bib_kruskal1960" w:history="1">
+        <w:r>
+          <w:rPr>
+            <w:color w:val="0563C1"/>
+            <w:u w:val="single"/>
+          </w:rPr>
+          <w:t xml:space="preserve">Kruskal</w:t>
+        </w:r>
+      </w:hyperlink>
+      <w:r>
+        <w:t xml:space="preserve"> and </w:t>
+      </w:r>
+      <w:hyperlink w:anchor="bib_szekeres1960" w:history="1">
+        <w:r>
+          <w:rPr>
+            <w:color w:val="0563C1"/>
+            <w:u w:val="single"/>
+          </w:rPr>
+          <w:t xml:space="preserve">Szekeres</w:t>
+        </w:r>
+      </w:hyperlink>
+      <w:r>
+        <w:t xml:space="preserve"> independently in 1960). The maximally extended solution reveals the true global structure: two separate asymptotically flat regions, connected by a throat, joined at a single moment of symmetry. This is the Einstein–Rosen bridge, named for Einstein and </w:t>
+      </w:r>
+      <w:hyperlink w:anchor="bib_er1935" w:history="1">
+        <w:r>
+          <w:rPr>
+            <w:color w:val="0563C1"/>
+            <w:u w:val="single"/>
+          </w:rPr>
+          <w:t xml:space="preserve">Nathan Rosen’s 1935 paper</w:t>
+        </w:r>
+      </w:hyperlink>
+      <w:r>
+        <w:t xml:space="preserve"> recognising the same structure while attempting (unsuccessfully) to model particles as bridges. It is popularly called a wormhole.</w:t>
       </w:r>
     </w:p>
     <w:p>
@@ -23924,7 +24359,19 @@
         <w:t>Why it cannot be used.</w:t>
       </w:r>
       <w:r>
-        <w:t xml:space="preserve"> The Kruskal extension shows the throat pinching closed in a finite proper time, faster than any signal — let alone any traveller — could cross from one side to the other. The classical, uncharged, non-rotating Einstein–Rosen bridge is a genuine feature of the solved equations and is, simultaneously, provably non-traversable: it closes before anything gets through. This has been understood since Fuller and Wheeler’s 1962 analysis.</w:t>
+        <w:t xml:space="preserve"> The Kruskal extension shows the throat pinching closed in a finite proper time, faster than any signal — let alone any traveller — could cross from one side to the other. The classical, uncharged, non-rotating Einstein–Rosen bridge is a genuine feature of the solved equations and is, simultaneously, provably non-traversable: it closes before anything gets through. This has been understood since </w:t>
+      </w:r>
+      <w:hyperlink w:anchor="bib_fuller1962" w:history="1">
+        <w:r>
+          <w:rPr>
+            <w:color w:val="0563C1"/>
+            <w:u w:val="single"/>
+          </w:rPr>
+          <w:t xml:space="preserve">Fuller and Wheeler’s 1962 analysis</w:t>
+        </w:r>
+      </w:hyperlink>
+      <w:r>
+        <w:t xml:space="preserve">.</w:t>
       </w:r>
     </w:p>
     <w:p>
@@ -24115,7 +24562,31 @@
         <w:t>Measuring the Casimir force.</w:t>
       </w:r>
       <w:r>
-        <w:t xml:space="preserve"> For two ideal parallel mirrors a distance d apart, the Casimir pressure is π²ħc / (240 d⁴). At one micrometre that is about 1.3 millipascals, so a square centimetre of plate feels roughly a ten-millionth of a newton. Casimir predicted it in 1948. The first convincing measurements came half a century later: Lamoreaux (1997) used a torsion pendulum with a sphere and a plate between about 0.6 and 6 micrometres; Mohideen and Roy (1998) used an atomic-force microscope; Bressi and colleagues (2002) managed the much harder parallel-plate geometry. Real plates need corrections for finite conductivity, temperature and surface roughness, each worth a few per cent at these gaps.</w:t>
+        <w:t xml:space="preserve"> For two ideal parallel mirrors a distance d apart, the Casimir pressure is π²ħc / (240 d⁴). At one micrometre that is about 1.3 millipascals, so a square centimetre of plate feels roughly a ten-millionth of a newton. Casimir predicted it in 1948. The first convincing measurements came half a century later: Lamoreaux (1997) used a torsion pendulum with a sphere and a plate between about 0.6 and 6 micrometres; </w:t>
+      </w:r>
+      <w:hyperlink w:anchor="bib_mohideen1998" w:history="1">
+        <w:r>
+          <w:rPr>
+            <w:color w:val="0563C1"/>
+            <w:u w:val="single"/>
+          </w:rPr>
+          <w:t xml:space="preserve">Mohideen and Roy</w:t>
+        </w:r>
+      </w:hyperlink>
+      <w:r>
+        <w:t xml:space="preserve"> (1998) used an atomic-force microscope; </w:t>
+      </w:r>
+      <w:hyperlink w:anchor="bib_bressi2002" w:history="1">
+        <w:r>
+          <w:rPr>
+            <w:color w:val="0563C1"/>
+            <w:u w:val="single"/>
+          </w:rPr>
+          <w:t xml:space="preserve">Bressi and colleagues (2002)</w:t>
+        </w:r>
+      </w:hyperlink>
+      <w:r>
+        <w:t xml:space="preserve"> managed the much harder parallel-plate geometry. Real plates need corrections for finite conductivity, temperature and surface roughness, each worth a few per cent at these gaps.</w:t>
       </w:r>
     </w:p>
     <w:p>
@@ -24380,8 +24851,19 @@
         <w:t xml:space="preserve"> Miss Pike’s ledger is what computer scientists call an append-only or write-once record. Entries can </w:t>
       </w:r>
       <w:r>
-        <w:lastRenderedPageBreak/>
-        <w:t>be added and never changed, so its value as evidence comes from the fact that nobody can edit it afterwards, its keeper included. Modern versions chain each entry to a cryptographic hash of the one before, so that altering any entry breaks every later link; Certificate Transparency, the public log of web security certificates (RFC 6962, 2013), works this way. A bound book in ink is the same idea with a worse search function. The ledger, Jago’s docket and Tengelman’s letter are also three records held by people who never coordinated, which is Chapter Ten’s redundancy test turned round and applied to the Office.</w:t>
+        <w:t xml:space="preserve">be added and never changed, so its value as evidence comes from the fact that nobody can edit it afterwards, its keeper included. Modern versions chain each entry to a cryptographic hash of the one before, so that altering any entry breaks every later link; Certificate Transparency, the public log of web security certificates (</w:t>
+      </w:r>
+      <w:hyperlink w:anchor="bib_rfc6962" w:history="1">
+        <w:r>
+          <w:rPr>
+            <w:color w:val="0563C1"/>
+            <w:u w:val="single"/>
+          </w:rPr>
+          <w:t xml:space="preserve">RFC 6962</w:t>
+        </w:r>
+      </w:hyperlink>
+      <w:r>
+        <w:t xml:space="preserve">, 2013), works this way. A bound book in ink is the same idea with a worse search function. The ledger, Jago’s docket and Tengelman’s letter are also three records held by people who never coordinated, which is Chapter Ten’s redundancy test turned round and applied to the Office.</w:t>
       </w:r>
     </w:p>
     <w:p>
@@ -24870,18 +25352,23 @@
         <w:spacing w:after="120"/>
         <w:ind w:firstLine="0"/>
       </w:pPr>
-      <w:r>
-        <w:t xml:space="preserve">Almheiri, A., Marolf, D., Polchinski, J., and Sully, J. (2012). Black holes: complementarity or firewalls? </w:t>
-      </w:r>
-      <w:hyperlink r:id="rId7">
+      <w:bookmarkStart w:id="800004" w:name="bib_amps2012"/>
+      <w:r>
+        <w:t xml:space="preserve">Almheiri, A., Marolf, D., Polchinski, J., and Sully, J. (2012). </w:t>
+      </w:r>
+      <w:hyperlink r:id="rId7" w:history="1">
         <w:r>
           <w:rPr>
             <w:color w:val="0563C1"/>
             <w:u w:val="single"/>
           </w:rPr>
-          <w:t>arXiv:1207.3123</w:t>
+          <w:t xml:space="preserve">Black holes: complementarity or firewalls?</w:t>
         </w:r>
       </w:hyperlink>
+      <w:r>
+        <w:t xml:space="preserve"> Journal of High Energy Physics, 2013, 62; preprint 2012.</w:t>
+      </w:r>
+      <w:bookmarkEnd w:id="800004"/>
     </w:p>
     <w:p>
       <w:pPr>
@@ -24889,14 +25376,149 @@
         <w:spacing w:after="120"/>
         <w:ind w:firstLine="0"/>
       </w:pPr>
-      <w:r>
-        <w:t>Casimir, H. B. G. (1948). On the attraction between two perfectly conducting plates. Proceedings of the Koninklijke Nederlandse Akademie van Wetenschappen B51, 793–795.</w:t>
-      </w:r>
-    </w:p>
-    <w:p>
-      <w:pPr>
-        <w:pStyle w:val="BodyText"/>
-      </w:pPr>
+      <w:bookmarkStart w:id="800022" w:name="bib_barbour1999"/>
+      <w:r>
+        <w:t xml:space="preserve">Barbour, J. (1999). </w:t>
+      </w:r>
+      <w:hyperlink r:id="rId26" w:history="1">
+        <w:r>
+          <w:rPr>
+            <w:color w:val="0563C1"/>
+            <w:u w:val="single"/>
+          </w:rPr>
+          <w:t xml:space="preserve">The End of Time</w:t>
+        </w:r>
+      </w:hyperlink>
+      <w:r>
+        <w:t xml:space="preserve">. Weidenfeld &amp; Nicolson.</w:t>
+      </w:r>
+      <w:bookmarkEnd w:id="800022"/>
+    </w:p>
+    <w:p>
+      <w:pPr>
+        <w:pStyle w:val="BodyText"/>
+        <w:spacing w:after="120"/>
+        <w:ind w:firstLine="0"/>
+      </w:pPr>
+      <w:bookmarkStart w:id="800023" w:name="bib_bekenstein1972"/>
+      <w:r>
+        <w:t xml:space="preserve">Bekenstein, J. D. (1972). </w:t>
+      </w:r>
+      <w:hyperlink r:id="rId27" w:history="1">
+        <w:r>
+          <w:rPr>
+            <w:color w:val="0563C1"/>
+            <w:u w:val="single"/>
+          </w:rPr>
+          <w:t xml:space="preserve">Black holes and the second law</w:t>
+        </w:r>
+      </w:hyperlink>
+      <w:r>
+        <w:t xml:space="preserve">. Lettere al Nuovo Cimento 4, 737–740.</w:t>
+      </w:r>
+      <w:bookmarkEnd w:id="800023"/>
+    </w:p>
+    <w:p>
+      <w:pPr>
+        <w:pStyle w:val="BodyText"/>
+        <w:spacing w:after="120"/>
+        <w:ind w:firstLine="0"/>
+      </w:pPr>
+      <w:bookmarkStart w:id="800024" w:name="bib_bennett1982"/>
+      <w:r>
+        <w:t xml:space="preserve">Bennett, C. H. (1982). </w:t>
+      </w:r>
+      <w:hyperlink r:id="rId28" w:history="1">
+        <w:r>
+          <w:rPr>
+            <w:color w:val="0563C1"/>
+            <w:u w:val="single"/>
+          </w:rPr>
+          <w:t xml:space="preserve">The thermodynamics of computation: a review</w:t>
+        </w:r>
+      </w:hyperlink>
+      <w:r>
+        <w:t xml:space="preserve">. International Journal of Theoretical Physics 21, 905–940.</w:t>
+      </w:r>
+      <w:bookmarkEnd w:id="800024"/>
+    </w:p>
+    <w:p>
+      <w:pPr>
+        <w:pStyle w:val="BodyText"/>
+        <w:spacing w:after="120"/>
+        <w:ind w:firstLine="0"/>
+      </w:pPr>
+      <w:bookmarkStart w:id="800025" w:name="bib_berut2012"/>
+      <w:r>
+        <w:t xml:space="preserve">Bérut, A., Arakelyan, A., Petrosyan, A., Ciliberto, S., Dillenschneider, R., and Lutz, E. (2012). </w:t>
+      </w:r>
+      <w:hyperlink r:id="rId29" w:history="1">
+        <w:r>
+          <w:rPr>
+            <w:color w:val="0563C1"/>
+            <w:u w:val="single"/>
+          </w:rPr>
+          <w:t xml:space="preserve">Experimental verification of Landauer’s principle linking information and thermodynamics</w:t>
+        </w:r>
+      </w:hyperlink>
+      <w:r>
+        <w:t xml:space="preserve">. Nature 483, 187–189.</w:t>
+      </w:r>
+      <w:bookmarkEnd w:id="800025"/>
+    </w:p>
+    <w:p>
+      <w:pPr>
+        <w:pStyle w:val="BodyText"/>
+        <w:spacing w:after="120"/>
+        <w:ind w:firstLine="0"/>
+      </w:pPr>
+      <w:bookmarkStart w:id="800026" w:name="bib_bressi2002"/>
+      <w:r>
+        <w:t xml:space="preserve">Bressi, G., Carugno, G., Onofrio, R., and Ruoso, G. (2002). </w:t>
+      </w:r>
+      <w:hyperlink r:id="rId30" w:history="1">
+        <w:r>
+          <w:rPr>
+            <w:color w:val="0563C1"/>
+            <w:u w:val="single"/>
+          </w:rPr>
+          <w:t xml:space="preserve">Measurement of the Casimir force between parallel metallic surfaces</w:t>
+        </w:r>
+      </w:hyperlink>
+      <w:r>
+        <w:t xml:space="preserve">. Physical Review Letters 88, 041804.</w:t>
+      </w:r>
+      <w:bookmarkEnd w:id="800026"/>
+    </w:p>
+    <w:p>
+      <w:pPr>
+        <w:pStyle w:val="BodyText"/>
+        <w:spacing w:after="120"/>
+        <w:ind w:firstLine="0"/>
+      </w:pPr>
+      <w:bookmarkStart w:id="800005" w:name="bib_casimir1948"/>
+      <w:r>
+        <w:t xml:space="preserve">Casimir, H. B. G. (1948). </w:t>
+      </w:r>
+      <w:hyperlink r:id="rId18" w:history="1">
+        <w:r>
+          <w:rPr>
+            <w:color w:val="0563C1"/>
+            <w:u w:val="single"/>
+          </w:rPr>
+          <w:t xml:space="preserve">On the attraction between two perfectly conducting plates</w:t>
+        </w:r>
+      </w:hyperlink>
+      <w:r>
+        <w:t xml:space="preserve">. Proceedings of the Koninklijke Nederlandse Akademie van Wetenschappen B51, 793–795.</w:t>
+      </w:r>
+      <w:bookmarkEnd w:id="800005"/>
+    </w:p>
+    <w:p>
+      <w:pPr>
+        <w:pStyle w:val="BodyText"/>
+      </w:pPr>
+      <w:bookmarkStart w:id="800006" w:name="bib_coleman1980"/>
       <w:r>
         <w:t xml:space="preserve">Coleman, S., and De Luccia, F. (1980). </w:t>
       </w:r>
@@ -24912,6 +25534,7 @@
       <w:r>
         <w:t>. Physical Review D 21, 3305–3315.</w:t>
       </w:r>
+      <w:bookmarkEnd w:id="800006"/>
     </w:p>
     <w:p>
       <w:pPr>
@@ -24919,9 +25542,23 @@
         <w:spacing w:after="120"/>
         <w:ind w:firstLine="0"/>
       </w:pPr>
-      <w:r>
-        <w:t>Einstein, A. Letter to Max Born, 4 December 1926. Published in The Born–Einstein Letters.</w:t>
-      </w:r>
+      <w:bookmarkStart w:id="800027" w:name="bib_cubitt2015"/>
+      <w:r>
+        <w:t xml:space="preserve">Cubitt, T. S., Pérez-García, D., and Wolf, M. M. (2015). </w:t>
+      </w:r>
+      <w:hyperlink r:id="rId31" w:history="1">
+        <w:r>
+          <w:rPr>
+            <w:color w:val="0563C1"/>
+            <w:u w:val="single"/>
+          </w:rPr>
+          <w:t xml:space="preserve">Undecidability of the spectral gap</w:t>
+        </w:r>
+      </w:hyperlink>
+      <w:r>
+        <w:t xml:space="preserve">. Nature 528, 207–211.</w:t>
+      </w:r>
+      <w:bookmarkEnd w:id="800027"/>
     </w:p>
     <w:p>
       <w:pPr>
@@ -24929,6 +25566,55 @@
         <w:spacing w:after="120"/>
         <w:ind w:firstLine="0"/>
       </w:pPr>
+      <w:bookmarkStart w:id="800007" w:name="bib_einstein1926"/>
+      <w:r>
+        <w:t xml:space="preserve">Einstein, A. Letter to Max Born, 4 December 1926. Published in </w:t>
+      </w:r>
+      <w:hyperlink r:id="rId19" w:history="1">
+        <w:r>
+          <w:rPr>
+            <w:color w:val="0563C1"/>
+            <w:u w:val="single"/>
+          </w:rPr>
+          <w:t xml:space="preserve">The Born–Einstein Letters</w:t>
+        </w:r>
+      </w:hyperlink>
+      <w:r>
+        <w:t xml:space="preserve">.</w:t>
+      </w:r>
+      <w:bookmarkEnd w:id="800007"/>
+    </w:p>
+    <w:p>
+      <w:pPr>
+        <w:pStyle w:val="BodyText"/>
+        <w:spacing w:after="120"/>
+        <w:ind w:firstLine="0"/>
+      </w:pPr>
+      <w:bookmarkStart w:id="800028" w:name="bib_er1935"/>
+      <w:r>
+        <w:t xml:space="preserve">Einstein, A., and Rosen, N. (1935). </w:t>
+      </w:r>
+      <w:hyperlink r:id="rId32" w:history="1">
+        <w:r>
+          <w:rPr>
+            <w:color w:val="0563C1"/>
+            <w:u w:val="single"/>
+          </w:rPr>
+          <w:t xml:space="preserve">The particle problem in the general theory of relativity</w:t>
+        </w:r>
+      </w:hyperlink>
+      <w:r>
+        <w:t xml:space="preserve">. Physical Review 48, 73–77.</w:t>
+      </w:r>
+      <w:bookmarkEnd w:id="800028"/>
+    </w:p>
+    <w:p>
+      <w:pPr>
+        <w:pStyle w:val="BodyText"/>
+        <w:spacing w:after="120"/>
+        <w:ind w:firstLine="0"/>
+      </w:pPr>
+      <w:bookmarkStart w:id="800008" w:name="bib_epr1935"/>
       <w:r>
         <w:t xml:space="preserve">Einstein, A., Podolsky, B., and Rosen, N. (1935). </w:t>
       </w:r>
@@ -24944,11 +25630,13 @@
       <w:r>
         <w:t xml:space="preserve"> Physical Review 47, 777–780.</w:t>
       </w:r>
-    </w:p>
-    <w:p>
-      <w:pPr>
-        <w:pStyle w:val="BodyText"/>
-      </w:pPr>
+      <w:bookmarkEnd w:id="800008"/>
+    </w:p>
+    <w:p>
+      <w:pPr>
+        <w:pStyle w:val="BodyText"/>
+      </w:pPr>
+      <w:bookmarkStart w:id="800009" w:name="bib_esaki1958"/>
       <w:r>
         <w:t xml:space="preserve">Esaki, L. (1958). </w:t>
       </w:r>
@@ -24964,6 +25652,7 @@
       <w:r>
         <w:t>. Physical Review 109, 603–604.</w:t>
       </w:r>
+      <w:bookmarkEnd w:id="800009"/>
     </w:p>
     <w:p>
       <w:pPr>
@@ -24995,6 +25684,7 @@
         <w:spacing w:after="120"/>
         <w:ind w:firstLine="0"/>
       </w:pPr>
+      <w:bookmarkStart w:id="800010" w:name="bib_fuller1962"/>
       <w:r>
         <w:t xml:space="preserve">Fuller, R. W., and Wheeler, J. A. (1962). </w:t>
       </w:r>
@@ -25010,6 +25700,7 @@
       <w:r>
         <w:t>. Physical Review 128, 919–929.</w:t>
       </w:r>
+      <w:bookmarkEnd w:id="800010"/>
     </w:p>
     <w:p>
       <w:pPr>
@@ -25017,9 +25708,23 @@
         <w:spacing w:after="120"/>
         <w:ind w:firstLine="0"/>
       </w:pPr>
-      <w:r>
-        <w:t>Gödel, K. (1931). On formally undecidable propositions of Principia Mathematica and related systems. Monatshefte für Mathematik und Physik 38, 173–198.</w:t>
-      </w:r>
+      <w:bookmarkStart w:id="800011" w:name="bib_godel1931"/>
+      <w:r>
+        <w:t xml:space="preserve">Gödel, K. (1931). </w:t>
+      </w:r>
+      <w:hyperlink r:id="rId20" w:history="1">
+        <w:r>
+          <w:rPr>
+            <w:color w:val="0563C1"/>
+            <w:u w:val="single"/>
+          </w:rPr>
+          <w:t xml:space="preserve">On formally undecidable propositions of Principia Mathematica and related systems</w:t>
+        </w:r>
+      </w:hyperlink>
+      <w:r>
+        <w:t xml:space="preserve">. Monatshefte für Mathematik und Physik 38, 173–198.</w:t>
+      </w:r>
+      <w:bookmarkEnd w:id="800011"/>
     </w:p>
     <w:p>
       <w:pPr>
@@ -25027,9 +25732,23 @@
         <w:spacing w:after="120"/>
         <w:ind w:firstLine="0"/>
       </w:pPr>
-      <w:r>
-        <w:t>Hamming, R. W. (1980). The unreasonable effectiveness of mathematics. The American Mathematical Monthly 87, 81–90.</w:t>
-      </w:r>
+      <w:bookmarkStart w:id="800012" w:name="bib_hamming1980"/>
+      <w:r>
+        <w:t xml:space="preserve">Hamming, R. W. (1980). </w:t>
+      </w:r>
+      <w:hyperlink r:id="rId21" w:history="1">
+        <w:r>
+          <w:rPr>
+            <w:color w:val="0563C1"/>
+            <w:u w:val="single"/>
+          </w:rPr>
+          <w:t xml:space="preserve">The unreasonable effectiveness of mathematics</w:t>
+        </w:r>
+      </w:hyperlink>
+      <w:r>
+        <w:t xml:space="preserve">. The American Mathematical Monthly 87, 81–90.</w:t>
+      </w:r>
+      <w:bookmarkEnd w:id="800012"/>
     </w:p>
     <w:p>
       <w:pPr>
@@ -25037,10 +25756,23 @@
         <w:spacing w:after="120"/>
         <w:ind w:firstLine="0"/>
       </w:pPr>
-      <w:r>
-        <w:lastRenderedPageBreak/>
-        <w:t>Hofstadter, D. (1979). Gödel, Escher, Bach: an Eternal Golden Braid. Basic Books.</w:t>
-      </w:r>
+      <w:bookmarkStart w:id="800029" w:name="bib_hawking1974"/>
+      <w:r>
+        <w:t xml:space="preserve">Hawking, S. W. (1974). </w:t>
+      </w:r>
+      <w:hyperlink r:id="rId33" w:history="1">
+        <w:r>
+          <w:rPr>
+            <w:color w:val="0563C1"/>
+            <w:u w:val="single"/>
+          </w:rPr>
+          <w:t xml:space="preserve">Black hole explosions?</w:t>
+        </w:r>
+      </w:hyperlink>
+      <w:r>
+        <w:t xml:space="preserve"> Nature 248, 30–31.</w:t>
+      </w:r>
+      <w:bookmarkEnd w:id="800029"/>
     </w:p>
     <w:p>
       <w:pPr>
@@ -25048,9 +25780,23 @@
         <w:spacing w:after="120"/>
         <w:ind w:firstLine="0"/>
       </w:pPr>
-      <w:r>
-        <w:t>Kruskal, M. D. (1960). Maximal extension of Schwarzschild metric. Physical Review 119, 1743–1745.</w:t>
-      </w:r>
+      <w:bookmarkStart w:id="800013" w:name="bib_hofstadter1979"/>
+      <w:r>
+        <w:t xml:space="preserve">Hofstadter, D. (1979). </w:t>
+      </w:r>
+      <w:hyperlink r:id="rId22" w:history="1">
+        <w:r>
+          <w:rPr>
+            <w:color w:val="0563C1"/>
+            <w:u w:val="single"/>
+          </w:rPr>
+          <w:t xml:space="preserve">Gödel, Escher, Bach: an Eternal Golden Braid</w:t>
+        </w:r>
+      </w:hyperlink>
+      <w:r>
+        <w:t xml:space="preserve">. Basic Books.</w:t>
+      </w:r>
+      <w:bookmarkEnd w:id="800013"/>
     </w:p>
     <w:p>
       <w:pPr>
@@ -25058,6 +25804,79 @@
         <w:spacing w:after="120"/>
         <w:ind w:firstLine="0"/>
       </w:pPr>
+      <w:bookmarkStart w:id="800030" w:name="bib_ji2020"/>
+      <w:r>
+        <w:t xml:space="preserve">Ji, Z., Natarajan, A., Vidick, T., Wright, J., and Yuen, H. (2020). </w:t>
+      </w:r>
+      <w:hyperlink r:id="rId34" w:history="1">
+        <w:r>
+          <w:rPr>
+            <w:color w:val="0563C1"/>
+            <w:u w:val="single"/>
+          </w:rPr>
+          <w:t xml:space="preserve">MIP* = RE</w:t>
+        </w:r>
+      </w:hyperlink>
+      <w:r>
+        <w:t xml:space="preserve">. Preprint.</w:t>
+      </w:r>
+      <w:bookmarkEnd w:id="800030"/>
+    </w:p>
+    <w:p>
+      <w:pPr>
+        <w:pStyle w:val="BodyText"/>
+        <w:spacing w:after="120"/>
+        <w:ind w:firstLine="0"/>
+      </w:pPr>
+      <w:bookmarkStart w:id="800031" w:name="bib_ks1967"/>
+      <w:r>
+        <w:t xml:space="preserve">Kochen, S., and Specker, E. P. (1967). </w:t>
+      </w:r>
+      <w:hyperlink r:id="rId35" w:history="1">
+        <w:r>
+          <w:rPr>
+            <w:color w:val="0563C1"/>
+            <w:u w:val="single"/>
+          </w:rPr>
+          <w:t xml:space="preserve">The problem of hidden variables in quantum mechanics</w:t>
+        </w:r>
+      </w:hyperlink>
+      <w:r>
+        <w:t xml:space="preserve">. Journal of Mathematics and Mechanics 17, 59–87.</w:t>
+      </w:r>
+      <w:bookmarkEnd w:id="800031"/>
+    </w:p>
+    <w:p>
+      <w:pPr>
+        <w:pStyle w:val="BodyText"/>
+        <w:spacing w:after="120"/>
+        <w:ind w:firstLine="0"/>
+      </w:pPr>
+      <w:bookmarkStart w:id="800014" w:name="bib_kruskal1960"/>
+      <w:r>
+        <w:t xml:space="preserve">Kruskal, M. D. (1960). </w:t>
+      </w:r>
+      <w:hyperlink r:id="rId23" w:history="1">
+        <w:r>
+          <w:rPr>
+            <w:color w:val="0563C1"/>
+            <w:u w:val="single"/>
+          </w:rPr>
+          <w:t xml:space="preserve">Maximal extension of Schwarzschild metric</w:t>
+        </w:r>
+      </w:hyperlink>
+      <w:r>
+        <w:t xml:space="preserve">. Physical Review 119, 1743–1745.</w:t>
+      </w:r>
+      <w:bookmarkEnd w:id="800014"/>
+    </w:p>
+    <w:p>
+      <w:pPr>
+        <w:pStyle w:val="BodyText"/>
+        <w:spacing w:after="120"/>
+        <w:ind w:firstLine="0"/>
+      </w:pPr>
+      <w:bookmarkStart w:id="800015" w:name="bib_lamoreaux1997"/>
       <w:r>
         <w:t xml:space="preserve">Lamoreaux, S. K. (1997). </w:t>
       </w:r>
@@ -25073,6 +25892,7 @@
       <w:r>
         <w:t>. Physical Review Letters 78, 5–8.</w:t>
       </w:r>
+      <w:bookmarkEnd w:id="800015"/>
     </w:p>
     <w:p>
       <w:pPr>
@@ -25080,6 +25900,7 @@
         <w:spacing w:after="120"/>
         <w:ind w:firstLine="0"/>
       </w:pPr>
+      <w:bookmarkStart w:id="800016" w:name="bib_landauer1961"/>
       <w:r>
         <w:t xml:space="preserve">Landauer, R. (1961). </w:t>
       </w:r>
@@ -25095,6 +25916,127 @@
       <w:r>
         <w:t>. IBM Journal of Research and Development 5, 183–191.</w:t>
       </w:r>
+      <w:bookmarkEnd w:id="800016"/>
+    </w:p>
+    <w:p>
+      <w:pPr>
+        <w:pStyle w:val="BodyText"/>
+        <w:spacing w:after="120"/>
+        <w:ind w:firstLine="0"/>
+      </w:pPr>
+      <w:bookmarkStart w:id="800032" w:name="bib_rfc6962"/>
+      <w:r>
+        <w:t xml:space="preserve">Laurie, B., Langley, A., and Kasper, E. (2013). </w:t>
+      </w:r>
+      <w:hyperlink r:id="rId36" w:history="1">
+        <w:r>
+          <w:rPr>
+            <w:color w:val="0563C1"/>
+            <w:u w:val="single"/>
+          </w:rPr>
+          <w:t xml:space="preserve">Certificate Transparency</w:t>
+        </w:r>
+      </w:hyperlink>
+      <w:r>
+        <w:t xml:space="preserve">. RFC 6962, Internet Engineering Task Force.</w:t>
+      </w:r>
+      <w:bookmarkEnd w:id="800032"/>
+    </w:p>
+    <w:p>
+      <w:pPr>
+        <w:pStyle w:val="BodyText"/>
+        <w:spacing w:after="120"/>
+        <w:ind w:firstLine="0"/>
+      </w:pPr>
+      <w:bookmarkStart w:id="800033" w:name="bib_loftus1974"/>
+      <w:r>
+        <w:t xml:space="preserve">Loftus, E. F., and Palmer, J. C. (1974). </w:t>
+      </w:r>
+      <w:hyperlink r:id="rId37" w:history="1">
+        <w:r>
+          <w:rPr>
+            <w:color w:val="0563C1"/>
+            <w:u w:val="single"/>
+          </w:rPr>
+          <w:t xml:space="preserve">Reconstruction of automobile destruction: an example of the interaction between language and memory</w:t>
+        </w:r>
+      </w:hyperlink>
+      <w:r>
+        <w:t xml:space="preserve">80011-3). Journal of Verbal Learning and Verbal Behavior 13, 585–589.</w:t>
+      </w:r>
+      <w:bookmarkEnd w:id="800033"/>
+    </w:p>
+    <w:p>
+      <w:pPr>
+        <w:pStyle w:val="BodyText"/>
+        <w:spacing w:after="120"/>
+        <w:ind w:firstLine="0"/>
+      </w:pPr>
+      <w:bookmarkStart w:id="800034" w:name="bib_maldacena1997"/>
+      <w:r>
+        <w:t xml:space="preserve">Maldacena, J. (1997). </w:t>
+      </w:r>
+      <w:hyperlink r:id="rId38" w:history="1">
+        <w:r>
+          <w:rPr>
+            <w:color w:val="0563C1"/>
+            <w:u w:val="single"/>
+          </w:rPr>
+          <w:t xml:space="preserve">The large N limit of superconformal field theories and supergravity</w:t>
+        </w:r>
+      </w:hyperlink>
+      <w:r>
+        <w:t xml:space="preserve">. Advances in Theoretical and Mathematical Physics 2 (1998), 231–252.</w:t>
+      </w:r>
+      <w:bookmarkEnd w:id="800034"/>
+    </w:p>
+    <w:p>
+      <w:pPr>
+        <w:pStyle w:val="BodyText"/>
+        <w:spacing w:after="120"/>
+        <w:ind w:firstLine="0"/>
+      </w:pPr>
+      <w:bookmarkStart w:id="800035" w:name="bib_mohideen1998"/>
+      <w:r>
+        <w:t xml:space="preserve">Mohideen, U., and Roy, A. (1998). </w:t>
+      </w:r>
+      <w:hyperlink r:id="rId39" w:history="1">
+        <w:r>
+          <w:rPr>
+            <w:color w:val="0563C1"/>
+            <w:u w:val="single"/>
+          </w:rPr>
+          <w:t xml:space="preserve">Precision measurement of the Casimir force from 0.1 to 0.9 μm</w:t>
+        </w:r>
+      </w:hyperlink>
+      <w:r>
+        <w:t xml:space="preserve">. Physical Review Letters 81, 4549–4552.</w:t>
+      </w:r>
+      <w:bookmarkEnd w:id="800035"/>
+    </w:p>
+    <w:p>
+      <w:pPr>
+        <w:pStyle w:val="BodyText"/>
+        <w:spacing w:after="120"/>
+        <w:ind w:firstLine="0"/>
+      </w:pPr>
+      <w:bookmarkStart w:id="800036" w:name="bib_moreva2014"/>
+      <w:r>
+        <w:t xml:space="preserve">Moreva, E., Brida, G., Gramegna, M., Giovannetti, V., Maccone, L., and Genovese, M. (2014). </w:t>
+      </w:r>
+      <w:hyperlink r:id="rId40" w:history="1">
+        <w:r>
+          <w:rPr>
+            <w:color w:val="0563C1"/>
+            <w:u w:val="single"/>
+          </w:rPr>
+          <w:t xml:space="preserve">Time from quantum entanglement: an experimental illustration</w:t>
+        </w:r>
+      </w:hyperlink>
+      <w:r>
+        <w:t xml:space="preserve">. Physical Review A 89, 052122.</w:t>
+      </w:r>
+      <w:bookmarkEnd w:id="800036"/>
     </w:p>
     <w:p>
       <w:pPr>
@@ -25123,17 +26065,56 @@
     <w:p>
       <w:pPr>
         <w:pStyle w:val="BodyText"/>
-      </w:pPr>
-      <w:r>
-        <w:t>Nash, J. (1951). Non-cooperative games. Annals of Mathematics 54, 286–295.</w:t>
-      </w:r>
-    </w:p>
-    <w:p>
-      <w:pPr>
-        <w:pStyle w:val="BodyText"/>
         <w:spacing w:after="120"/>
         <w:ind w:firstLine="0"/>
       </w:pPr>
+      <w:bookmarkStart w:id="800037" w:name="bib_nash1950"/>
+      <w:r>
+        <w:t xml:space="preserve">Nash, J. (1950). </w:t>
+      </w:r>
+      <w:hyperlink r:id="rId41" w:history="1">
+        <w:r>
+          <w:rPr>
+            <w:color w:val="0563C1"/>
+            <w:u w:val="single"/>
+          </w:rPr>
+          <w:t xml:space="preserve">Equilibrium points in n-person games</w:t>
+        </w:r>
+      </w:hyperlink>
+      <w:r>
+        <w:t xml:space="preserve">. Proceedings of the National Academy of Sciences 36, 48–49.</w:t>
+      </w:r>
+      <w:bookmarkEnd w:id="800037"/>
+    </w:p>
+    <w:p>
+      <w:pPr>
+        <w:pStyle w:val="BodyText"/>
+      </w:pPr>
+      <w:bookmarkStart w:id="800017" w:name="bib_nash1951"/>
+      <w:r>
+        <w:t xml:space="preserve">Nash, J. (1951). </w:t>
+      </w:r>
+      <w:hyperlink r:id="rId24" w:history="1">
+        <w:r>
+          <w:rPr>
+            <w:color w:val="0563C1"/>
+            <w:u w:val="single"/>
+          </w:rPr>
+          <w:t xml:space="preserve">Non-cooperative games</w:t>
+        </w:r>
+      </w:hyperlink>
+      <w:r>
+        <w:t xml:space="preserve">. Annals of Mathematics 54, 286–295.</w:t>
+      </w:r>
+      <w:bookmarkEnd w:id="800017"/>
+    </w:p>
+    <w:p>
+      <w:pPr>
+        <w:pStyle w:val="BodyText"/>
+        <w:spacing w:after="120"/>
+        <w:ind w:firstLine="0"/>
+      </w:pPr>
+      <w:bookmarkStart w:id="800018" w:name="bib_page1993"/>
       <w:r>
         <w:t xml:space="preserve">Page, D. N. (1993). </w:t>
       </w:r>
@@ -25149,6 +26130,7 @@
       <w:r>
         <w:t>. Physical Review Letters 71, 3743–3746.</w:t>
       </w:r>
+      <w:bookmarkEnd w:id="800018"/>
     </w:p>
     <w:p>
       <w:pPr>
@@ -25156,9 +26138,119 @@
         <w:spacing w:after="120"/>
         <w:ind w:firstLine="0"/>
       </w:pPr>
-      <w:r>
-        <w:t>Schwarzschild, K. (1916). On the gravitational field of a mass point according to Einstein’s theory. Sitzungsberichte der Königlich Preussischen Akademie der Wissenschaften, 189–196.</w:t>
-      </w:r>
+      <w:bookmarkStart w:id="800038" w:name="bib_pagewootters1983"/>
+      <w:r>
+        <w:t xml:space="preserve">Page, D. N., and Wootters, W. K. (1983). </w:t>
+      </w:r>
+      <w:hyperlink r:id="rId42" w:history="1">
+        <w:r>
+          <w:rPr>
+            <w:color w:val="0563C1"/>
+            <w:u w:val="single"/>
+          </w:rPr>
+          <w:t xml:space="preserve">Evolution without evolution: dynamics described by stationary observables</w:t>
+        </w:r>
+      </w:hyperlink>
+      <w:r>
+        <w:t xml:space="preserve">. Physical Review D 27, 2885–2892.</w:t>
+      </w:r>
+      <w:bookmarkEnd w:id="800038"/>
+    </w:p>
+    <w:p>
+      <w:pPr>
+        <w:pStyle w:val="BodyText"/>
+        <w:spacing w:after="120"/>
+        <w:ind w:firstLine="0"/>
+      </w:pPr>
+      <w:bookmarkStart w:id="800039" w:name="bib_pawlowski2009"/>
+      <w:r>
+        <w:t xml:space="preserve">Pawłowski, M., Paterek, T., Kaszlikowski, D., Scarani, V., Winter, A., and Żukowski, M. (2009). </w:t>
+      </w:r>
+      <w:hyperlink r:id="rId43" w:history="1">
+        <w:r>
+          <w:rPr>
+            <w:color w:val="0563C1"/>
+            <w:u w:val="single"/>
+          </w:rPr>
+          <w:t xml:space="preserve">Information causality as a physical principle</w:t>
+        </w:r>
+      </w:hyperlink>
+      <w:r>
+        <w:t xml:space="preserve">. Nature 461, 1101–1104.</w:t>
+      </w:r>
+      <w:bookmarkEnd w:id="800039"/>
+    </w:p>
+    <w:p>
+      <w:pPr>
+        <w:pStyle w:val="BodyText"/>
+        <w:spacing w:after="120"/>
+        <w:ind w:firstLine="0"/>
+      </w:pPr>
+      <w:bookmarkStart w:id="800040" w:name="bib_pr1994"/>
+      <w:r>
+        <w:t xml:space="preserve">Popescu, S., and Rohrlich, D. (1994). </w:t>
+      </w:r>
+      <w:hyperlink r:id="rId44" w:history="1">
+        <w:r>
+          <w:rPr>
+            <w:color w:val="0563C1"/>
+            <w:u w:val="single"/>
+          </w:rPr>
+          <w:t xml:space="preserve">Quantum nonlocality as an axiom</w:t>
+        </w:r>
+      </w:hyperlink>
+      <w:r>
+        <w:t xml:space="preserve">. Foundations of Physics 24, 379–385.</w:t>
+      </w:r>
+      <w:bookmarkEnd w:id="800040"/>
+    </w:p>
+    <w:p>
+      <w:pPr>
+        <w:pStyle w:val="BodyText"/>
+        <w:spacing w:after="120"/>
+        <w:ind w:firstLine="0"/>
+      </w:pPr>
+      <w:bookmarkStart w:id="800041" w:name="bib_robertson1929"/>
+      <w:r>
+        <w:t xml:space="preserve">Robertson, H. P. (1929). </w:t>
+      </w:r>
+      <w:hyperlink r:id="rId45" w:history="1">
+        <w:r>
+          <w:rPr>
+            <w:color w:val="0563C1"/>
+            <w:u w:val="single"/>
+          </w:rPr>
+          <w:t xml:space="preserve">The uncertainty principle</w:t>
+        </w:r>
+      </w:hyperlink>
+      <w:r>
+        <w:t xml:space="preserve">. Physical Review 34, 163–164.</w:t>
+      </w:r>
+      <w:bookmarkEnd w:id="800041"/>
+    </w:p>
+    <w:p>
+      <w:pPr>
+        <w:pStyle w:val="BodyText"/>
+        <w:spacing w:after="120"/>
+        <w:ind w:firstLine="0"/>
+      </w:pPr>
+      <w:bookmarkStart w:id="800019" w:name="bib_schwarzschild1916"/>
+      <w:r>
+        <w:t xml:space="preserve">Schwarzschild, K. (1916). On the gravitational field of a mass point according to Einstein’s theory. Sitzungsberichte der Königlich Preussischen Akademie der Wissenschaften, 189–196. </w:t>
+      </w:r>
+      <w:hyperlink r:id="rId25" w:history="1">
+        <w:r>
+          <w:rPr>
+            <w:color w:val="0563C1"/>
+            <w:u w:val="single"/>
+          </w:rPr>
+          <w:t xml:space="preserve">English translation</w:t>
+        </w:r>
+      </w:hyperlink>
+      <w:r>
+        <w:t xml:space="preserve">, 1999.</w:t>
+      </w:r>
+      <w:bookmarkEnd w:id="800019"/>
     </w:p>
     <w:p>
       <w:pPr>
@@ -25190,9 +26282,23 @@
         <w:spacing w:after="120"/>
         <w:ind w:firstLine="0"/>
       </w:pPr>
-      <w:r>
-        <w:t>Szekeres, G. (1960). On the singularities of a Riemannian manifold. Publicationes Mathematicae Debrecen 7, 285–301.</w:t>
-      </w:r>
+      <w:bookmarkStart w:id="800042" w:name="bib_stu1993"/>
+      <w:r>
+        <w:t xml:space="preserve">Susskind, L., Thorlacius, L., and Uglum, J. (1993). </w:t>
+      </w:r>
+      <w:hyperlink r:id="rId46" w:history="1">
+        <w:r>
+          <w:rPr>
+            <w:color w:val="0563C1"/>
+            <w:u w:val="single"/>
+          </w:rPr>
+          <w:t xml:space="preserve">The stretched horizon and black hole complementarity</w:t>
+        </w:r>
+      </w:hyperlink>
+      <w:r>
+        <w:t xml:space="preserve">. Physical Review D 48, 3743–3761.</w:t>
+      </w:r>
+      <w:bookmarkEnd w:id="800042"/>
     </w:p>
     <w:p>
       <w:pPr>
@@ -25200,6 +26306,67 @@
         <w:spacing w:after="120"/>
         <w:ind w:firstLine="0"/>
       </w:pPr>
+      <w:bookmarkStart w:id="800020" w:name="bib_szekeres1960"/>
+      <w:r>
+        <w:t>Szekeres, G. (1960). On the singularities of a Riemannian manifold. Publicationes Mathematicae Debrecen 7, 285–301.</w:t>
+      </w:r>
+      <w:bookmarkEnd w:id="800020"/>
+    </w:p>
+    <w:p>
+      <w:pPr>
+        <w:pStyle w:val="BodyText"/>
+        <w:spacing w:after="120"/>
+        <w:ind w:firstLine="0"/>
+      </w:pPr>
+      <w:bookmarkStart w:id="800043" w:name="bib_szilard1929"/>
+      <w:r>
+        <w:t xml:space="preserve">Szilard, L. (1929). </w:t>
+      </w:r>
+      <w:hyperlink r:id="rId47" w:history="1">
+        <w:r>
+          <w:rPr>
+            <w:color w:val="0563C1"/>
+            <w:u w:val="single"/>
+          </w:rPr>
+          <w:t xml:space="preserve">On the decrease of entropy in a thermodynamic system by the intervention of intelligent beings</w:t>
+        </w:r>
+      </w:hyperlink>
+      <w:r>
+        <w:t xml:space="preserve">. Zeitschrift für Physik 53, 840–856.</w:t>
+      </w:r>
+      <w:bookmarkEnd w:id="800043"/>
+    </w:p>
+    <w:p>
+      <w:pPr>
+        <w:pStyle w:val="BodyText"/>
+        <w:spacing w:after="120"/>
+        <w:ind w:firstLine="0"/>
+      </w:pPr>
+      <w:bookmarkStart w:id="800044" w:name="bib_weinberg1987"/>
+      <w:r>
+        <w:t xml:space="preserve">Weinberg, S. (1987). </w:t>
+      </w:r>
+      <w:hyperlink r:id="rId48" w:history="1">
+        <w:r>
+          <w:rPr>
+            <w:color w:val="0563C1"/>
+            <w:u w:val="single"/>
+          </w:rPr>
+          <w:t xml:space="preserve">Anthropic bound on the cosmological constant</w:t>
+        </w:r>
+      </w:hyperlink>
+      <w:r>
+        <w:t xml:space="preserve">. Physical Review Letters 59, 2607–2610.</w:t>
+      </w:r>
+      <w:bookmarkEnd w:id="800044"/>
+    </w:p>
+    <w:p>
+      <w:pPr>
+        <w:pStyle w:val="BodyText"/>
+        <w:spacing w:after="120"/>
+        <w:ind w:firstLine="0"/>
+      </w:pPr>
+      <w:bookmarkStart w:id="800021" w:name="bib_wigner1960"/>
       <w:r>
         <w:lastRenderedPageBreak/>
         <w:t xml:space="preserve">Wigner, E. P. (1960). </w:t>
@@ -25216,6 +26383,7 @@
       <w:r>
         <w:t>. Communications on Pure and Applied Mathematics 13, 1–14.</w:t>
       </w:r>
+      <w:bookmarkEnd w:id="800021"/>
     </w:p>
     <w:p>
       <w:pPr>
@@ -25232,18 +26400,15 @@
     </w:p>
     <w:p>
       <w:pPr>
+        <w:pStyle w:val="Heading2"/>
         <w:pageBreakBefore/>
-        <w:spacing w:before="1440" w:line="240" w:lineRule="auto"/>
-        <w:jc w:val="center"/>
-      </w:pPr>
-      <w:r>
-        <w:rPr>
-          <w:b/>
-          <w:color w:val="444444"/>
-        </w:rPr>
+      </w:pPr>
+      <w:bookmarkStart w:id="800046" w:name="aboutAuthor"/>
+      <w:r>
         <w:lastRenderedPageBreak/>
         <w:t xml:space="preserve">About the Author</w:t>
       </w:r>
+      <w:bookmarkEnd w:id="800046"/>
     </w:p>
     <w:p>
       <w:pPr>
@@ -25283,18 +26448,15 @@
     </w:p>
     <w:p>
       <w:pPr>
+        <w:pStyle w:val="Heading2"/>
         <w:pageBreakBefore/>
-        <w:spacing w:before="1440" w:line="240" w:lineRule="auto"/>
-        <w:jc w:val="center"/>
-      </w:pPr>
-      <w:r>
-        <w:rPr>
-          <w:b/>
-          <w:color w:val="444444"/>
-        </w:rPr>
+      </w:pPr>
+      <w:bookmarkStart w:id="800045" w:name="alsoBy"/>
+      <w:r>
         <w:lastRenderedPageBreak/>
         <w:t>Also by Lothar J. Musiol</w:t>
       </w:r>
+      <w:bookmarkEnd w:id="800045"/>
     </w:p>
     <w:p>
       <w:pPr>

</xml_diff>

<commit_message>
Lolly Wren: qualify Gödel and Page curve science
</commit_message>
<xml_diff>
--- a/Lolly Wren's Curious Science Adventures - SERIES/Book 2 - The Permitted Options/The_Permitted_Options_BOOK_2_REVISION_20261005.docx
+++ b/Lolly Wren's Curious Science Adventures - SERIES/Book 2 - The Permitted Options/The_Permitted_Options_BOOK_2_REVISION_20261005.docx
@@ -20786,10 +20786,10 @@
           <w:b/>
           <w:bCs/>
         </w:rPr>
-        <w:t>The second theorem</w:t>
-      </w:r>
-      <w:r>
-        <w:t>, which is the one Beatrix needs, says that no such system, if it is consistent, can prove that it is. F ⊬ Con(F). A body that certifies itself has, by that act, said nothing — and if it insists, the insistence is evidence against it.</w:t>
+        <w:t>The second incompleteness theorem</w:t>
+      </w:r>
+      <w:r>
+        <w:t> says that, under the usual conditions, a consistent, effectively axiomatised system capable of arithmetic cannot prove its own consistency: F ⊬ Con(F). A body that certifies itself has, by that act, said nothing — and if it insists, the insistence is evidence against it.</w:t>
       </w:r>
     </w:p>
     <w:p>
@@ -20860,7 +20860,7 @@
         <w:t>What Chapter Seven was actually showing you.</w:t>
       </w:r>
       <w:r>
-        <w:t xml:space="preserve"> The Counsel’s paralysis was not a failure of nerve. A single self-referential motion had frozen it exactly the way Gödel’s sentence freezes a formal system — and the department had just spent an entire chapter accidentally re-proving the exact offence Book One prosecuted.</w:t>
+        <w:t xml:space="preserve"> The Counsel’s paralysis was not a failure of nerve. A single self-referential motion had produced a Gödel-shaped resemblance: each available answer presupposed the point under dispute, and the department had spent an entire chapter accidentally re-enacting the exact offence Book One prosecuted.</w:t>
       </w:r>
     </w:p>
     <w:p>
@@ -20939,7 +20939,7 @@
         <w:t>The connecting principle.</w:t>
       </w:r>
       <w:r>
-        <w:t xml:space="preserve"> Stadthof’s single usable sentence — that a system rich enough to describe itself cannot reach certain truths from the inside, and that the only remedy is external verification, obtained by asking — ties the series’ devices together: the invitation clause that constrains Eilstein, the holographic requirement of a boundary description, the Programme’s function as a hundred centuries of outside looking, and Mavis-9’s refusal to certify herself. The final strand is biographical and true: Gödel, whose second theorem forbids a system to certify itself from inside, died of inanition in 1978 because he would eat only food his wife had tasted, and she was hospitalised.</w:t>
+        <w:t xml:space="preserve"> Stadthof’s single usable sentence — that a system rich enough to describe itself cannot reach certain truths from the inside, and that the only remedy is external verification, obtained by asking — ties the series’ devices together: the invitation clause that constrains Eilstein, the holographic requirement of a boundary description, the Programme’s function as a hundred centuries of outside looking, and Mavis-9’s refusal to certify herself. The final strand is biographical and true: Gödel, whose second incompleteness theorem shows that a consistent, effectively axiomatised system capable of arithmetic cannot prove its own consistency under the usual formalisation, died of inanition in 1978 after refusing food his wife had not tasted while she was hospitalised.</w:t>
       </w:r>
     </w:p>
     <w:p>
@@ -21316,7 +21316,7 @@
         <w:t>Page time</w:t>
       </w:r>
       <w:r>
-        <w:t xml:space="preserve"> when roughly half the entropy has been emitted, and thereafter falls as the outside becomes the more complete description. Recovering that curve from gravity — via replica wormholes and entanglement islands, from 2019 onward — is the strongest current evidence that evaporation is unitary. It matters here because the Page time is </w:t>
+        <w:t xml:space="preserve"> when roughly half the entropy has been emitted, and thereafter falls as the outside becomes the more complete description. Recovering that curve in controlled gravitational models — via replica wormholes and entanglement islands, in work beginning in 2019 — is important theoretical evidence that those models can describe unitary evaporation; it is not an observation of an astrophysical black hole. It matters here because the Page time is </w:t>
       </w:r>
       <w:r>
         <w:lastRenderedPageBreak/>

</xml_diff>

<commit_message>
Lolly Wren Book 2: add diagrams and reading-order rule
</commit_message>
<xml_diff>
--- a/Lolly Wren's Curious Science Adventures - SERIES/Book 2 - The Permitted Options/The_Permitted_Options_BOOK_2_REVISION_20261005.docx
+++ b/Lolly Wren's Curious Science Adventures - SERIES/Book 2 - The Permitted Options/The_Permitted_Options_BOOK_2_REVISION_20261005.docx
@@ -2,6 +2,53 @@
 <file path=word/document.xml><?xml version="1.0" encoding="utf-8"?>
 <w:document xmlns:wpc="http://schemas.microsoft.com/office/word/2010/wordprocessingCanvas" xmlns:cx="http://schemas.microsoft.com/office/drawing/2014/chartex" xmlns:cx1="http://schemas.microsoft.com/office/drawing/2015/9/8/chartex" xmlns:cx2="http://schemas.microsoft.com/office/drawing/2015/10/21/chartex" xmlns:cx3="http://schemas.microsoft.com/office/drawing/2016/5/9/chartex" xmlns:cx4="http://schemas.microsoft.com/office/drawing/2016/5/10/chartex" xmlns:cx5="http://schemas.microsoft.com/office/drawing/2016/5/11/chartex" xmlns:cx6="http://schemas.microsoft.com/office/drawing/2016/5/12/chartex" xmlns:cx7="http://schemas.microsoft.com/office/drawing/2016/5/13/chartex" xmlns:cx8="http://schemas.microsoft.com/office/drawing/2016/5/14/chartex" xmlns:mc="http://schemas.openxmlformats.org/markup-compatibility/2006" xmlns:aink="http://schemas.microsoft.com/office/drawing/2016/ink" xmlns:am3d="http://schemas.microsoft.com/office/drawing/2017/model3d" xmlns:o="urn:schemas-microsoft-com:office:office" xmlns:oel="http://schemas.microsoft.com/office/2019/extlst" xmlns:r="http://schemas.openxmlformats.org/officeDocument/2006/relationships" xmlns:m="http://schemas.openxmlformats.org/officeDocument/2006/math" xmlns:v="urn:schemas-microsoft-com:vml" xmlns:wp14="http://schemas.microsoft.com/office/word/2010/wordprocessingDrawing" xmlns:wp="http://schemas.openxmlformats.org/drawingml/2006/wordprocessingDrawing" xmlns:w10="urn:schemas-microsoft-com:office:word" xmlns:w="http://schemas.openxmlformats.org/wordprocessingml/2006/main" xmlns:w14="http://schemas.microsoft.com/office/word/2010/wordml" xmlns:w15="http://schemas.microsoft.com/office/word/2012/wordml" xmlns:w16cex="http://schemas.microsoft.com/office/word/2018/wordml/cex" xmlns:w16cid="http://schemas.microsoft.com/office/word/2016/wordml/cid" xmlns:w16="http://schemas.microsoft.com/office/word/2018/wordml" xmlns:w16du="http://schemas.microsoft.com/office/word/2023/wordml/word16du" xmlns:w16sdtdh="http://schemas.microsoft.com/office/word/2020/wordml/sdtdatahash" xmlns:w16sdtfl="http://schemas.microsoft.com/office/word/2024/wordml/sdtformatlock" xmlns:w16se="http://schemas.microsoft.com/office/word/2015/wordml/symex" xmlns:wpg="http://schemas.microsoft.com/office/word/2010/wordprocessingGroup" xmlns:wpi="http://schemas.microsoft.com/office/word/2010/wordprocessingInk" xmlns:wne="http://schemas.microsoft.com/office/word/2006/wordml" xmlns:wps="http://schemas.microsoft.com/office/word/2010/wordprocessingShape" mc:Ignorable="w14 w15 w16se w16cid w16 w16cex w16sdtdh w16sdtfl w16du wp14">
   <w:body>
+    <w:p>
+      <w:pPr>
+        <w:sectPr>
+          <w:type w:val="nextPage"/>
+          <w:headerReference w:type="default" r:id="rId14"/>
+          <w:footerReference w:type="default" r:id="rId15"/>
+          <w:pgSz w:w="8640" w:h="12960"/>
+          <w:pgMar w:top="1037" w:right="1008" w:bottom="1037" w:left="1080" w:header="504" w:footer="504" w:gutter="0"/>
+          <w:cols w:space="720"/>
+          <w:titlePg/>
+        </w:sectPr>
+      </w:pPr>
+      <w:r>
+        <w:drawing>
+          <wp:inline xmlns:a="http://schemas.openxmlformats.org/drawingml/2006/main" xmlns:pic="http://schemas.openxmlformats.org/drawingml/2006/picture">
+            <wp:extent cx="4160520" cy="6656832"/>
+            <wp:docPr id="2" name="Picture 2" title="Front cover" descr="Front cover for The Permitted Options: a Ministry departures board lists permitted destinations, Ellen’s file, a green notebook, and the series mark."/>
+            <wp:cNvGraphicFramePr>
+              <a:graphicFrameLocks noChangeAspect="1"/>
+            </wp:cNvGraphicFramePr>
+            <a:graphic>
+              <a:graphicData uri="http://schemas.openxmlformats.org/drawingml/2006/picture">
+                <pic:pic>
+                  <pic:nvPicPr>
+                    <pic:cNvPr id="0" name="KINDLE_COVER_FINAL_2560.jpg"/>
+                    <pic:cNvPicPr/>
+                  </pic:nvPicPr>
+                  <pic:blipFill>
+                    <a:blip r:embed="rId50"/>
+                    <a:stretch>
+                      <a:fillRect/>
+                    </a:stretch>
+                  </pic:blipFill>
+                  <pic:spPr>
+                    <a:xfrm>
+                      <a:off x="0" y="0"/>
+                      <a:ext cx="4160520" cy="6656832"/>
+                    </a:xfrm>
+                    <a:prstGeom prst="rect"/>
+                  </pic:spPr>
+                </pic:pic>
+              </a:graphicData>
+            </a:graphic>
+          </wp:inline>
+        </w:drawing>
+      </w:r>
+    </w:p>
     <w:p>
       <w:pPr>
         <w:pStyle w:val="Title"/>
@@ -100,6 +147,12 @@
           <w:szCs w:val="18"/>
         </w:rPr>
         <w:t>This is a work of fiction. Names, characters, departments, institutions and incidents are the product of the author’s imagination or are used fictitiously. Several characters are inspired by real physicists and carry altered names; their science is represented as faithfully as the story allows, and their private lives, dialogue and opinions are invented.</w:t>
+      </w:r>
+    </w:p>
+    <w:p>
+      <w:pPr/>
+      <w:r>
+        <w:t>No physics background or earlier book is needed: this novel stands on its own. If it makes you curious, optional lectures and a glossary at the back explain the science and flag what remains unsettled.</w:t>
       </w:r>
     </w:p>
     <w:p>
@@ -12155,11 +12208,9 @@
         <w:t>His question, which I cannot answer: if</w:t>
       </w:r>
       <w:r>
-        <w:br/>
         <w:t xml:space="preserve"> an outsider’s certificate is good, may he still require an invitation? He</w:t>
       </w:r>
       <w:r>
-        <w:br/>
         <w:t xml:space="preserve"> meant it plainly.</w:t>
       </w:r>
     </w:p>
@@ -18885,7 +18936,6 @@
         <w:t>Gideon is in the doorway with breakfast and a knuckle he will claim is nothing. He found the fault in Cumbria. He was on the stair in March. He has not asked me to call either of those things by a larger name. Dad</w:t>
       </w:r>
       <w:r>
-        <w:br/>
         <w:t xml:space="preserve"> is in the Garden Room with the window. I sat up with him last night and nothing happened, and I am writing that down because it is the most important nothing in this notebook.</w:t>
       </w:r>
     </w:p>
@@ -19278,6 +19328,50 @@
       </w:r>
     </w:p>
     <w:p>
+      <w:r>
+        <w:drawing>
+          <wp:inline xmlns:a="http://schemas.openxmlformats.org/drawingml/2006/main" xmlns:pic="http://schemas.openxmlformats.org/drawingml/2006/picture">
+            <wp:extent cx="4160520" cy="2288286"/>
+            <wp:docPr id="3" name="Picture 3" title="Diagram Quantum Tunnelling" descr="Figure 1. A finite barrier: the wave amplitude decays within the classically forbidden region but remains non-zero beyond it."/>
+            <wp:cNvGraphicFramePr>
+              <a:graphicFrameLocks noChangeAspect="1"/>
+            </wp:cNvGraphicFramePr>
+            <a:graphic>
+              <a:graphicData uri="http://schemas.openxmlformats.org/drawingml/2006/picture">
+                <pic:pic>
+                  <pic:nvPicPr>
+                    <pic:cNvPr id="0" name="diagram_quantum_tunnelling.png"/>
+                    <pic:cNvPicPr/>
+                  </pic:nvPicPr>
+                  <pic:blipFill>
+                    <a:blip r:embed="rId51"/>
+                    <a:stretch>
+                      <a:fillRect/>
+                    </a:stretch>
+                  </pic:blipFill>
+                  <pic:spPr>
+                    <a:xfrm>
+                      <a:off x="0" y="0"/>
+                      <a:ext cx="4160520" cy="2288286"/>
+                    </a:xfrm>
+                    <a:prstGeom prst="rect"/>
+                  </pic:spPr>
+                </pic:pic>
+              </a:graphicData>
+            </a:graphic>
+          </wp:inline>
+        </w:drawing>
+      </w:r>
+    </w:p>
+    <w:p>
+      <w:pPr>
+        <w:pStyle w:val="Caption"/>
+      </w:pPr>
+      <w:r>
+        <w:t>Figure 1. A finite barrier: the wave amplitude decays within the classically forbidden region but remains non-zero beyond it.</w:t>
+      </w:r>
+    </w:p>
+    <w:p>
       <w:pPr>
         <w:pStyle w:val="BodyText"/>
       </w:pPr>
@@ -19540,6 +19634,50 @@
       </w:r>
     </w:p>
     <w:p>
+      <w:r>
+        <w:drawing>
+          <wp:inline xmlns:a="http://schemas.openxmlformats.org/drawingml/2006/main" xmlns:pic="http://schemas.openxmlformats.org/drawingml/2006/picture">
+            <wp:extent cx="4160520" cy="2288286"/>
+            <wp:docPr id="4" name="Picture 4" title="Diagram Casimir Plates" descr="Figure 2. Conducting plates restrict the field modes that fit between them; the resulting Casimir force is attractive. The mode sketch does not depict absolute vacuum energy."/>
+            <wp:cNvGraphicFramePr>
+              <a:graphicFrameLocks noChangeAspect="1"/>
+            </wp:cNvGraphicFramePr>
+            <a:graphic>
+              <a:graphicData uri="http://schemas.openxmlformats.org/drawingml/2006/picture">
+                <pic:pic>
+                  <pic:nvPicPr>
+                    <pic:cNvPr id="0" name="diagram_casimir_plates.png"/>
+                    <pic:cNvPicPr/>
+                  </pic:nvPicPr>
+                  <pic:blipFill>
+                    <a:blip r:embed="rId52"/>
+                    <a:stretch>
+                      <a:fillRect/>
+                    </a:stretch>
+                  </pic:blipFill>
+                  <pic:spPr>
+                    <a:xfrm>
+                      <a:off x="0" y="0"/>
+                      <a:ext cx="4160520" cy="2288286"/>
+                    </a:xfrm>
+                    <a:prstGeom prst="rect"/>
+                  </pic:spPr>
+                </pic:pic>
+              </a:graphicData>
+            </a:graphic>
+          </wp:inline>
+        </w:drawing>
+      </w:r>
+    </w:p>
+    <w:p>
+      <w:pPr>
+        <w:pStyle w:val="Caption"/>
+      </w:pPr>
+      <w:r>
+        <w:t>Figure 2. Conducting plates restrict the field modes that fit between them; the resulting Casimir force is attractive. The mode sketch does not depict absolute vacuum energy.</w:t>
+      </w:r>
+    </w:p>
+    <w:p>
       <w:pPr>
         <w:pStyle w:val="BodyText"/>
       </w:pPr>
@@ -20780,10 +20918,10 @@
           <w:b/>
           <w:bCs/>
         </w:rPr>
-        <w:t>The second theorem</w:t>
-      </w:r>
-      <w:r>
-        <w:t>, which is the one Beatrix needs, says that no such system, if it is consistent, can prove that it is. F ⊬ Con(F). A body that certifies itself has, by that act, said nothing — and if it insists, the insistence is evidence against it.</w:t>
+        <w:t>The second incompleteness theorem</w:t>
+      </w:r>
+      <w:r>
+        <w:t> says that, under the usual conditions, a consistent, effectively axiomatised system capable of arithmetic cannot prove its own consistency: F ⊬ Con(F). A body that certifies itself has, by that act, said nothing — and if it insists, the insistence is evidence against it.</w:t>
       </w:r>
     </w:p>
     <w:p>
@@ -20854,7 +20992,7 @@
         <w:t>What Chapter Seven was actually showing you.</w:t>
       </w:r>
       <w:r>
-        <w:t xml:space="preserve"> The Counsel’s paralysis was not a failure of nerve. A single self-referential motion had frozen it exactly the way Gödel’s sentence freezes a formal system — and the department had just spent an entire chapter accidentally re-proving the exact offence Book One prosecuted.</w:t>
+        <w:t xml:space="preserve"> The Counsel’s paralysis was not a failure of nerve. A single self-referential motion had produced a Gödel-shaped resemblance: each available answer presupposed the point under dispute, and the department had spent an entire chapter accidentally re-enacting the exact offence Book One prosecuted.</w:t>
       </w:r>
     </w:p>
     <w:p>
@@ -20933,7 +21071,7 @@
         <w:t>The connecting principle.</w:t>
       </w:r>
       <w:r>
-        <w:t xml:space="preserve"> Stadthof’s single usable sentence — that a system rich enough to describe itself cannot reach certain truths from the inside, and that the only remedy is external verification, obtained by asking — ties the series’ devices together: the invitation clause that constrains Eilstein, the holographic requirement of a boundary description, the Programme’s function as a hundred centuries of outside looking, and Mavis-9’s refusal to certify herself. The final strand is biographical and true: Gödel, whose second theorem forbids a system to certify itself from inside, died of inanition in 1978 because he would eat only food his wife had tasted, and she was hospitalised.</w:t>
+        <w:t xml:space="preserve"> Stadthof’s single usable sentence — that a system rich enough to describe itself cannot reach certain truths from the inside, and that the only remedy is external verification, obtained by asking — ties the series’ devices together: the invitation clause that constrains Eilstein, the holographic requirement of a boundary description, the Programme’s function as a hundred centuries of outside looking, and Mavis-9’s refusal to certify herself. The final strand is biographical and true: Gödel, whose second incompleteness theorem shows that a consistent, effectively axiomatised system capable of arithmetic cannot prove its own consistency under the usual formalisation, died of inanition in 1978 after refusing food his wife had not tasted while she was hospitalised.</w:t>
       </w:r>
     </w:p>
     <w:p>
@@ -21310,7 +21448,7 @@
         <w:t>Page time</w:t>
       </w:r>
       <w:r>
-        <w:t xml:space="preserve"> when roughly half the entropy has been emitted, and thereafter falls as the outside becomes the more complete description. Recovering that curve from gravity — via replica wormholes and entanglement islands, from 2019 onward — is the strongest current evidence that evaporation is unitary. It matters here because the Page time is </w:t>
+        <w:t xml:space="preserve"> when roughly half the entropy has been emitted, and thereafter falls as the outside becomes the more complete description. Recovering that curve in controlled gravitational models — via replica wormholes and entanglement islands, in work beginning in 2019 — is important theoretical evidence that those models can describe unitary evaporation; it is not an observation of an astrophysical black hole. It matters here because the Page time is </w:t>
       </w:r>
       <w:r>
         <w:lastRenderedPageBreak/>
@@ -24216,6 +24354,50 @@
       </w:r>
     </w:p>
     <w:p>
+      <w:r>
+        <w:drawing>
+          <wp:inline xmlns:a="http://schemas.openxmlformats.org/drawingml/2006/main" xmlns:pic="http://schemas.openxmlformats.org/drawingml/2006/picture">
+            <wp:extent cx="4160520" cy="2288286"/>
+            <wp:docPr id="5" name="Picture 5" title="Diagram Einstein Rosen Bridge" descr="Figure 3. A spatial slice of the Einstein–Rosen bridge has two exterior regions joined at a throat; the throat pinches off before any causal signal can cross."/>
+            <wp:cNvGraphicFramePr>
+              <a:graphicFrameLocks noChangeAspect="1"/>
+            </wp:cNvGraphicFramePr>
+            <a:graphic>
+              <a:graphicData uri="http://schemas.openxmlformats.org/drawingml/2006/picture">
+                <pic:pic>
+                  <pic:nvPicPr>
+                    <pic:cNvPr id="0" name="diagram_einstein_rosen_bridge.png"/>
+                    <pic:cNvPicPr/>
+                  </pic:nvPicPr>
+                  <pic:blipFill>
+                    <a:blip r:embed="rId53"/>
+                    <a:stretch>
+                      <a:fillRect/>
+                    </a:stretch>
+                  </pic:blipFill>
+                  <pic:spPr>
+                    <a:xfrm>
+                      <a:off x="0" y="0"/>
+                      <a:ext cx="4160520" cy="2288286"/>
+                    </a:xfrm>
+                    <a:prstGeom prst="rect"/>
+                  </pic:spPr>
+                </pic:pic>
+              </a:graphicData>
+            </a:graphic>
+          </wp:inline>
+        </w:drawing>
+      </w:r>
+    </w:p>
+    <w:p>
+      <w:pPr>
+        <w:pStyle w:val="Caption"/>
+      </w:pPr>
+      <w:r>
+        <w:t>Figure 3. A spatial slice of the Einstein–Rosen bridge has two exterior regions joined at a throat; the throat pinches off before any causal signal can cross.</w:t>
+      </w:r>
+    </w:p>
+    <w:p>
       <w:pPr>
         <w:pStyle w:val="BodyText"/>
       </w:pPr>
@@ -26784,6 +26966,48 @@
         <w:t xml:space="preserve">Auswandern – Ab in die USA, Kanada, Australien oder Neuseeland?</w:t>
       </w:r>
     </w:p>
+    <w:p>
+      <w:pPr>
+        <w:keepLines/>
+        <w:pageBreakBefore/>
+        <w:spacing w:before="0" w:after="0"/>
+        <w:jc w:val="center"/>
+      </w:pPr>
+      <w:r>
+        <w:drawing>
+          <wp:inline xmlns:a="http://schemas.openxmlformats.org/drawingml/2006/main" xmlns:pic="http://schemas.openxmlformats.org/drawingml/2006/picture">
+            <wp:extent cx="4160520" cy="6656832"/>
+            <wp:docPr id="1" name="Picture 1" descr="Back cover panel describing the case of fourteen people and Ellen Prosper, with reader comparison, character notes, author name, and series description." title="Back cover"/>
+            <wp:cNvGraphicFramePr>
+              <a:graphicFrameLocks noChangeAspect="1"/>
+            </wp:cNvGraphicFramePr>
+            <a:graphic>
+              <a:graphicData uri="http://schemas.openxmlformats.org/drawingml/2006/picture">
+                <pic:pic>
+                  <pic:nvPicPr>
+                    <pic:cNvPr id="0" name="KINDLE_BACK_COVER_2560.jpg"/>
+                    <pic:cNvPicPr/>
+                  </pic:nvPicPr>
+                  <pic:blipFill>
+                    <a:blip r:embed="rId49"/>
+                    <a:stretch>
+                      <a:fillRect/>
+                    </a:stretch>
+                  </pic:blipFill>
+                  <pic:spPr>
+                    <a:xfrm>
+                      <a:off x="0" y="0"/>
+                      <a:ext cx="4160520" cy="6656832"/>
+                    </a:xfrm>
+                    <a:prstGeom prst="rect"/>
+                  </pic:spPr>
+                </pic:pic>
+              </a:graphicData>
+            </a:graphic>
+          </wp:inline>
+        </w:drawing>
+      </w:r>
+    </w:p>
     <w:sectPr>
       <w:headerReference w:type="default" r:id="rId14"/>
       <w:footerReference w:type="default" r:id="rId15"/>
@@ -26791,6 +27015,7 @@
       <w:pgMar w:top="1037" w:right="1008" w:bottom="1037" w:left="1080" w:header="504" w:footer="504" w:gutter="0"/>
       <w:cols w:space="720"/>
       <w:titlePg/>
+      <w:pgNumType w:start="0"/>
     </w:sectPr>
   </w:body>
 </w:document>

</xml_diff>

<commit_message>
Lolly Wren Book 2: clarify quantum-game pacing
</commit_message>
<xml_diff>
--- a/Lolly Wren's Curious Science Adventures - SERIES/Book 2 - The Permitted Options/The_Permitted_Options_BOOK_2_REVISION_20261005.docx
+++ b/Lolly Wren's Curious Science Adventures - SERIES/Book 2 - The Permitted Options/The_Permitted_Options_BOOK_2_REVISION_20261005.docx
@@ -9257,49 +9257,49 @@
         <w:pStyle w:val="BodyText"/>
       </w:pPr>
       <w:r>
-        <w:t>“Consider a game between two players who cannot communicate,” he said. “They are separated. Each receives a question — a bit, say, chosen at random by a referee — and each must answer. They win or lose according to a rule that depends on both questions and both answers. They may agree any strategy in advance. They may carry any notes, any tables, any shared random numbers. They simply may not talk once the questions are asked.</w:t>
-      </w:r>
-    </w:p>
-    <w:p>
-      <w:pPr>
-        <w:pStyle w:val="BodyText"/>
-      </w:pPr>
-      <w:r>
-        <w:t>“There is a best possible classical strategy, and you can compute it, and for the simplest such game it wins seventy-five per cent of the time. That is a theorem. It is not a matter of cleverness. Seventy-five per cent is the ceiling for any pair of players who share only ordinary information, however much of it, however cunningly arranged.</w:t>
-      </w:r>
-    </w:p>
-    <w:p>
-      <w:pPr>
-        <w:pStyle w:val="BodyText"/>
-      </w:pPr>
-      <w:r>
-        <w:t xml:space="preserve">“Now give them a pair of correlated particles beforehand. Nothing else changes. They still cannot communicate — and I want to be exact, because this is where everybody goes wrong: they </w:t>
+        <w:t xml:space="preserve">“Two players cannot communicate. A referee gives each a random bit; each answers. A shared rule decides whether they win. They may plan beforehand and share notes, tables, even random numbers, but once the questions arrive, they cannot talk.”</w:t>
+      </w:r>
+    </w:p>
+    <w:p>
+      <w:pPr>
+        <w:pStyle w:val="BodyText"/>
+      </w:pPr>
+      <w:r>
+        <w:t xml:space="preserve">“For the simplest such game, the best classical strategy wins three rounds in four. That ceiling is a theorem, not a judgement on anyone’s cleverness.”</w:t>
+      </w:r>
+    </w:p>
+    <w:p>
+      <w:pPr>
+        <w:pStyle w:val="BodyText"/>
+      </w:pPr>
+      <w:r>
+        <w:t xml:space="preserve">“Give them a pair of entangled particles beforehand. They still </w:t>
       </w:r>
       <w:r>
         <w:rPr>
           <w:i/>
           <w:iCs/>
         </w:rPr>
-        <w:t>cannot</w:t>
-      </w:r>
-      <w:r>
-        <w:t xml:space="preserve"> signal, not one bit, the correlation transmits nothing, you could not send a message with it if your life depended on it.” He paused. “And they win eighty-five per cent of the time.”</w:t>
-      </w:r>
-    </w:p>
-    <w:p>
-      <w:pPr>
-        <w:pStyle w:val="BodyText"/>
-      </w:pPr>
-      <w:r>
-        <w:t>Stadthof, who had come in on his Thursday and stayed for a Tuesday, said, “Which is Bellboy’s number.”</w:t>
-      </w:r>
-    </w:p>
-    <w:p>
-      <w:pPr>
-        <w:pStyle w:val="BodyText"/>
-      </w:pPr>
-      <w:r>
-        <w:t>“It is Bellboy’s number wearing different clothes,” said Fainrose. “Two point eight against a ceiling of two.”</w:t>
+        <w:t xml:space="preserve">cannot</w:t>
+      </w:r>
+      <w:r>
+        <w:t xml:space="preserve"> signal—not one bit. You could not send a message with the correlation if your life depended on it. Yet they win about eighty-five per cent of the time.”</w:t>
+      </w:r>
+    </w:p>
+    <w:p>
+      <w:pPr>
+        <w:pStyle w:val="BodyText"/>
+      </w:pPr>
+      <w:r>
+        <w:t xml:space="preserve">Stadthof, who had come in on his Thursday and stayed for a Tuesday, said, “Which is Bellboy’s number.”</w:t>
+      </w:r>
+    </w:p>
+    <w:p>
+      <w:pPr>
+        <w:pStyle w:val="BodyText"/>
+      </w:pPr>
+      <w:r>
+        <w:t xml:space="preserve">“It is Bellboy’s number in a different scoring system,” said Fainrose. “Two point eight against a classical ceiling of two: the same quantum advantage as seventy-five against about eighty-five per cent.”</w:t>
       </w:r>
     </w:p>
     <w:p>
@@ -9308,25 +9308,25 @@
       </w:pPr>
       <w:r>
         <w:lastRenderedPageBreak/>
-        <w:t xml:space="preserve">“Yes. Same content, different clothes, and the clothes matter.” Nashville leaned forward. “Because as a </w:t>
-      </w:r>
-      <w:r>
-        <w:rPr>
-          <w:i/>
-        </w:rPr>
-        <w:t>game</w:t>
-      </w:r>
-      <w:r>
-        <w:t xml:space="preserve"> you can see what it is </w:t>
-      </w:r>
-      <w:r>
-        <w:rPr>
-          <w:i/>
-        </w:rPr>
-        <w:t>for</w:t>
-      </w:r>
-      <w:r>
-        <w:t>. It lets separated parties who cannot communicate, and do not trust one another, coordinate better than any agreement could arrange. And in some games the gap is total. There is a little three-by-three grid with parity rules where the best classical play wins eight times in nine, and shared correlation wins every time. With certainty. No arrangement of notes and dice achieves it.”</w:t>
+        <w:t xml:space="preserve">“Exactly. The </w:t>
+      </w:r>
+      <w:r>
+        <w:rPr>
+          <w:i/>
+        </w:rPr>
+        <w:t xml:space="preserve">game</w:t>
+      </w:r>
+      <w:r>
+        <w:t xml:space="preserve"> makes the advantage concrete,” said Nashville, leaning forward. “It lets separated parties who cannot communicate or trust one another coordinate better than any agreement could arrange. In the three-by-three grid with parity rules, classical players can win no more than eight times in nine; shared quantum correlations let them win all nine, every time. No notes or shared dice can do that.”</w:t>
+      </w:r>
+      <w:r>
+        <w:rPr>
+          <w:i/>
+        </w:rPr>
+        <w:t xml:space="preserve"/>
+      </w:r>
+      <w:r>
+        <w:t xml:space="preserve"/>
       </w:r>
     </w:p>
     <w:p>
@@ -11053,27 +11053,27 @@
         <w:pStyle w:val="BodyText"/>
       </w:pPr>
       <w:r>
-        <w:t xml:space="preserve">“Every experiment that has ever confirmed your ceiling — and there are thousands, and they are excellent, and I believe every one of them — was performed against a </w:t>
+        <w:t xml:space="preserve">“Every experiment confirming your ceiling—and there are thousands, excellent ones, all of which I believe—was run against a </w:t>
       </w:r>
       <w:r>
         <w:rPr>
           <w:b/>
           <w:bCs/>
         </w:rPr>
-        <w:t>fixed background</w:t>
-      </w:r>
-      <w:r>
-        <w:t xml:space="preserve">. The vacuum stayed where it was. Nobody had lowered the price of nothing by eleven parts in ten to the twenty-second while the apparatus was running.” He tapped the sheet. “You have discovered that the background is an </w:t>
+        <w:t xml:space="preserve">fixed background</w:t>
+      </w:r>
+      <w:r>
+        <w:t xml:space="preserve">. Nobody had lowered the price of nothing by eleven parts in ten to the twenty-second while the apparatus was running.” He tapped the sheet. “You have discovered that the background can </w:t>
       </w:r>
       <w:r>
         <w:rPr>
           <w:i/>
           <w:iCs/>
         </w:rPr>
-        <w:t>editable quantity</w:t>
-      </w:r>
-      <w:r>
-        <w:t>. And you have then gone on to build an enforcement mechanism whose entire security rests on a bound derived by assuming it is not.”</w:t>
+        <w:t xml:space="preserve">change</w:t>
+      </w:r>
+      <w:r>
+        <w:t xml:space="preserve">. Now your enforcement mechanism rests on a bound derived from assuming it cannot.”</w:t>
       </w:r>
     </w:p>
     <w:p>

</xml_diff>